<commit_message>
feat: Add `UpdateAssetRequest` DTO, `ResourceNotFoundException`, and project perspective document.
</commit_message>
<xml_diff>
--- a/document/TID_Asset_Management_Project_Perspective.docx
+++ b/document/TID_Asset_Management_Project_Perspective.docx
@@ -878,7 +878,35 @@
                 <w:sz w:val="20"/>
                 <w:szCs w:val="20"/>
               </w:rPr>
-              <w:t>/assets/{id}/status</w:t>
+              <w:t>/</w:t>
+            </w:r>
+            <w:r>
+              <w:rPr>
+                <w:sz w:val="20"/>
+                <w:szCs w:val="20"/>
+              </w:rPr>
+              <w:t>report</w:t>
+            </w:r>
+            <w:r>
+              <w:rPr>
+                <w:sz w:val="20"/>
+                <w:szCs w:val="20"/>
+              </w:rPr>
+              <w:t>s</w:t>
+            </w:r>
+            <w:r>
+              <w:rPr>
+                <w:sz w:val="20"/>
+                <w:szCs w:val="20"/>
+              </w:rPr>
+              <w:t>/{id}/</w:t>
+            </w:r>
+            <w:r>
+              <w:rPr>
+                <w:sz w:val="20"/>
+                <w:szCs w:val="20"/>
+              </w:rPr>
+              <w:t>device-detail</w:t>
             </w:r>
           </w:p>
         </w:tc>
@@ -905,7 +933,14 @@
                 <w:sz w:val="20"/>
                 <w:szCs w:val="20"/>
               </w:rPr>
-              <w:t>Check the current status of a specific asset</w:t>
+              <w:t>Chec</w:t>
+            </w:r>
+            <w:r>
+              <w:rPr>
+                <w:sz w:val="20"/>
+                <w:szCs w:val="20"/>
+              </w:rPr>
+              <w:t>k the device detail (read-only)</w:t>
             </w:r>
           </w:p>
         </w:tc>
@@ -1804,14 +1839,7 @@
                 <w:sz w:val="20"/>
                 <w:szCs w:val="20"/>
               </w:rPr>
-              <w:t>ADMIN</w:t>
-            </w:r>
-            <w:r>
-              <w:rPr>
-                <w:sz w:val="20"/>
-                <w:szCs w:val="20"/>
-              </w:rPr>
-              <w:t xml:space="preserve"> </w:t>
+              <w:t xml:space="preserve">ADMIN </w:t>
             </w:r>
             <w:r>
               <w:rPr>
@@ -3620,6 +3648,115 @@
               <w:bottom w:val="single" w:sz="1" w:space="0" w:color="CCCCCC"/>
               <w:right w:val="single" w:sz="1" w:space="0" w:color="CCCCCC"/>
             </w:tcBorders>
+            <w:shd w:val="clear" w:color="auto" w:fill="F0F4FA"/>
+            <w:tcMar>
+              <w:top w:w="80" w:type="dxa"/>
+              <w:left w:w="150" w:type="dxa"/>
+              <w:bottom w:w="80" w:type="dxa"/>
+              <w:right w:w="150" w:type="dxa"/>
+            </w:tcMar>
+          </w:tcPr>
+          <w:p>
+            <w:pPr>
+              <w:rPr>
+                <w:sz w:val="20"/>
+                <w:szCs w:val="20"/>
+                <w:highlight w:val="yellow"/>
+              </w:rPr>
+            </w:pPr>
+            <w:bookmarkStart w:id="0" w:name="_GoBack" w:colFirst="0" w:colLast="2"/>
+            <w:r>
+              <w:rPr>
+                <w:sz w:val="20"/>
+                <w:szCs w:val="20"/>
+                <w:highlight w:val="yellow"/>
+              </w:rPr>
+              <w:t>Image</w:t>
+            </w:r>
+          </w:p>
+        </w:tc>
+        <w:tc>
+          <w:tcPr>
+            <w:tcW w:w="2000" w:type="dxa"/>
+            <w:tcBorders>
+              <w:top w:val="single" w:sz="1" w:space="0" w:color="CCCCCC"/>
+              <w:left w:val="single" w:sz="1" w:space="0" w:color="CCCCCC"/>
+              <w:bottom w:val="single" w:sz="1" w:space="0" w:color="CCCCCC"/>
+              <w:right w:val="single" w:sz="1" w:space="0" w:color="CCCCCC"/>
+            </w:tcBorders>
+            <w:shd w:val="clear" w:color="auto" w:fill="F0F4FA"/>
+            <w:tcMar>
+              <w:top w:w="80" w:type="dxa"/>
+              <w:left w:w="150" w:type="dxa"/>
+              <w:bottom w:w="80" w:type="dxa"/>
+              <w:right w:w="150" w:type="dxa"/>
+            </w:tcMar>
+          </w:tcPr>
+          <w:p>
+            <w:pPr>
+              <w:rPr>
+                <w:sz w:val="20"/>
+                <w:szCs w:val="20"/>
+                <w:highlight w:val="yellow"/>
+              </w:rPr>
+            </w:pPr>
+            <w:r>
+              <w:rPr>
+                <w:sz w:val="20"/>
+                <w:szCs w:val="20"/>
+                <w:highlight w:val="yellow"/>
+              </w:rPr>
+              <w:t>VARCHAR</w:t>
+            </w:r>
+          </w:p>
+        </w:tc>
+        <w:tc>
+          <w:tcPr>
+            <w:tcW w:w="4760" w:type="dxa"/>
+            <w:tcBorders>
+              <w:top w:val="single" w:sz="1" w:space="0" w:color="CCCCCC"/>
+              <w:left w:val="single" w:sz="1" w:space="0" w:color="CCCCCC"/>
+              <w:bottom w:val="single" w:sz="1" w:space="0" w:color="CCCCCC"/>
+              <w:right w:val="single" w:sz="1" w:space="0" w:color="CCCCCC"/>
+            </w:tcBorders>
+            <w:shd w:val="clear" w:color="auto" w:fill="F0F4FA"/>
+            <w:tcMar>
+              <w:top w:w="80" w:type="dxa"/>
+              <w:left w:w="150" w:type="dxa"/>
+              <w:bottom w:w="80" w:type="dxa"/>
+              <w:right w:w="150" w:type="dxa"/>
+            </w:tcMar>
+          </w:tcPr>
+          <w:p>
+            <w:pPr>
+              <w:rPr>
+                <w:sz w:val="20"/>
+                <w:szCs w:val="20"/>
+                <w:highlight w:val="yellow"/>
+              </w:rPr>
+            </w:pPr>
+            <w:r>
+              <w:rPr>
+                <w:sz w:val="20"/>
+                <w:szCs w:val="20"/>
+                <w:highlight w:val="yellow"/>
+              </w:rPr>
+              <w:t>Base64 for image for the product</w:t>
+            </w:r>
+          </w:p>
+        </w:tc>
+      </w:tr>
+      <w:bookmarkEnd w:id="0"/>
+      <w:tr>
+        <w:tc>
+          <w:tcPr>
+            <w:tcW w:w="2600" w:type="dxa"/>
+            <w:tcBorders>
+              <w:top w:val="single" w:sz="1" w:space="0" w:color="CCCCCC"/>
+              <w:left w:val="single" w:sz="1" w:space="0" w:color="CCCCCC"/>
+              <w:bottom w:val="single" w:sz="1" w:space="0" w:color="CCCCCC"/>
+              <w:right w:val="single" w:sz="1" w:space="0" w:color="CCCCCC"/>
+            </w:tcBorders>
             <w:shd w:val="clear" w:color="auto" w:fill="FFFFFF"/>
             <w:tcMar>
               <w:top w:w="80" w:type="dxa"/>
@@ -4467,6 +4604,7 @@
                 <w:sz w:val="20"/>
                 <w:szCs w:val="20"/>
               </w:rPr>
+              <w:lastRenderedPageBreak/>
               <w:t>purchase_cost</w:t>
             </w:r>
             <w:proofErr w:type="spellEnd"/>
@@ -4525,7 +4663,6 @@
                 <w:sz w:val="20"/>
                 <w:szCs w:val="20"/>
               </w:rPr>
-              <w:lastRenderedPageBreak/>
               <w:t>warranty_expiry_date</w:t>
             </w:r>
             <w:proofErr w:type="spellEnd"/>
@@ -5556,9 +5693,6 @@
           <w:numId w:val="2"/>
         </w:numPr>
         <w:spacing w:before="40" w:after="40"/>
-        <w:rPr>
-          <w:highlight w:val="yellow"/>
-        </w:rPr>
       </w:pPr>
       <w:r>
         <w:rPr>
@@ -5578,10 +5712,10 @@
         <w:rPr>
           <w:highlight w:val="yellow"/>
         </w:rPr>
-        <w:t xml:space="preserve">/assets — create </w:t>
-      </w:r>
-      <w:r>
-        <w:t>(AUTH)</w:t>
+        <w:t>/assets — create</w:t>
+      </w:r>
+      <w:r>
+        <w:t xml:space="preserve"> (AUTH)</w:t>
       </w:r>
     </w:p>
     <w:p>
@@ -5593,17 +5727,28 @@
         </w:numPr>
         <w:spacing w:before="40" w:after="40"/>
       </w:pPr>
-      <w:bookmarkStart w:id="0" w:name="_GoBack"/>
-      <w:r>
+      <w:r>
+        <w:rPr>
+          <w:highlight w:val="yellow"/>
+        </w:rPr>
         <w:t>GET /</w:t>
       </w:r>
       <w:proofErr w:type="spellStart"/>
       <w:r>
+        <w:rPr>
+          <w:highlight w:val="yellow"/>
+        </w:rPr>
         <w:t>api</w:t>
       </w:r>
       <w:proofErr w:type="spellEnd"/>
       <w:r>
-        <w:t>/assets — list all (AUTH)</w:t>
+        <w:rPr>
+          <w:highlight w:val="yellow"/>
+        </w:rPr>
+        <w:t>/assets — list all</w:t>
+      </w:r>
+      <w:r>
+        <w:t xml:space="preserve"> (AUTH)</w:t>
       </w:r>
     </w:p>
     <w:p>
@@ -5616,15 +5761,27 @@
         <w:spacing w:before="40" w:after="40"/>
       </w:pPr>
       <w:r>
+        <w:rPr>
+          <w:highlight w:val="yellow"/>
+        </w:rPr>
         <w:t>GET /</w:t>
       </w:r>
       <w:proofErr w:type="spellStart"/>
       <w:r>
+        <w:rPr>
+          <w:highlight w:val="yellow"/>
+        </w:rPr>
         <w:t>api</w:t>
       </w:r>
       <w:proofErr w:type="spellEnd"/>
       <w:r>
-        <w:t>/assets/{id} — view detail (AUTH)</w:t>
+        <w:rPr>
+          <w:highlight w:val="yellow"/>
+        </w:rPr>
+        <w:t>/assets/{id} — view detail</w:t>
+      </w:r>
+      <w:r>
+        <w:t xml:space="preserve"> (AUTH)</w:t>
       </w:r>
     </w:p>
     <w:p>
@@ -5637,15 +5794,27 @@
         <w:spacing w:before="40" w:after="40"/>
       </w:pPr>
       <w:r>
+        <w:rPr>
+          <w:highlight w:val="yellow"/>
+        </w:rPr>
         <w:t>PUT /</w:t>
       </w:r>
       <w:proofErr w:type="spellStart"/>
       <w:r>
+        <w:rPr>
+          <w:highlight w:val="yellow"/>
+        </w:rPr>
         <w:t>api</w:t>
       </w:r>
       <w:proofErr w:type="spellEnd"/>
       <w:r>
-        <w:t>/assets/{id} — update (AUTH)</w:t>
+        <w:rPr>
+          <w:highlight w:val="yellow"/>
+        </w:rPr>
+        <w:t>/assets/{id} — update</w:t>
+      </w:r>
+      <w:r>
+        <w:t xml:space="preserve"> (AUTH)</w:t>
       </w:r>
     </w:p>
     <w:p>
@@ -5658,15 +5827,54 @@
         <w:spacing w:before="40" w:after="40"/>
       </w:pPr>
       <w:r>
-        <w:t>PATCH /</w:t>
+        <w:rPr>
+          <w:highlight w:val="yellow"/>
+        </w:rPr>
+        <w:t>DELETE</w:t>
+      </w:r>
+      <w:r>
+        <w:rPr>
+          <w:highlight w:val="yellow"/>
+        </w:rPr>
+        <w:t xml:space="preserve"> /</w:t>
       </w:r>
       <w:proofErr w:type="spellStart"/>
       <w:r>
+        <w:rPr>
+          <w:highlight w:val="yellow"/>
+        </w:rPr>
         <w:t>api</w:t>
       </w:r>
       <w:proofErr w:type="spellEnd"/>
       <w:r>
-        <w:t>/assets/{id}/status — change status (AUTH)</w:t>
+        <w:rPr>
+          <w:highlight w:val="yellow"/>
+        </w:rPr>
+        <w:t>/assets/</w:t>
+      </w:r>
+      <w:r>
+        <w:rPr>
+          <w:highlight w:val="yellow"/>
+        </w:rPr>
+        <w:t>{id}</w:t>
+      </w:r>
+      <w:r>
+        <w:rPr>
+          <w:highlight w:val="yellow"/>
+        </w:rPr>
+        <w:t xml:space="preserve"> — search and filter</w:t>
+      </w:r>
+      <w:r>
+        <w:t xml:space="preserve"> (AUTH)</w:t>
+      </w:r>
+    </w:p>
+    <w:p>
+      <w:pPr>
+        <w:pStyle w:val="Heading2"/>
+      </w:pPr>
+      <w:r>
+        <w:lastRenderedPageBreak/>
+        <w:t>Assignment APIs</w:t>
       </w:r>
     </w:p>
     <w:p>
@@ -5679,7 +5887,7 @@
         <w:spacing w:before="40" w:after="40"/>
       </w:pPr>
       <w:r>
-        <w:t>GET /</w:t>
+        <w:t>POST /</w:t>
       </w:r>
       <w:proofErr w:type="spellStart"/>
       <w:r>
@@ -5687,7 +5895,7 @@
       </w:r>
       <w:proofErr w:type="spellEnd"/>
       <w:r>
-        <w:t>/assets/search — search and filter (AUTH)</w:t>
+        <w:t>/assignments — assign asset (AUTH)</w:t>
       </w:r>
     </w:p>
     <w:p>
@@ -5700,8 +5908,7 @@
         <w:spacing w:before="40" w:after="40"/>
       </w:pPr>
       <w:r>
-        <w:lastRenderedPageBreak/>
-        <w:t>GET /</w:t>
+        <w:t>POST /</w:t>
       </w:r>
       <w:proofErr w:type="spellStart"/>
       <w:r>
@@ -5709,16 +5916,7 @@
       </w:r>
       <w:proofErr w:type="spellEnd"/>
       <w:r>
-        <w:t>/assets/{id}/status — public status check (PUBLIC)</w:t>
-      </w:r>
-    </w:p>
-    <w:bookmarkEnd w:id="0"/>
-    <w:p>
-      <w:pPr>
-        <w:pStyle w:val="Heading2"/>
-      </w:pPr>
-      <w:r>
-        <w:t>Assignment APIs</w:t>
+        <w:t>/assignments/{id}/return — return asset (AUTH)</w:t>
       </w:r>
     </w:p>
     <w:p>
@@ -5731,7 +5929,7 @@
         <w:spacing w:before="40" w:after="40"/>
       </w:pPr>
       <w:r>
-        <w:t>POST /</w:t>
+        <w:t>GET /</w:t>
       </w:r>
       <w:proofErr w:type="spellStart"/>
       <w:r>
@@ -5739,7 +5937,15 @@
       </w:r>
       <w:proofErr w:type="spellEnd"/>
       <w:r>
-        <w:t>/assignments — assign asset (AUTH)</w:t>
+        <w:t>/assets/{id}/assignments — view history (AUTH)</w:t>
+      </w:r>
+    </w:p>
+    <w:p>
+      <w:pPr>
+        <w:pStyle w:val="Heading2"/>
+      </w:pPr>
+      <w:r>
+        <w:t>Procurement APIs</w:t>
       </w:r>
     </w:p>
     <w:p>
@@ -5760,7 +5966,7 @@
       </w:r>
       <w:proofErr w:type="spellEnd"/>
       <w:r>
-        <w:t>/assignments/{id}/return — return asset (AUTH)</w:t>
+        <w:t>/assets/{id}/procurement — create (AUTH)</w:t>
       </w:r>
     </w:p>
     <w:p>
@@ -5773,7 +5979,7 @@
         <w:spacing w:before="40" w:after="40"/>
       </w:pPr>
       <w:r>
-        <w:t>GET /</w:t>
+        <w:t>PUT /</w:t>
       </w:r>
       <w:proofErr w:type="spellStart"/>
       <w:r>
@@ -5781,7 +5987,7 @@
       </w:r>
       <w:proofErr w:type="spellEnd"/>
       <w:r>
-        <w:t>/assets/{id}/assignments — view history (AUTH)</w:t>
+        <w:t>/assets/{id}/procurement — update (AUTH)</w:t>
       </w:r>
     </w:p>
     <w:p>
@@ -5789,7 +5995,7 @@
         <w:pStyle w:val="Heading2"/>
       </w:pPr>
       <w:r>
-        <w:t>Procurement APIs</w:t>
+        <w:t>Issue APIs</w:t>
       </w:r>
     </w:p>
     <w:p>
@@ -5810,7 +6016,7 @@
       </w:r>
       <w:proofErr w:type="spellEnd"/>
       <w:r>
-        <w:t>/assets/{id}/procurement — create (AUTH)</w:t>
+        <w:t>/assets/{id}/issues — report issue (AUTH)</w:t>
       </w:r>
     </w:p>
     <w:p>
@@ -5831,15 +6037,7 @@
       </w:r>
       <w:proofErr w:type="spellEnd"/>
       <w:r>
-        <w:t>/assets/{id}/procurement — update (AUTH)</w:t>
-      </w:r>
-    </w:p>
-    <w:p>
-      <w:pPr>
-        <w:pStyle w:val="Heading2"/>
-      </w:pPr>
-      <w:r>
-        <w:t>Issue APIs</w:t>
+        <w:t>/issues/{id} — update issue (AUTH)</w:t>
       </w:r>
     </w:p>
     <w:p>
@@ -5852,7 +6050,7 @@
         <w:spacing w:before="40" w:after="40"/>
       </w:pPr>
       <w:r>
-        <w:t>POST /</w:t>
+        <w:t>GET /</w:t>
       </w:r>
       <w:proofErr w:type="spellStart"/>
       <w:r>
@@ -5860,7 +6058,15 @@
       </w:r>
       <w:proofErr w:type="spellEnd"/>
       <w:r>
-        <w:t>/assets/{id}/issues — report issue (AUTH)</w:t>
+        <w:t>/assets/{id}/issues — view issues (AUTH)</w:t>
+      </w:r>
+    </w:p>
+    <w:p>
+      <w:pPr>
+        <w:pStyle w:val="Heading2"/>
+      </w:pPr>
+      <w:r>
+        <w:t>Report APIs (Public)</w:t>
       </w:r>
     </w:p>
     <w:p>
@@ -5873,7 +6079,7 @@
         <w:spacing w:before="40" w:after="40"/>
       </w:pPr>
       <w:r>
-        <w:t>PUT /</w:t>
+        <w:t>GET /</w:t>
       </w:r>
       <w:proofErr w:type="spellStart"/>
       <w:r>
@@ -5881,7 +6087,7 @@
       </w:r>
       <w:proofErr w:type="spellEnd"/>
       <w:r>
-        <w:t>/issues/{id} — update issue (AUTH)</w:t>
+        <w:t>/reports/summary — dashboard summary (PUBLIC)</w:t>
       </w:r>
     </w:p>
     <w:p>
@@ -5902,15 +6108,7 @@
       </w:r>
       <w:proofErr w:type="spellEnd"/>
       <w:r>
-        <w:t>/assets/{id}/issues — view issues (AUTH)</w:t>
-      </w:r>
-    </w:p>
-    <w:p>
-      <w:pPr>
-        <w:pStyle w:val="Heading2"/>
-      </w:pPr>
-      <w:r>
-        <w:t>Report APIs (Public)</w:t>
+        <w:t>/reports/warranty-expiry — warranty report (PUBLIC)</w:t>
       </w:r>
     </w:p>
     <w:p>
@@ -5931,7 +6129,7 @@
       </w:r>
       <w:proofErr w:type="spellEnd"/>
       <w:r>
-        <w:t>/reports/summary — dashboard summary (PUBLIC)</w:t>
+        <w:t>/reports/available-assets — availability (PUBLIC)</w:t>
       </w:r>
     </w:p>
     <w:p>
@@ -5952,7 +6150,7 @@
       </w:r>
       <w:proofErr w:type="spellEnd"/>
       <w:r>
-        <w:t>/reports/warranty-expiry — warranty report (PUBLIC)</w:t>
+        <w:t>/reports/issues — issue overview (PUBLIC)</w:t>
       </w:r>
     </w:p>
     <w:p>
@@ -5965,36 +6163,30 @@
         <w:spacing w:before="40" w:after="40"/>
       </w:pPr>
       <w:r>
+        <w:rPr>
+          <w:sz w:val="20"/>
+          <w:szCs w:val="20"/>
+        </w:rPr>
         <w:t>GET /</w:t>
       </w:r>
       <w:proofErr w:type="spellStart"/>
       <w:r>
+        <w:rPr>
+          <w:sz w:val="20"/>
+          <w:szCs w:val="20"/>
+        </w:rPr>
         <w:t>api</w:t>
       </w:r>
       <w:proofErr w:type="spellEnd"/>
       <w:r>
-        <w:t>/reports/available-assets — availability (PUBLIC)</w:t>
-      </w:r>
-    </w:p>
-    <w:p>
-      <w:pPr>
-        <w:pStyle w:val="ListParagraph"/>
-        <w:numPr>
-          <w:ilvl w:val="0"/>
-          <w:numId w:val="2"/>
-        </w:numPr>
-        <w:spacing w:before="40" w:after="40"/>
-      </w:pPr>
-      <w:r>
-        <w:t>GET /</w:t>
-      </w:r>
-      <w:proofErr w:type="spellStart"/>
-      <w:r>
-        <w:t>api</w:t>
-      </w:r>
-      <w:proofErr w:type="spellEnd"/>
-      <w:r>
-        <w:t>/reports/issues — issue overview (PUBLIC)</w:t>
+        <w:rPr>
+          <w:sz w:val="20"/>
+          <w:szCs w:val="20"/>
+        </w:rPr>
+        <w:t xml:space="preserve">/reports/Search/device-detail </w:t>
+      </w:r>
+      <w:r>
+        <w:t>— issue overview (PUBLIC)</w:t>
       </w:r>
     </w:p>
     <w:p>
@@ -6500,23 +6692,23 @@
         <w:spacing w:before="40" w:after="40"/>
       </w:pPr>
       <w:r>
+        <w:t xml:space="preserve">status values should be controlled by </w:t>
+      </w:r>
+      <w:proofErr w:type="spellStart"/>
+      <w:r>
+        <w:t>enum</w:t>
+      </w:r>
+      <w:proofErr w:type="spellEnd"/>
+      <w:r>
+        <w:t>.</w:t>
+      </w:r>
+    </w:p>
+    <w:p>
+      <w:pPr>
+        <w:pStyle w:val="Heading2"/>
+      </w:pPr>
+      <w:r>
         <w:lastRenderedPageBreak/>
-        <w:t xml:space="preserve">status values should be controlled by </w:t>
-      </w:r>
-      <w:proofErr w:type="spellStart"/>
-      <w:r>
-        <w:t>enum</w:t>
-      </w:r>
-      <w:proofErr w:type="spellEnd"/>
-      <w:r>
-        <w:t>.</w:t>
-      </w:r>
-    </w:p>
-    <w:p>
-      <w:pPr>
-        <w:pStyle w:val="Heading2"/>
-      </w:pPr>
-      <w:r>
         <w:t>Assignment Rules</w:t>
       </w:r>
     </w:p>
@@ -7245,7 +7437,6 @@
                 <w:sz w:val="20"/>
                 <w:szCs w:val="20"/>
               </w:rPr>
-              <w:lastRenderedPageBreak/>
               <w:t>Spring Validation</w:t>
             </w:r>
           </w:p>
@@ -7302,6 +7493,7 @@
                 <w:sz w:val="20"/>
                 <w:szCs w:val="20"/>
               </w:rPr>
+              <w:lastRenderedPageBreak/>
               <w:t>Spring Security + JWT</w:t>
             </w:r>
           </w:p>

</xml_diff>

<commit_message>
docs: Add initial project perspective document for TID Asset Management.
</commit_message>
<xml_diff>
--- a/document/TID_Asset_Management_Project_Perspective.docx
+++ b/document/TID_Asset_Management_Project_Perspective.docx
@@ -456,7 +456,7 @@
         <w:spacing w:before="80" w:after="80"/>
       </w:pPr>
       <w:r>
-        <w:t>Assign assets to employees, return assets, transfer assets, and keep assignment history.</w:t>
+        <w:t>Assign assets to employees, return assets, transfer assets.</w:t>
       </w:r>
     </w:p>
     <w:p>
@@ -2734,11 +2734,9 @@
             </w:pPr>
             <w:r>
               <w:rPr>
-                <w:sz w:val="20"/>
-                <w:szCs w:val="20"/>
                 <w:highlight w:val="yellow"/>
               </w:rPr>
-              <w:t>VARCHAR</w:t>
+              <w:t>ENUM</w:t>
             </w:r>
           </w:p>
         </w:tc>
@@ -2762,6 +2760,8 @@
           <w:p>
             <w:pPr>
               <w:rPr>
+                <w:sz w:val="20"/>
+                <w:szCs w:val="20"/>
                 <w:highlight w:val="yellow"/>
               </w:rPr>
             </w:pPr>
@@ -2771,7 +2771,7 @@
                 <w:szCs w:val="20"/>
                 <w:highlight w:val="yellow"/>
               </w:rPr>
-              <w:t>Laptop, desktop, monitor, etc.</w:t>
+              <w:t>LAPTOP, DESKTOP, PORTABLE_MONITOR, STAND_MONITOR</w:t>
             </w:r>
           </w:p>
         </w:tc>
@@ -3065,16 +3065,17 @@
           <w:p>
             <w:pPr>
               <w:rPr>
+                <w:sz w:val="20"/>
+                <w:szCs w:val="20"/>
+              </w:rPr>
+            </w:pPr>
+            <w:r>
+              <w:rPr>
+                <w:sz w:val="20"/>
+                <w:szCs w:val="20"/>
                 <w:highlight w:val="yellow"/>
               </w:rPr>
-            </w:pPr>
-            <w:r>
-              <w:rPr>
-                <w:sz w:val="20"/>
-                <w:szCs w:val="20"/>
-                <w:highlight w:val="yellow"/>
-              </w:rPr>
-              <w:t>AVAILABLE, ASSIGNED, DAMAGED, REPAIR, RETIRED</w:t>
+              <w:t>AVAILABLE, IN_USE, UNDER_REPAIR, LOST, DAMAGED</w:t>
             </w:r>
           </w:p>
         </w:tc>
@@ -3664,7 +3665,6 @@
                 <w:highlight w:val="yellow"/>
               </w:rPr>
             </w:pPr>
-            <w:bookmarkStart w:id="0" w:name="_GoBack" w:colFirst="0" w:colLast="2"/>
             <w:r>
               <w:rPr>
                 <w:sz w:val="20"/>
@@ -3746,7 +3746,6 @@
           </w:p>
         </w:tc>
       </w:tr>
-      <w:bookmarkEnd w:id="0"/>
       <w:tr>
         <w:tc>
           <w:tcPr>
@@ -3884,6 +3883,1302 @@
       <w:proofErr w:type="spellStart"/>
       <w:r>
         <w:t>asset_assignments</w:t>
+      </w:r>
+      <w:proofErr w:type="spellEnd"/>
+    </w:p>
+    <w:tbl>
+      <w:tblPr>
+        <w:tblW w:w="9360" w:type="dxa"/>
+        <w:tblBorders>
+          <w:top w:val="single" w:sz="4" w:space="0" w:color="auto"/>
+          <w:left w:val="single" w:sz="4" w:space="0" w:color="auto"/>
+          <w:bottom w:val="single" w:sz="4" w:space="0" w:color="auto"/>
+          <w:right w:val="single" w:sz="4" w:space="0" w:color="auto"/>
+          <w:insideH w:val="single" w:sz="4" w:space="0" w:color="auto"/>
+          <w:insideV w:val="single" w:sz="4" w:space="0" w:color="auto"/>
+        </w:tblBorders>
+        <w:tblLayout w:type="fixed"/>
+        <w:tblCellMar>
+          <w:left w:w="10" w:type="dxa"/>
+          <w:right w:w="10" w:type="dxa"/>
+        </w:tblCellMar>
+        <w:tblLook w:val="0000" w:firstRow="0" w:lastRow="0" w:firstColumn="0" w:lastColumn="0" w:noHBand="0" w:noVBand="0"/>
+      </w:tblPr>
+      <w:tblGrid>
+        <w:gridCol w:w="2800"/>
+        <w:gridCol w:w="6560"/>
+      </w:tblGrid>
+      <w:tr>
+        <w:trPr>
+          <w:tblHeader/>
+        </w:trPr>
+        <w:tc>
+          <w:tcPr>
+            <w:tcW w:w="2800" w:type="dxa"/>
+            <w:tcBorders>
+              <w:top w:val="single" w:sz="1" w:space="0" w:color="2563EB"/>
+              <w:left w:val="single" w:sz="1" w:space="0" w:color="2563EB"/>
+              <w:bottom w:val="single" w:sz="1" w:space="0" w:color="2563EB"/>
+              <w:right w:val="single" w:sz="1" w:space="0" w:color="2563EB"/>
+            </w:tcBorders>
+            <w:shd w:val="clear" w:color="auto" w:fill="1E3A5F"/>
+            <w:tcMar>
+              <w:top w:w="100" w:type="dxa"/>
+              <w:left w:w="150" w:type="dxa"/>
+              <w:bottom w:w="100" w:type="dxa"/>
+              <w:right w:w="150" w:type="dxa"/>
+            </w:tcMar>
+          </w:tcPr>
+          <w:p>
+            <w:pPr>
+              <w:rPr>
+                <w:sz w:val="20"/>
+                <w:szCs w:val="20"/>
+              </w:rPr>
+            </w:pPr>
+            <w:r>
+              <w:rPr>
+                <w:b/>
+                <w:bCs/>
+                <w:color w:val="FFFFFF"/>
+                <w:sz w:val="20"/>
+                <w:szCs w:val="20"/>
+              </w:rPr>
+              <w:t>Column</w:t>
+            </w:r>
+          </w:p>
+        </w:tc>
+        <w:tc>
+          <w:tcPr>
+            <w:tcW w:w="6560" w:type="dxa"/>
+            <w:tcBorders>
+              <w:top w:val="single" w:sz="1" w:space="0" w:color="2563EB"/>
+              <w:left w:val="single" w:sz="1" w:space="0" w:color="2563EB"/>
+              <w:bottom w:val="single" w:sz="1" w:space="0" w:color="2563EB"/>
+              <w:right w:val="single" w:sz="1" w:space="0" w:color="2563EB"/>
+            </w:tcBorders>
+            <w:shd w:val="clear" w:color="auto" w:fill="1E3A5F"/>
+            <w:tcMar>
+              <w:top w:w="100" w:type="dxa"/>
+              <w:left w:w="150" w:type="dxa"/>
+              <w:bottom w:w="100" w:type="dxa"/>
+              <w:right w:w="150" w:type="dxa"/>
+            </w:tcMar>
+          </w:tcPr>
+          <w:p>
+            <w:pPr>
+              <w:rPr>
+                <w:sz w:val="20"/>
+                <w:szCs w:val="20"/>
+              </w:rPr>
+            </w:pPr>
+            <w:r>
+              <w:rPr>
+                <w:b/>
+                <w:bCs/>
+                <w:color w:val="FFFFFF"/>
+                <w:sz w:val="20"/>
+                <w:szCs w:val="20"/>
+              </w:rPr>
+              <w:t>Notes</w:t>
+            </w:r>
+          </w:p>
+        </w:tc>
+      </w:tr>
+      <w:tr>
+        <w:tc>
+          <w:tcPr>
+            <w:tcW w:w="2800" w:type="dxa"/>
+            <w:tcBorders>
+              <w:top w:val="single" w:sz="1" w:space="0" w:color="CCCCCC"/>
+              <w:left w:val="single" w:sz="1" w:space="0" w:color="CCCCCC"/>
+              <w:bottom w:val="single" w:sz="1" w:space="0" w:color="CCCCCC"/>
+              <w:right w:val="single" w:sz="1" w:space="0" w:color="CCCCCC"/>
+            </w:tcBorders>
+            <w:shd w:val="clear" w:color="auto" w:fill="F0F4FA"/>
+            <w:tcMar>
+              <w:top w:w="80" w:type="dxa"/>
+              <w:left w:w="150" w:type="dxa"/>
+              <w:bottom w:w="80" w:type="dxa"/>
+              <w:right w:w="150" w:type="dxa"/>
+            </w:tcMar>
+          </w:tcPr>
+          <w:p>
+            <w:pPr>
+              <w:rPr>
+                <w:sz w:val="20"/>
+                <w:szCs w:val="20"/>
+              </w:rPr>
+            </w:pPr>
+            <w:r>
+              <w:rPr>
+                <w:sz w:val="20"/>
+                <w:szCs w:val="20"/>
+              </w:rPr>
+              <w:t xml:space="preserve">id, </w:t>
+            </w:r>
+            <w:proofErr w:type="spellStart"/>
+            <w:r>
+              <w:rPr>
+                <w:sz w:val="20"/>
+                <w:szCs w:val="20"/>
+              </w:rPr>
+              <w:t>asset_id</w:t>
+            </w:r>
+            <w:proofErr w:type="spellEnd"/>
+          </w:p>
+        </w:tc>
+        <w:tc>
+          <w:tcPr>
+            <w:tcW w:w="6560" w:type="dxa"/>
+            <w:tcBorders>
+              <w:top w:val="single" w:sz="1" w:space="0" w:color="CCCCCC"/>
+              <w:left w:val="single" w:sz="1" w:space="0" w:color="CCCCCC"/>
+              <w:bottom w:val="single" w:sz="1" w:space="0" w:color="CCCCCC"/>
+              <w:right w:val="single" w:sz="1" w:space="0" w:color="CCCCCC"/>
+            </w:tcBorders>
+            <w:shd w:val="clear" w:color="auto" w:fill="F0F4FA"/>
+            <w:tcMar>
+              <w:top w:w="80" w:type="dxa"/>
+              <w:left w:w="150" w:type="dxa"/>
+              <w:bottom w:w="80" w:type="dxa"/>
+              <w:right w:w="150" w:type="dxa"/>
+            </w:tcMar>
+          </w:tcPr>
+          <w:p>
+            <w:pPr>
+              <w:rPr>
+                <w:sz w:val="20"/>
+                <w:szCs w:val="20"/>
+              </w:rPr>
+            </w:pPr>
+            <w:r>
+              <w:rPr>
+                <w:sz w:val="20"/>
+                <w:szCs w:val="20"/>
+              </w:rPr>
+              <w:t>FK to assets</w:t>
+            </w:r>
+          </w:p>
+        </w:tc>
+      </w:tr>
+      <w:tr>
+        <w:tc>
+          <w:tcPr>
+            <w:tcW w:w="2800" w:type="dxa"/>
+            <w:tcBorders>
+              <w:top w:val="single" w:sz="1" w:space="0" w:color="CCCCCC"/>
+              <w:left w:val="single" w:sz="1" w:space="0" w:color="CCCCCC"/>
+              <w:bottom w:val="single" w:sz="1" w:space="0" w:color="CCCCCC"/>
+              <w:right w:val="single" w:sz="1" w:space="0" w:color="CCCCCC"/>
+            </w:tcBorders>
+            <w:shd w:val="clear" w:color="auto" w:fill="FFFFFF"/>
+            <w:tcMar>
+              <w:top w:w="80" w:type="dxa"/>
+              <w:left w:w="150" w:type="dxa"/>
+              <w:bottom w:w="80" w:type="dxa"/>
+              <w:right w:w="150" w:type="dxa"/>
+            </w:tcMar>
+          </w:tcPr>
+          <w:p>
+            <w:pPr>
+              <w:rPr>
+                <w:sz w:val="20"/>
+                <w:szCs w:val="20"/>
+              </w:rPr>
+            </w:pPr>
+            <w:proofErr w:type="spellStart"/>
+            <w:r>
+              <w:rPr>
+                <w:sz w:val="20"/>
+                <w:szCs w:val="20"/>
+              </w:rPr>
+              <w:t>assigned_to</w:t>
+            </w:r>
+            <w:proofErr w:type="spellEnd"/>
+          </w:p>
+        </w:tc>
+        <w:tc>
+          <w:tcPr>
+            <w:tcW w:w="6560" w:type="dxa"/>
+            <w:tcBorders>
+              <w:top w:val="single" w:sz="1" w:space="0" w:color="CCCCCC"/>
+              <w:left w:val="single" w:sz="1" w:space="0" w:color="CCCCCC"/>
+              <w:bottom w:val="single" w:sz="1" w:space="0" w:color="CCCCCC"/>
+              <w:right w:val="single" w:sz="1" w:space="0" w:color="CCCCCC"/>
+            </w:tcBorders>
+            <w:shd w:val="clear" w:color="auto" w:fill="FFFFFF"/>
+            <w:tcMar>
+              <w:top w:w="80" w:type="dxa"/>
+              <w:left w:w="150" w:type="dxa"/>
+              <w:bottom w:w="80" w:type="dxa"/>
+              <w:right w:w="150" w:type="dxa"/>
+            </w:tcMar>
+          </w:tcPr>
+          <w:p>
+            <w:pPr>
+              <w:rPr>
+                <w:sz w:val="20"/>
+                <w:szCs w:val="20"/>
+              </w:rPr>
+            </w:pPr>
+            <w:r>
+              <w:rPr>
+                <w:sz w:val="20"/>
+                <w:szCs w:val="20"/>
+              </w:rPr>
+              <w:t>Employee name or ID</w:t>
+            </w:r>
+          </w:p>
+        </w:tc>
+      </w:tr>
+      <w:tr>
+        <w:tc>
+          <w:tcPr>
+            <w:tcW w:w="2800" w:type="dxa"/>
+            <w:tcBorders>
+              <w:top w:val="single" w:sz="1" w:space="0" w:color="CCCCCC"/>
+              <w:left w:val="single" w:sz="1" w:space="0" w:color="CCCCCC"/>
+              <w:bottom w:val="single" w:sz="1" w:space="0" w:color="CCCCCC"/>
+              <w:right w:val="single" w:sz="1" w:space="0" w:color="CCCCCC"/>
+            </w:tcBorders>
+            <w:shd w:val="clear" w:color="auto" w:fill="F0F4FA"/>
+            <w:tcMar>
+              <w:top w:w="80" w:type="dxa"/>
+              <w:left w:w="150" w:type="dxa"/>
+              <w:bottom w:w="80" w:type="dxa"/>
+              <w:right w:w="150" w:type="dxa"/>
+            </w:tcMar>
+          </w:tcPr>
+          <w:p>
+            <w:pPr>
+              <w:rPr>
+                <w:sz w:val="20"/>
+                <w:szCs w:val="20"/>
+              </w:rPr>
+            </w:pPr>
+            <w:r>
+              <w:rPr>
+                <w:sz w:val="20"/>
+                <w:szCs w:val="20"/>
+              </w:rPr>
+              <w:t xml:space="preserve">department, </w:t>
+            </w:r>
+          </w:p>
+        </w:tc>
+        <w:tc>
+          <w:tcPr>
+            <w:tcW w:w="6560" w:type="dxa"/>
+            <w:tcBorders>
+              <w:top w:val="single" w:sz="1" w:space="0" w:color="CCCCCC"/>
+              <w:left w:val="single" w:sz="1" w:space="0" w:color="CCCCCC"/>
+              <w:bottom w:val="single" w:sz="1" w:space="0" w:color="CCCCCC"/>
+              <w:right w:val="single" w:sz="1" w:space="0" w:color="CCCCCC"/>
+            </w:tcBorders>
+            <w:shd w:val="clear" w:color="auto" w:fill="F0F4FA"/>
+            <w:tcMar>
+              <w:top w:w="80" w:type="dxa"/>
+              <w:left w:w="150" w:type="dxa"/>
+              <w:bottom w:w="80" w:type="dxa"/>
+              <w:right w:w="150" w:type="dxa"/>
+            </w:tcMar>
+          </w:tcPr>
+          <w:p>
+            <w:pPr>
+              <w:rPr>
+                <w:sz w:val="20"/>
+                <w:szCs w:val="20"/>
+              </w:rPr>
+            </w:pPr>
+            <w:r>
+              <w:rPr>
+                <w:sz w:val="20"/>
+                <w:szCs w:val="20"/>
+              </w:rPr>
+              <w:t xml:space="preserve">ENUM: </w:t>
+            </w:r>
+          </w:p>
+          <w:p>
+            <w:pPr>
+              <w:pStyle w:val="ListParagraph"/>
+              <w:numPr>
+                <w:ilvl w:val="0"/>
+                <w:numId w:val="3"/>
+              </w:numPr>
+              <w:rPr>
+                <w:sz w:val="20"/>
+                <w:szCs w:val="20"/>
+              </w:rPr>
+            </w:pPr>
+            <w:r>
+              <w:rPr>
+                <w:sz w:val="20"/>
+                <w:szCs w:val="20"/>
+              </w:rPr>
+              <w:t>Office Admin</w:t>
+            </w:r>
+          </w:p>
+          <w:p>
+            <w:pPr>
+              <w:pStyle w:val="ListParagraph"/>
+              <w:numPr>
+                <w:ilvl w:val="0"/>
+                <w:numId w:val="3"/>
+              </w:numPr>
+              <w:rPr>
+                <w:sz w:val="20"/>
+                <w:szCs w:val="20"/>
+              </w:rPr>
+            </w:pPr>
+            <w:r>
+              <w:rPr>
+                <w:sz w:val="20"/>
+                <w:szCs w:val="20"/>
+              </w:rPr>
+              <w:t>Tax &amp; Accounting Advisory</w:t>
+            </w:r>
+            <w:r>
+              <w:rPr>
+                <w:sz w:val="20"/>
+                <w:szCs w:val="20"/>
+              </w:rPr>
+              <w:t xml:space="preserve"> </w:t>
+            </w:r>
+          </w:p>
+          <w:p>
+            <w:pPr>
+              <w:pStyle w:val="ListParagraph"/>
+              <w:numPr>
+                <w:ilvl w:val="0"/>
+                <w:numId w:val="3"/>
+              </w:numPr>
+              <w:rPr>
+                <w:sz w:val="20"/>
+                <w:szCs w:val="20"/>
+              </w:rPr>
+            </w:pPr>
+            <w:r>
+              <w:rPr>
+                <w:sz w:val="20"/>
+                <w:szCs w:val="20"/>
+              </w:rPr>
+              <w:t>Legal &amp; Corporate Advisory</w:t>
+            </w:r>
+          </w:p>
+          <w:p>
+            <w:pPr>
+              <w:pStyle w:val="ListParagraph"/>
+              <w:numPr>
+                <w:ilvl w:val="0"/>
+                <w:numId w:val="3"/>
+              </w:numPr>
+              <w:rPr>
+                <w:sz w:val="20"/>
+                <w:szCs w:val="20"/>
+              </w:rPr>
+            </w:pPr>
+            <w:r>
+              <w:rPr>
+                <w:sz w:val="20"/>
+                <w:szCs w:val="20"/>
+              </w:rPr>
+              <w:t>Audit &amp; Assurance</w:t>
+            </w:r>
+          </w:p>
+          <w:p>
+            <w:pPr>
+              <w:pStyle w:val="ListParagraph"/>
+              <w:numPr>
+                <w:ilvl w:val="0"/>
+                <w:numId w:val="3"/>
+              </w:numPr>
+              <w:rPr>
+                <w:sz w:val="20"/>
+                <w:szCs w:val="20"/>
+              </w:rPr>
+            </w:pPr>
+            <w:r>
+              <w:rPr>
+                <w:sz w:val="20"/>
+                <w:szCs w:val="20"/>
+              </w:rPr>
+              <w:t>Practice Development &amp; Management</w:t>
+            </w:r>
+          </w:p>
+          <w:p>
+            <w:pPr>
+              <w:pStyle w:val="ListParagraph"/>
+              <w:numPr>
+                <w:ilvl w:val="0"/>
+                <w:numId w:val="3"/>
+              </w:numPr>
+              <w:rPr>
+                <w:sz w:val="20"/>
+                <w:szCs w:val="20"/>
+              </w:rPr>
+            </w:pPr>
+            <w:r>
+              <w:rPr>
+                <w:sz w:val="20"/>
+                <w:szCs w:val="20"/>
+              </w:rPr>
+              <w:t>Client &amp; Operation Management</w:t>
+            </w:r>
+          </w:p>
+          <w:p>
+            <w:pPr>
+              <w:pStyle w:val="ListParagraph"/>
+              <w:numPr>
+                <w:ilvl w:val="0"/>
+                <w:numId w:val="3"/>
+              </w:numPr>
+              <w:rPr>
+                <w:sz w:val="20"/>
+                <w:szCs w:val="20"/>
+              </w:rPr>
+            </w:pPr>
+            <w:r>
+              <w:rPr>
+                <w:sz w:val="20"/>
+                <w:szCs w:val="20"/>
+              </w:rPr>
+              <w:t>Finance &amp; Human Resource</w:t>
+            </w:r>
+          </w:p>
+          <w:p>
+            <w:pPr>
+              <w:pStyle w:val="ListParagraph"/>
+              <w:numPr>
+                <w:ilvl w:val="0"/>
+                <w:numId w:val="3"/>
+              </w:numPr>
+              <w:rPr>
+                <w:sz w:val="20"/>
+                <w:szCs w:val="20"/>
+              </w:rPr>
+            </w:pPr>
+            <w:r>
+              <w:rPr>
+                <w:sz w:val="20"/>
+                <w:szCs w:val="20"/>
+              </w:rPr>
+              <w:t>Technology Innovation and Development</w:t>
+            </w:r>
+          </w:p>
+        </w:tc>
+      </w:tr>
+      <w:tr>
+        <w:tc>
+          <w:tcPr>
+            <w:tcW w:w="2800" w:type="dxa"/>
+            <w:tcBorders>
+              <w:top w:val="single" w:sz="1" w:space="0" w:color="CCCCCC"/>
+              <w:left w:val="single" w:sz="1" w:space="0" w:color="CCCCCC"/>
+              <w:bottom w:val="single" w:sz="1" w:space="0" w:color="CCCCCC"/>
+              <w:right w:val="single" w:sz="1" w:space="0" w:color="CCCCCC"/>
+            </w:tcBorders>
+            <w:shd w:val="clear" w:color="auto" w:fill="F0F4FA"/>
+            <w:tcMar>
+              <w:top w:w="80" w:type="dxa"/>
+              <w:left w:w="150" w:type="dxa"/>
+              <w:bottom w:w="80" w:type="dxa"/>
+              <w:right w:w="150" w:type="dxa"/>
+            </w:tcMar>
+          </w:tcPr>
+          <w:p>
+            <w:pPr>
+              <w:rPr>
+                <w:sz w:val="20"/>
+                <w:szCs w:val="20"/>
+              </w:rPr>
+            </w:pPr>
+            <w:proofErr w:type="spellStart"/>
+            <w:r>
+              <w:rPr>
+                <w:sz w:val="20"/>
+                <w:szCs w:val="20"/>
+              </w:rPr>
+              <w:t>job_title</w:t>
+            </w:r>
+            <w:proofErr w:type="spellEnd"/>
+          </w:p>
+        </w:tc>
+        <w:tc>
+          <w:tcPr>
+            <w:tcW w:w="6560" w:type="dxa"/>
+            <w:tcBorders>
+              <w:top w:val="single" w:sz="1" w:space="0" w:color="CCCCCC"/>
+              <w:left w:val="single" w:sz="1" w:space="0" w:color="CCCCCC"/>
+              <w:bottom w:val="single" w:sz="1" w:space="0" w:color="CCCCCC"/>
+              <w:right w:val="single" w:sz="1" w:space="0" w:color="CCCCCC"/>
+            </w:tcBorders>
+            <w:shd w:val="clear" w:color="auto" w:fill="F0F4FA"/>
+            <w:tcMar>
+              <w:top w:w="80" w:type="dxa"/>
+              <w:left w:w="150" w:type="dxa"/>
+              <w:bottom w:w="80" w:type="dxa"/>
+              <w:right w:w="150" w:type="dxa"/>
+            </w:tcMar>
+          </w:tcPr>
+          <w:p>
+            <w:pPr>
+              <w:rPr>
+                <w:sz w:val="20"/>
+                <w:szCs w:val="20"/>
+              </w:rPr>
+            </w:pPr>
+            <w:r>
+              <w:rPr>
+                <w:sz w:val="20"/>
+                <w:szCs w:val="20"/>
+              </w:rPr>
+              <w:t>ENUM</w:t>
+            </w:r>
+            <w:r>
+              <w:rPr>
+                <w:sz w:val="20"/>
+                <w:szCs w:val="20"/>
+              </w:rPr>
+              <w:t>:</w:t>
+            </w:r>
+          </w:p>
+          <w:p>
+            <w:pPr>
+              <w:pStyle w:val="NormalWeb"/>
+              <w:numPr>
+                <w:ilvl w:val="0"/>
+                <w:numId w:val="3"/>
+              </w:numPr>
+              <w:spacing w:before="0" w:beforeAutospacing="0" w:after="0" w:afterAutospacing="0"/>
+              <w:rPr>
+                <w:rFonts w:ascii="Arial" w:hAnsi="Arial" w:cs="Arial"/>
+                <w:sz w:val="20"/>
+                <w:szCs w:val="20"/>
+              </w:rPr>
+            </w:pPr>
+            <w:r>
+              <w:rPr>
+                <w:rFonts w:ascii="Arial" w:hAnsi="Arial" w:cs="Arial"/>
+                <w:sz w:val="20"/>
+                <w:szCs w:val="20"/>
+              </w:rPr>
+              <w:t>Assistant Manager</w:t>
+            </w:r>
+          </w:p>
+          <w:p>
+            <w:pPr>
+              <w:pStyle w:val="NormalWeb"/>
+              <w:numPr>
+                <w:ilvl w:val="0"/>
+                <w:numId w:val="3"/>
+              </w:numPr>
+              <w:spacing w:before="0" w:beforeAutospacing="0" w:after="0" w:afterAutospacing="0"/>
+              <w:rPr>
+                <w:rFonts w:ascii="Arial" w:hAnsi="Arial" w:cs="Arial"/>
+                <w:sz w:val="20"/>
+                <w:szCs w:val="20"/>
+              </w:rPr>
+            </w:pPr>
+            <w:r>
+              <w:rPr>
+                <w:rFonts w:ascii="Arial" w:hAnsi="Arial" w:cs="Arial"/>
+                <w:sz w:val="20"/>
+                <w:szCs w:val="20"/>
+              </w:rPr>
+              <w:t>Associate</w:t>
+            </w:r>
+          </w:p>
+          <w:p>
+            <w:pPr>
+              <w:pStyle w:val="NormalWeb"/>
+              <w:numPr>
+                <w:ilvl w:val="0"/>
+                <w:numId w:val="3"/>
+              </w:numPr>
+              <w:spacing w:before="0" w:beforeAutospacing="0" w:after="0" w:afterAutospacing="0"/>
+              <w:rPr>
+                <w:rFonts w:ascii="Arial" w:hAnsi="Arial" w:cs="Arial"/>
+                <w:sz w:val="20"/>
+                <w:szCs w:val="20"/>
+              </w:rPr>
+            </w:pPr>
+            <w:r>
+              <w:rPr>
+                <w:rFonts w:ascii="Arial" w:hAnsi="Arial" w:cs="Arial"/>
+                <w:sz w:val="20"/>
+                <w:szCs w:val="20"/>
+              </w:rPr>
+              <w:t>Associate Director</w:t>
+            </w:r>
+          </w:p>
+          <w:p>
+            <w:pPr>
+              <w:pStyle w:val="NormalWeb"/>
+              <w:numPr>
+                <w:ilvl w:val="0"/>
+                <w:numId w:val="3"/>
+              </w:numPr>
+              <w:spacing w:before="0" w:beforeAutospacing="0" w:after="0" w:afterAutospacing="0"/>
+              <w:rPr>
+                <w:rFonts w:ascii="Arial" w:hAnsi="Arial" w:cs="Arial"/>
+                <w:sz w:val="20"/>
+                <w:szCs w:val="20"/>
+              </w:rPr>
+            </w:pPr>
+            <w:r>
+              <w:rPr>
+                <w:rFonts w:ascii="Arial" w:hAnsi="Arial" w:cs="Arial"/>
+                <w:sz w:val="20"/>
+                <w:szCs w:val="20"/>
+              </w:rPr>
+              <w:t>Consultant</w:t>
+            </w:r>
+          </w:p>
+          <w:p>
+            <w:pPr>
+              <w:pStyle w:val="NormalWeb"/>
+              <w:numPr>
+                <w:ilvl w:val="0"/>
+                <w:numId w:val="3"/>
+              </w:numPr>
+              <w:spacing w:before="0" w:beforeAutospacing="0" w:after="0" w:afterAutospacing="0"/>
+              <w:rPr>
+                <w:rFonts w:ascii="Arial" w:hAnsi="Arial" w:cs="Arial"/>
+                <w:sz w:val="20"/>
+                <w:szCs w:val="20"/>
+              </w:rPr>
+            </w:pPr>
+            <w:r>
+              <w:rPr>
+                <w:rFonts w:ascii="Arial" w:hAnsi="Arial" w:cs="Arial"/>
+                <w:sz w:val="20"/>
+                <w:szCs w:val="20"/>
+              </w:rPr>
+              <w:lastRenderedPageBreak/>
+              <w:t>Director</w:t>
+            </w:r>
+          </w:p>
+          <w:p>
+            <w:pPr>
+              <w:pStyle w:val="NormalWeb"/>
+              <w:numPr>
+                <w:ilvl w:val="0"/>
+                <w:numId w:val="3"/>
+              </w:numPr>
+              <w:spacing w:before="0" w:beforeAutospacing="0" w:after="0" w:afterAutospacing="0"/>
+              <w:rPr>
+                <w:rFonts w:ascii="Arial" w:hAnsi="Arial" w:cs="Arial"/>
+                <w:sz w:val="20"/>
+                <w:szCs w:val="20"/>
+              </w:rPr>
+            </w:pPr>
+            <w:r>
+              <w:rPr>
+                <w:rFonts w:ascii="Arial" w:hAnsi="Arial" w:cs="Arial"/>
+                <w:sz w:val="20"/>
+                <w:szCs w:val="20"/>
+              </w:rPr>
+              <w:t>Executive</w:t>
+            </w:r>
+          </w:p>
+          <w:p>
+            <w:pPr>
+              <w:pStyle w:val="NormalWeb"/>
+              <w:numPr>
+                <w:ilvl w:val="0"/>
+                <w:numId w:val="3"/>
+              </w:numPr>
+              <w:spacing w:before="0" w:beforeAutospacing="0" w:after="0" w:afterAutospacing="0"/>
+              <w:rPr>
+                <w:rFonts w:ascii="Arial" w:hAnsi="Arial" w:cs="Arial"/>
+                <w:sz w:val="20"/>
+                <w:szCs w:val="20"/>
+              </w:rPr>
+            </w:pPr>
+            <w:r>
+              <w:rPr>
+                <w:rFonts w:ascii="Arial" w:hAnsi="Arial" w:cs="Arial"/>
+                <w:sz w:val="20"/>
+                <w:szCs w:val="20"/>
+              </w:rPr>
+              <w:t>Executive Assistant</w:t>
+            </w:r>
+          </w:p>
+          <w:p>
+            <w:pPr>
+              <w:pStyle w:val="NormalWeb"/>
+              <w:numPr>
+                <w:ilvl w:val="0"/>
+                <w:numId w:val="3"/>
+              </w:numPr>
+              <w:spacing w:before="0" w:beforeAutospacing="0" w:after="0" w:afterAutospacing="0"/>
+              <w:rPr>
+                <w:rFonts w:ascii="Arial" w:hAnsi="Arial" w:cs="Arial"/>
+                <w:sz w:val="20"/>
+                <w:szCs w:val="20"/>
+              </w:rPr>
+            </w:pPr>
+            <w:r>
+              <w:rPr>
+                <w:rFonts w:ascii="Arial" w:hAnsi="Arial" w:cs="Arial"/>
+                <w:sz w:val="20"/>
+                <w:szCs w:val="20"/>
+              </w:rPr>
+              <w:t>Intern</w:t>
+            </w:r>
+          </w:p>
+          <w:p>
+            <w:pPr>
+              <w:pStyle w:val="NormalWeb"/>
+              <w:numPr>
+                <w:ilvl w:val="0"/>
+                <w:numId w:val="3"/>
+              </w:numPr>
+              <w:spacing w:before="0" w:beforeAutospacing="0" w:after="0" w:afterAutospacing="0"/>
+              <w:rPr>
+                <w:rFonts w:ascii="Arial" w:hAnsi="Arial" w:cs="Arial"/>
+                <w:sz w:val="20"/>
+                <w:szCs w:val="20"/>
+              </w:rPr>
+            </w:pPr>
+            <w:r>
+              <w:rPr>
+                <w:rFonts w:ascii="Arial" w:hAnsi="Arial" w:cs="Arial"/>
+                <w:sz w:val="20"/>
+                <w:szCs w:val="20"/>
+              </w:rPr>
+              <w:t>Manager</w:t>
+            </w:r>
+          </w:p>
+          <w:p>
+            <w:pPr>
+              <w:pStyle w:val="NormalWeb"/>
+              <w:numPr>
+                <w:ilvl w:val="0"/>
+                <w:numId w:val="3"/>
+              </w:numPr>
+              <w:spacing w:before="0" w:beforeAutospacing="0" w:after="0" w:afterAutospacing="0"/>
+              <w:rPr>
+                <w:rFonts w:ascii="Arial" w:hAnsi="Arial" w:cs="Arial"/>
+                <w:sz w:val="20"/>
+                <w:szCs w:val="20"/>
+              </w:rPr>
+            </w:pPr>
+            <w:r>
+              <w:rPr>
+                <w:rFonts w:ascii="Arial" w:hAnsi="Arial" w:cs="Arial"/>
+                <w:sz w:val="20"/>
+                <w:szCs w:val="20"/>
+              </w:rPr>
+              <w:t xml:space="preserve">Personal Assistant </w:t>
+            </w:r>
+            <w:r>
+              <w:rPr>
+                <w:rFonts w:ascii="Arial" w:hAnsi="Arial" w:cs="Arial"/>
+                <w:sz w:val="20"/>
+                <w:szCs w:val="20"/>
+              </w:rPr>
+              <w:t>to</w:t>
+            </w:r>
+            <w:r>
+              <w:rPr>
+                <w:rFonts w:ascii="Arial" w:hAnsi="Arial" w:cs="Arial"/>
+                <w:sz w:val="20"/>
+                <w:szCs w:val="20"/>
+              </w:rPr>
+              <w:t xml:space="preserve"> Managing Partner</w:t>
+            </w:r>
+          </w:p>
+          <w:p>
+            <w:pPr>
+              <w:pStyle w:val="NormalWeb"/>
+              <w:numPr>
+                <w:ilvl w:val="0"/>
+                <w:numId w:val="3"/>
+              </w:numPr>
+              <w:spacing w:before="0" w:beforeAutospacing="0" w:after="0" w:afterAutospacing="0"/>
+              <w:rPr>
+                <w:rFonts w:ascii="Arial" w:hAnsi="Arial" w:cs="Arial"/>
+                <w:sz w:val="20"/>
+                <w:szCs w:val="20"/>
+              </w:rPr>
+            </w:pPr>
+            <w:r>
+              <w:rPr>
+                <w:rFonts w:ascii="Arial" w:hAnsi="Arial" w:cs="Arial"/>
+                <w:sz w:val="20"/>
+                <w:szCs w:val="20"/>
+              </w:rPr>
+              <w:t>Receptionist</w:t>
+            </w:r>
+          </w:p>
+          <w:p>
+            <w:pPr>
+              <w:pStyle w:val="NormalWeb"/>
+              <w:numPr>
+                <w:ilvl w:val="0"/>
+                <w:numId w:val="3"/>
+              </w:numPr>
+              <w:spacing w:before="0" w:beforeAutospacing="0" w:after="0" w:afterAutospacing="0"/>
+              <w:rPr>
+                <w:rFonts w:ascii="Arial" w:hAnsi="Arial" w:cs="Arial"/>
+                <w:sz w:val="20"/>
+                <w:szCs w:val="20"/>
+              </w:rPr>
+            </w:pPr>
+            <w:r>
+              <w:rPr>
+                <w:rFonts w:ascii="Arial" w:hAnsi="Arial" w:cs="Arial"/>
+                <w:sz w:val="20"/>
+                <w:szCs w:val="20"/>
+              </w:rPr>
+              <w:t>Senior Admin Executive</w:t>
+            </w:r>
+          </w:p>
+          <w:p>
+            <w:pPr>
+              <w:pStyle w:val="NormalWeb"/>
+              <w:numPr>
+                <w:ilvl w:val="0"/>
+                <w:numId w:val="3"/>
+              </w:numPr>
+              <w:spacing w:before="0" w:beforeAutospacing="0" w:after="0" w:afterAutospacing="0"/>
+              <w:rPr>
+                <w:rFonts w:ascii="Arial" w:hAnsi="Arial" w:cs="Arial"/>
+                <w:sz w:val="20"/>
+                <w:szCs w:val="20"/>
+              </w:rPr>
+            </w:pPr>
+            <w:r>
+              <w:rPr>
+                <w:rFonts w:ascii="Arial" w:hAnsi="Arial" w:cs="Arial"/>
+                <w:sz w:val="20"/>
+                <w:szCs w:val="20"/>
+              </w:rPr>
+              <w:t>Senior Associate</w:t>
+            </w:r>
+          </w:p>
+          <w:p>
+            <w:pPr>
+              <w:pStyle w:val="NormalWeb"/>
+              <w:numPr>
+                <w:ilvl w:val="0"/>
+                <w:numId w:val="3"/>
+              </w:numPr>
+              <w:spacing w:before="0" w:beforeAutospacing="0" w:after="0" w:afterAutospacing="0"/>
+              <w:rPr>
+                <w:rFonts w:ascii="Arial" w:hAnsi="Arial" w:cs="Arial"/>
+                <w:sz w:val="20"/>
+                <w:szCs w:val="20"/>
+              </w:rPr>
+            </w:pPr>
+            <w:r>
+              <w:rPr>
+                <w:rFonts w:ascii="Arial" w:hAnsi="Arial" w:cs="Arial"/>
+                <w:sz w:val="20"/>
+                <w:szCs w:val="20"/>
+              </w:rPr>
+              <w:t>Senior Consultant</w:t>
+            </w:r>
+          </w:p>
+          <w:p>
+            <w:pPr>
+              <w:pStyle w:val="NormalWeb"/>
+              <w:numPr>
+                <w:ilvl w:val="0"/>
+                <w:numId w:val="3"/>
+              </w:numPr>
+              <w:spacing w:before="0" w:beforeAutospacing="0" w:after="0" w:afterAutospacing="0"/>
+              <w:rPr>
+                <w:rFonts w:ascii="Arial" w:hAnsi="Arial" w:cs="Arial"/>
+                <w:sz w:val="20"/>
+                <w:szCs w:val="20"/>
+              </w:rPr>
+            </w:pPr>
+            <w:r>
+              <w:rPr>
+                <w:rFonts w:ascii="Arial" w:hAnsi="Arial" w:cs="Arial"/>
+                <w:sz w:val="20"/>
+                <w:szCs w:val="20"/>
+              </w:rPr>
+              <w:t>Senior Executive</w:t>
+            </w:r>
+          </w:p>
+          <w:p>
+            <w:pPr>
+              <w:pStyle w:val="NormalWeb"/>
+              <w:numPr>
+                <w:ilvl w:val="0"/>
+                <w:numId w:val="3"/>
+              </w:numPr>
+              <w:spacing w:before="0" w:beforeAutospacing="0" w:after="0" w:afterAutospacing="0"/>
+              <w:rPr>
+                <w:rFonts w:ascii="Arial" w:hAnsi="Arial" w:cs="Arial"/>
+                <w:sz w:val="20"/>
+                <w:szCs w:val="20"/>
+              </w:rPr>
+            </w:pPr>
+            <w:r>
+              <w:rPr>
+                <w:rFonts w:ascii="Arial" w:hAnsi="Arial" w:cs="Arial"/>
+                <w:sz w:val="20"/>
+                <w:szCs w:val="20"/>
+              </w:rPr>
+              <w:t>Senior I</w:t>
+            </w:r>
+            <w:r>
+              <w:rPr>
+                <w:rFonts w:ascii="Arial" w:hAnsi="Arial" w:cs="Arial"/>
+                <w:sz w:val="20"/>
+                <w:szCs w:val="20"/>
+              </w:rPr>
+              <w:t>T</w:t>
+            </w:r>
+            <w:r>
+              <w:rPr>
+                <w:rFonts w:ascii="Arial" w:hAnsi="Arial" w:cs="Arial"/>
+                <w:sz w:val="20"/>
+                <w:szCs w:val="20"/>
+              </w:rPr>
+              <w:t xml:space="preserve"> Executive</w:t>
+            </w:r>
+          </w:p>
+          <w:p>
+            <w:pPr>
+              <w:pStyle w:val="NormalWeb"/>
+              <w:numPr>
+                <w:ilvl w:val="0"/>
+                <w:numId w:val="3"/>
+              </w:numPr>
+              <w:spacing w:before="0" w:beforeAutospacing="0" w:after="0" w:afterAutospacing="0"/>
+              <w:rPr>
+                <w:rFonts w:ascii="Arial" w:hAnsi="Arial" w:cs="Arial"/>
+                <w:sz w:val="20"/>
+                <w:szCs w:val="20"/>
+              </w:rPr>
+            </w:pPr>
+            <w:r>
+              <w:rPr>
+                <w:rFonts w:ascii="Arial" w:hAnsi="Arial" w:cs="Arial"/>
+                <w:sz w:val="20"/>
+                <w:szCs w:val="20"/>
+              </w:rPr>
+              <w:t>Senior Manager</w:t>
+            </w:r>
+          </w:p>
+          <w:p>
+            <w:pPr>
+              <w:pStyle w:val="NormalWeb"/>
+              <w:numPr>
+                <w:ilvl w:val="0"/>
+                <w:numId w:val="3"/>
+              </w:numPr>
+              <w:spacing w:before="0" w:beforeAutospacing="0" w:after="0" w:afterAutospacing="0"/>
+              <w:rPr>
+                <w:rFonts w:ascii="Arial" w:hAnsi="Arial" w:cs="Arial"/>
+                <w:sz w:val="20"/>
+                <w:szCs w:val="20"/>
+              </w:rPr>
+            </w:pPr>
+            <w:r>
+              <w:rPr>
+                <w:rFonts w:ascii="Arial" w:hAnsi="Arial" w:cs="Arial"/>
+                <w:sz w:val="20"/>
+                <w:szCs w:val="20"/>
+              </w:rPr>
+              <w:t>Supervisor</w:t>
+            </w:r>
+          </w:p>
+        </w:tc>
+      </w:tr>
+      <w:tr>
+        <w:tc>
+          <w:tcPr>
+            <w:tcW w:w="2800" w:type="dxa"/>
+            <w:tcBorders>
+              <w:top w:val="single" w:sz="1" w:space="0" w:color="CCCCCC"/>
+              <w:left w:val="single" w:sz="1" w:space="0" w:color="CCCCCC"/>
+              <w:bottom w:val="single" w:sz="1" w:space="0" w:color="CCCCCC"/>
+              <w:right w:val="single" w:sz="1" w:space="0" w:color="CCCCCC"/>
+            </w:tcBorders>
+            <w:shd w:val="clear" w:color="auto" w:fill="FFFFFF"/>
+            <w:tcMar>
+              <w:top w:w="80" w:type="dxa"/>
+              <w:left w:w="150" w:type="dxa"/>
+              <w:bottom w:w="80" w:type="dxa"/>
+              <w:right w:w="150" w:type="dxa"/>
+            </w:tcMar>
+          </w:tcPr>
+          <w:p>
+            <w:pPr>
+              <w:rPr>
+                <w:sz w:val="20"/>
+                <w:szCs w:val="20"/>
+              </w:rPr>
+            </w:pPr>
+            <w:proofErr w:type="spellStart"/>
+            <w:r>
+              <w:rPr>
+                <w:sz w:val="20"/>
+                <w:szCs w:val="20"/>
+              </w:rPr>
+              <w:lastRenderedPageBreak/>
+              <w:t>Assigned_</w:t>
+            </w:r>
+            <w:r>
+              <w:rPr>
+                <w:sz w:val="20"/>
+                <w:szCs w:val="20"/>
+              </w:rPr>
+              <w:t>b</w:t>
+            </w:r>
+            <w:r>
+              <w:rPr>
+                <w:sz w:val="20"/>
+                <w:szCs w:val="20"/>
+              </w:rPr>
+              <w:t>y</w:t>
+            </w:r>
+            <w:proofErr w:type="spellEnd"/>
+          </w:p>
+        </w:tc>
+        <w:tc>
+          <w:tcPr>
+            <w:tcW w:w="6560" w:type="dxa"/>
+            <w:tcBorders>
+              <w:top w:val="single" w:sz="1" w:space="0" w:color="CCCCCC"/>
+              <w:left w:val="single" w:sz="1" w:space="0" w:color="CCCCCC"/>
+              <w:bottom w:val="single" w:sz="1" w:space="0" w:color="CCCCCC"/>
+              <w:right w:val="single" w:sz="1" w:space="0" w:color="CCCCCC"/>
+            </w:tcBorders>
+            <w:shd w:val="clear" w:color="auto" w:fill="FFFFFF"/>
+            <w:tcMar>
+              <w:top w:w="80" w:type="dxa"/>
+              <w:left w:w="150" w:type="dxa"/>
+              <w:bottom w:w="80" w:type="dxa"/>
+              <w:right w:w="150" w:type="dxa"/>
+            </w:tcMar>
+          </w:tcPr>
+          <w:p>
+            <w:pPr>
+              <w:rPr>
+                <w:sz w:val="20"/>
+                <w:szCs w:val="20"/>
+              </w:rPr>
+            </w:pPr>
+            <w:r>
+              <w:rPr>
+                <w:sz w:val="20"/>
+                <w:szCs w:val="20"/>
+              </w:rPr>
+              <w:t xml:space="preserve">TID name for assigned </w:t>
+            </w:r>
+            <w:r>
+              <w:rPr>
+                <w:sz w:val="20"/>
+                <w:szCs w:val="20"/>
+              </w:rPr>
+              <w:t>by</w:t>
+            </w:r>
+            <w:r>
+              <w:rPr>
+                <w:sz w:val="20"/>
+                <w:szCs w:val="20"/>
+              </w:rPr>
+              <w:t xml:space="preserve"> (ENUM; Michael Ang Wei Poh, Seak Sophanna, Ty Sopheaktra)</w:t>
+            </w:r>
+          </w:p>
+        </w:tc>
+      </w:tr>
+      <w:tr>
+        <w:tc>
+          <w:tcPr>
+            <w:tcW w:w="2800" w:type="dxa"/>
+            <w:tcBorders>
+              <w:top w:val="single" w:sz="1" w:space="0" w:color="CCCCCC"/>
+              <w:left w:val="single" w:sz="1" w:space="0" w:color="CCCCCC"/>
+              <w:bottom w:val="single" w:sz="1" w:space="0" w:color="CCCCCC"/>
+              <w:right w:val="single" w:sz="1" w:space="0" w:color="CCCCCC"/>
+            </w:tcBorders>
+            <w:shd w:val="clear" w:color="auto" w:fill="FFFFFF"/>
+            <w:tcMar>
+              <w:top w:w="80" w:type="dxa"/>
+              <w:left w:w="150" w:type="dxa"/>
+              <w:bottom w:w="80" w:type="dxa"/>
+              <w:right w:w="150" w:type="dxa"/>
+            </w:tcMar>
+          </w:tcPr>
+          <w:p>
+            <w:pPr>
+              <w:rPr>
+                <w:sz w:val="20"/>
+                <w:szCs w:val="20"/>
+              </w:rPr>
+            </w:pPr>
+            <w:proofErr w:type="spellStart"/>
+            <w:r>
+              <w:rPr>
+                <w:sz w:val="20"/>
+                <w:szCs w:val="20"/>
+              </w:rPr>
+              <w:t>Latest_user</w:t>
+            </w:r>
+            <w:proofErr w:type="spellEnd"/>
+          </w:p>
+        </w:tc>
+        <w:tc>
+          <w:tcPr>
+            <w:tcW w:w="6560" w:type="dxa"/>
+            <w:tcBorders>
+              <w:top w:val="single" w:sz="1" w:space="0" w:color="CCCCCC"/>
+              <w:left w:val="single" w:sz="1" w:space="0" w:color="CCCCCC"/>
+              <w:bottom w:val="single" w:sz="1" w:space="0" w:color="CCCCCC"/>
+              <w:right w:val="single" w:sz="1" w:space="0" w:color="CCCCCC"/>
+            </w:tcBorders>
+            <w:shd w:val="clear" w:color="auto" w:fill="FFFFFF"/>
+            <w:tcMar>
+              <w:top w:w="80" w:type="dxa"/>
+              <w:left w:w="150" w:type="dxa"/>
+              <w:bottom w:w="80" w:type="dxa"/>
+              <w:right w:w="150" w:type="dxa"/>
+            </w:tcMar>
+          </w:tcPr>
+          <w:p>
+            <w:pPr>
+              <w:rPr>
+                <w:sz w:val="20"/>
+                <w:szCs w:val="20"/>
+              </w:rPr>
+            </w:pPr>
+            <w:r>
+              <w:rPr>
+                <w:sz w:val="20"/>
+                <w:szCs w:val="20"/>
+              </w:rPr>
+              <w:t>the previous user used the asset</w:t>
+            </w:r>
+          </w:p>
+        </w:tc>
+      </w:tr>
+      <w:tr>
+        <w:trPr>
+          <w:trHeight w:val="13"/>
+        </w:trPr>
+        <w:tc>
+          <w:tcPr>
+            <w:tcW w:w="2800" w:type="dxa"/>
+            <w:tcBorders>
+              <w:top w:val="single" w:sz="1" w:space="0" w:color="CCCCCC"/>
+              <w:left w:val="single" w:sz="1" w:space="0" w:color="CCCCCC"/>
+              <w:bottom w:val="single" w:sz="1" w:space="0" w:color="CCCCCC"/>
+              <w:right w:val="single" w:sz="1" w:space="0" w:color="CCCCCC"/>
+            </w:tcBorders>
+            <w:shd w:val="clear" w:color="auto" w:fill="FFFFFF"/>
+            <w:tcMar>
+              <w:top w:w="80" w:type="dxa"/>
+              <w:left w:w="150" w:type="dxa"/>
+              <w:bottom w:w="80" w:type="dxa"/>
+              <w:right w:w="150" w:type="dxa"/>
+            </w:tcMar>
+          </w:tcPr>
+          <w:p>
+            <w:pPr>
+              <w:rPr>
+                <w:sz w:val="20"/>
+                <w:szCs w:val="20"/>
+              </w:rPr>
+            </w:pPr>
+            <w:proofErr w:type="spellStart"/>
+            <w:r>
+              <w:rPr>
+                <w:sz w:val="20"/>
+                <w:szCs w:val="20"/>
+              </w:rPr>
+              <w:t>A</w:t>
+            </w:r>
+            <w:r>
+              <w:rPr>
+                <w:sz w:val="20"/>
+                <w:szCs w:val="20"/>
+              </w:rPr>
+              <w:t>ssigned_date</w:t>
+            </w:r>
+            <w:proofErr w:type="spellEnd"/>
+            <w:r>
+              <w:rPr>
+                <w:sz w:val="20"/>
+                <w:szCs w:val="20"/>
+              </w:rPr>
+              <w:t xml:space="preserve">, </w:t>
+            </w:r>
+            <w:proofErr w:type="spellStart"/>
+            <w:r>
+              <w:rPr>
+                <w:sz w:val="20"/>
+                <w:szCs w:val="20"/>
+              </w:rPr>
+              <w:t>R</w:t>
+            </w:r>
+            <w:r>
+              <w:rPr>
+                <w:sz w:val="20"/>
+                <w:szCs w:val="20"/>
+              </w:rPr>
+              <w:t>eturned_date</w:t>
+            </w:r>
+            <w:proofErr w:type="spellEnd"/>
+          </w:p>
+        </w:tc>
+        <w:tc>
+          <w:tcPr>
+            <w:tcW w:w="6560" w:type="dxa"/>
+            <w:tcBorders>
+              <w:top w:val="single" w:sz="1" w:space="0" w:color="CCCCCC"/>
+              <w:left w:val="single" w:sz="1" w:space="0" w:color="CCCCCC"/>
+              <w:bottom w:val="single" w:sz="1" w:space="0" w:color="CCCCCC"/>
+              <w:right w:val="single" w:sz="1" w:space="0" w:color="CCCCCC"/>
+            </w:tcBorders>
+            <w:shd w:val="clear" w:color="auto" w:fill="FFFFFF"/>
+            <w:tcMar>
+              <w:top w:w="80" w:type="dxa"/>
+              <w:left w:w="150" w:type="dxa"/>
+              <w:bottom w:w="80" w:type="dxa"/>
+              <w:right w:w="150" w:type="dxa"/>
+            </w:tcMar>
+          </w:tcPr>
+          <w:p>
+            <w:pPr>
+              <w:rPr>
+                <w:sz w:val="20"/>
+                <w:szCs w:val="20"/>
+              </w:rPr>
+            </w:pPr>
+            <w:r>
+              <w:rPr>
+                <w:sz w:val="20"/>
+                <w:szCs w:val="20"/>
+              </w:rPr>
+              <w:t>Lifecycle dates</w:t>
+            </w:r>
+          </w:p>
+        </w:tc>
+      </w:tr>
+    </w:tbl>
+    <w:p>
+      <w:pPr>
+        <w:spacing w:before="60" w:after="60"/>
+      </w:pPr>
+    </w:p>
+    <w:p>
+      <w:pPr>
+        <w:pStyle w:val="Heading2"/>
+      </w:pPr>
+      <w:r>
+        <w:t xml:space="preserve">Table: </w:t>
+      </w:r>
+      <w:proofErr w:type="spellStart"/>
+      <w:r>
+        <w:t>asset_procurements</w:t>
       </w:r>
       <w:proofErr w:type="spellEnd"/>
     </w:p>
@@ -4063,7 +5358,7 @@
                 <w:sz w:val="20"/>
                 <w:szCs w:val="20"/>
               </w:rPr>
-              <w:t>assigned_to</w:t>
+              <w:t>purchase_date</w:t>
             </w:r>
             <w:proofErr w:type="spellEnd"/>
           </w:p>
@@ -4091,7 +5386,7 @@
                 <w:sz w:val="20"/>
                 <w:szCs w:val="20"/>
               </w:rPr>
-              <w:t>Employee name or ID</w:t>
+              <w:t>Date of purchase</w:t>
             </w:r>
           </w:p>
         </w:tc>
@@ -4115,20 +5410,13 @@
             </w:tcMar>
           </w:tcPr>
           <w:p>
-            <w:r>
-              <w:rPr>
-                <w:sz w:val="20"/>
-                <w:szCs w:val="20"/>
-              </w:rPr>
-              <w:t xml:space="preserve">department, </w:t>
-            </w:r>
             <w:proofErr w:type="spellStart"/>
             <w:r>
               <w:rPr>
                 <w:sz w:val="20"/>
                 <w:szCs w:val="20"/>
               </w:rPr>
-              <w:t>job_title</w:t>
+              <w:t>purchase_vendor</w:t>
             </w:r>
             <w:proofErr w:type="spellEnd"/>
           </w:p>
@@ -4156,7 +5444,7 @@
                 <w:sz w:val="20"/>
                 <w:szCs w:val="20"/>
               </w:rPr>
-              <w:t>Organizational metadata</w:t>
+              <w:t>Supplier name</w:t>
             </w:r>
           </w:p>
         </w:tc>
@@ -4186,25 +5474,9 @@
                 <w:sz w:val="20"/>
                 <w:szCs w:val="20"/>
               </w:rPr>
-              <w:t>assigned_date</w:t>
+              <w:t>purchase_cost</w:t>
             </w:r>
             <w:proofErr w:type="spellEnd"/>
-            <w:r>
-              <w:rPr>
-                <w:sz w:val="20"/>
-                <w:szCs w:val="20"/>
-              </w:rPr>
-              <w:t xml:space="preserve">, </w:t>
-            </w:r>
-            <w:proofErr w:type="spellStart"/>
-            <w:r>
-              <w:rPr>
-                <w:sz w:val="20"/>
-                <w:szCs w:val="20"/>
-              </w:rPr>
-              <w:t>returned_date</w:t>
-            </w:r>
-            <w:proofErr w:type="spellEnd"/>
           </w:p>
         </w:tc>
         <w:tc>
@@ -4230,7 +5502,7 @@
                 <w:sz w:val="20"/>
                 <w:szCs w:val="20"/>
               </w:rPr>
-              <w:t>Lifecycle dates</w:t>
+              <w:t>Cannot be negative</w:t>
             </w:r>
           </w:p>
         </w:tc>
@@ -4260,7 +5532,7 @@
                 <w:sz w:val="20"/>
                 <w:szCs w:val="20"/>
               </w:rPr>
-              <w:t>is_active</w:t>
+              <w:t>warranty_expiry_date</w:t>
             </w:r>
             <w:proofErr w:type="spellEnd"/>
           </w:p>
@@ -4288,8 +5560,17 @@
                 <w:sz w:val="20"/>
                 <w:szCs w:val="20"/>
               </w:rPr>
-              <w:t>Boolean — only one active assignment per asset</w:t>
-            </w:r>
+              <w:t xml:space="preserve">Must be after </w:t>
+            </w:r>
+            <w:proofErr w:type="spellStart"/>
+            <w:r>
+              <w:rPr>
+                <w:sz w:val="20"/>
+                <w:szCs w:val="20"/>
+              </w:rPr>
+              <w:t>purchase_date</w:t>
+            </w:r>
+            <w:proofErr w:type="spellEnd"/>
           </w:p>
         </w:tc>
       </w:tr>
@@ -4308,7 +5589,7 @@
       </w:r>
       <w:proofErr w:type="spellStart"/>
       <w:r>
-        <w:t>asset_procurements</w:t>
+        <w:t>asset_issues</w:t>
       </w:r>
       <w:proofErr w:type="spellEnd"/>
     </w:p>
@@ -4488,7 +5769,7 @@
                 <w:sz w:val="20"/>
                 <w:szCs w:val="20"/>
               </w:rPr>
-              <w:t>purchase_date</w:t>
+              <w:t>issue_description</w:t>
             </w:r>
             <w:proofErr w:type="spellEnd"/>
           </w:p>
@@ -4516,7 +5797,7 @@
                 <w:sz w:val="20"/>
                 <w:szCs w:val="20"/>
               </w:rPr>
-              <w:t>Date of purchase</w:t>
+              <w:t>Details of the issue</w:t>
             </w:r>
           </w:p>
         </w:tc>
@@ -4546,7 +5827,7 @@
                 <w:sz w:val="20"/>
                 <w:szCs w:val="20"/>
               </w:rPr>
-              <w:t>purchase_vendor</w:t>
+              <w:t>issue_status</w:t>
             </w:r>
             <w:proofErr w:type="spellEnd"/>
           </w:p>
@@ -4574,7 +5855,7 @@
                 <w:sz w:val="20"/>
                 <w:szCs w:val="20"/>
               </w:rPr>
-              <w:t>Supplier name</w:t>
+              <w:t>OPEN, IN_PROGRESS, RESOLVED</w:t>
             </w:r>
           </w:p>
         </w:tc>
@@ -4604,10 +5885,25 @@
                 <w:sz w:val="20"/>
                 <w:szCs w:val="20"/>
               </w:rPr>
-              <w:lastRenderedPageBreak/>
-              <w:t>purchase_cost</w:t>
+              <w:t>reported_at</w:t>
             </w:r>
             <w:proofErr w:type="spellEnd"/>
+            <w:r>
+              <w:rPr>
+                <w:sz w:val="20"/>
+                <w:szCs w:val="20"/>
+              </w:rPr>
+              <w:t xml:space="preserve">, </w:t>
+            </w:r>
+            <w:proofErr w:type="spellStart"/>
+            <w:r>
+              <w:rPr>
+                <w:sz w:val="20"/>
+                <w:szCs w:val="20"/>
+              </w:rPr>
+              <w:t>resolved_at</w:t>
+            </w:r>
+            <w:proofErr w:type="spellEnd"/>
           </w:p>
         </w:tc>
         <w:tc>
@@ -4633,7 +5929,7 @@
                 <w:sz w:val="20"/>
                 <w:szCs w:val="20"/>
               </w:rPr>
-              <w:t>Cannot be negative</w:t>
+              <w:t>Timeline tracking</w:t>
             </w:r>
           </w:p>
         </w:tc>
@@ -4657,15 +5953,13 @@
             </w:tcMar>
           </w:tcPr>
           <w:p>
-            <w:proofErr w:type="spellStart"/>
-            <w:r>
-              <w:rPr>
-                <w:sz w:val="20"/>
-                <w:szCs w:val="20"/>
-              </w:rPr>
-              <w:t>warranty_expiry_date</w:t>
-            </w:r>
-            <w:proofErr w:type="spellEnd"/>
+            <w:r>
+              <w:rPr>
+                <w:sz w:val="20"/>
+                <w:szCs w:val="20"/>
+              </w:rPr>
+              <w:t>note</w:t>
+            </w:r>
           </w:p>
         </w:tc>
         <w:tc>
@@ -4691,17 +5985,8 @@
                 <w:sz w:val="20"/>
                 <w:szCs w:val="20"/>
               </w:rPr>
-              <w:t xml:space="preserve">Must be after </w:t>
-            </w:r>
-            <w:proofErr w:type="spellStart"/>
-            <w:r>
-              <w:rPr>
-                <w:sz w:val="20"/>
-                <w:szCs w:val="20"/>
-              </w:rPr>
-              <w:t>purchase_date</w:t>
-            </w:r>
-            <w:proofErr w:type="spellEnd"/>
+              <w:t>Technician notes</w:t>
+            </w:r>
           </w:p>
         </w:tc>
       </w:tr>
@@ -4716,13 +6001,9 @@
         <w:pStyle w:val="Heading2"/>
       </w:pPr>
       <w:r>
-        <w:t xml:space="preserve">Table: </w:t>
-      </w:r>
-      <w:proofErr w:type="spellStart"/>
-      <w:r>
-        <w:t>asset_issues</w:t>
-      </w:r>
-      <w:proofErr w:type="spellEnd"/>
+        <w:lastRenderedPageBreak/>
+        <w:t>Table: users (New)</w:t>
+      </w:r>
     </w:p>
     <w:tbl>
       <w:tblPr>
@@ -4834,417 +6115,6 @@
                 <w:sz w:val="20"/>
                 <w:szCs w:val="20"/>
               </w:rPr>
-              <w:t xml:space="preserve">id, </w:t>
-            </w:r>
-            <w:proofErr w:type="spellStart"/>
-            <w:r>
-              <w:rPr>
-                <w:sz w:val="20"/>
-                <w:szCs w:val="20"/>
-              </w:rPr>
-              <w:t>asset_id</w:t>
-            </w:r>
-            <w:proofErr w:type="spellEnd"/>
-          </w:p>
-        </w:tc>
-        <w:tc>
-          <w:tcPr>
-            <w:tcW w:w="6560" w:type="dxa"/>
-            <w:tcBorders>
-              <w:top w:val="single" w:sz="1" w:space="0" w:color="CCCCCC"/>
-              <w:left w:val="single" w:sz="1" w:space="0" w:color="CCCCCC"/>
-              <w:bottom w:val="single" w:sz="1" w:space="0" w:color="CCCCCC"/>
-              <w:right w:val="single" w:sz="1" w:space="0" w:color="CCCCCC"/>
-            </w:tcBorders>
-            <w:shd w:val="clear" w:color="auto" w:fill="F0F4FA"/>
-            <w:tcMar>
-              <w:top w:w="80" w:type="dxa"/>
-              <w:left w:w="150" w:type="dxa"/>
-              <w:bottom w:w="80" w:type="dxa"/>
-              <w:right w:w="150" w:type="dxa"/>
-            </w:tcMar>
-          </w:tcPr>
-          <w:p>
-            <w:r>
-              <w:rPr>
-                <w:sz w:val="20"/>
-                <w:szCs w:val="20"/>
-              </w:rPr>
-              <w:t>FK to assets</w:t>
-            </w:r>
-          </w:p>
-        </w:tc>
-      </w:tr>
-      <w:tr>
-        <w:tc>
-          <w:tcPr>
-            <w:tcW w:w="2800" w:type="dxa"/>
-            <w:tcBorders>
-              <w:top w:val="single" w:sz="1" w:space="0" w:color="CCCCCC"/>
-              <w:left w:val="single" w:sz="1" w:space="0" w:color="CCCCCC"/>
-              <w:bottom w:val="single" w:sz="1" w:space="0" w:color="CCCCCC"/>
-              <w:right w:val="single" w:sz="1" w:space="0" w:color="CCCCCC"/>
-            </w:tcBorders>
-            <w:shd w:val="clear" w:color="auto" w:fill="FFFFFF"/>
-            <w:tcMar>
-              <w:top w:w="80" w:type="dxa"/>
-              <w:left w:w="150" w:type="dxa"/>
-              <w:bottom w:w="80" w:type="dxa"/>
-              <w:right w:w="150" w:type="dxa"/>
-            </w:tcMar>
-          </w:tcPr>
-          <w:p>
-            <w:proofErr w:type="spellStart"/>
-            <w:r>
-              <w:rPr>
-                <w:sz w:val="20"/>
-                <w:szCs w:val="20"/>
-              </w:rPr>
-              <w:t>issue_description</w:t>
-            </w:r>
-            <w:proofErr w:type="spellEnd"/>
-          </w:p>
-        </w:tc>
-        <w:tc>
-          <w:tcPr>
-            <w:tcW w:w="6560" w:type="dxa"/>
-            <w:tcBorders>
-              <w:top w:val="single" w:sz="1" w:space="0" w:color="CCCCCC"/>
-              <w:left w:val="single" w:sz="1" w:space="0" w:color="CCCCCC"/>
-              <w:bottom w:val="single" w:sz="1" w:space="0" w:color="CCCCCC"/>
-              <w:right w:val="single" w:sz="1" w:space="0" w:color="CCCCCC"/>
-            </w:tcBorders>
-            <w:shd w:val="clear" w:color="auto" w:fill="FFFFFF"/>
-            <w:tcMar>
-              <w:top w:w="80" w:type="dxa"/>
-              <w:left w:w="150" w:type="dxa"/>
-              <w:bottom w:w="80" w:type="dxa"/>
-              <w:right w:w="150" w:type="dxa"/>
-            </w:tcMar>
-          </w:tcPr>
-          <w:p>
-            <w:r>
-              <w:rPr>
-                <w:sz w:val="20"/>
-                <w:szCs w:val="20"/>
-              </w:rPr>
-              <w:t>Details of the issue</w:t>
-            </w:r>
-          </w:p>
-        </w:tc>
-      </w:tr>
-      <w:tr>
-        <w:tc>
-          <w:tcPr>
-            <w:tcW w:w="2800" w:type="dxa"/>
-            <w:tcBorders>
-              <w:top w:val="single" w:sz="1" w:space="0" w:color="CCCCCC"/>
-              <w:left w:val="single" w:sz="1" w:space="0" w:color="CCCCCC"/>
-              <w:bottom w:val="single" w:sz="1" w:space="0" w:color="CCCCCC"/>
-              <w:right w:val="single" w:sz="1" w:space="0" w:color="CCCCCC"/>
-            </w:tcBorders>
-            <w:shd w:val="clear" w:color="auto" w:fill="F0F4FA"/>
-            <w:tcMar>
-              <w:top w:w="80" w:type="dxa"/>
-              <w:left w:w="150" w:type="dxa"/>
-              <w:bottom w:w="80" w:type="dxa"/>
-              <w:right w:w="150" w:type="dxa"/>
-            </w:tcMar>
-          </w:tcPr>
-          <w:p>
-            <w:proofErr w:type="spellStart"/>
-            <w:r>
-              <w:rPr>
-                <w:sz w:val="20"/>
-                <w:szCs w:val="20"/>
-              </w:rPr>
-              <w:t>issue_status</w:t>
-            </w:r>
-            <w:proofErr w:type="spellEnd"/>
-          </w:p>
-        </w:tc>
-        <w:tc>
-          <w:tcPr>
-            <w:tcW w:w="6560" w:type="dxa"/>
-            <w:tcBorders>
-              <w:top w:val="single" w:sz="1" w:space="0" w:color="CCCCCC"/>
-              <w:left w:val="single" w:sz="1" w:space="0" w:color="CCCCCC"/>
-              <w:bottom w:val="single" w:sz="1" w:space="0" w:color="CCCCCC"/>
-              <w:right w:val="single" w:sz="1" w:space="0" w:color="CCCCCC"/>
-            </w:tcBorders>
-            <w:shd w:val="clear" w:color="auto" w:fill="F0F4FA"/>
-            <w:tcMar>
-              <w:top w:w="80" w:type="dxa"/>
-              <w:left w:w="150" w:type="dxa"/>
-              <w:bottom w:w="80" w:type="dxa"/>
-              <w:right w:w="150" w:type="dxa"/>
-            </w:tcMar>
-          </w:tcPr>
-          <w:p>
-            <w:r>
-              <w:rPr>
-                <w:sz w:val="20"/>
-                <w:szCs w:val="20"/>
-              </w:rPr>
-              <w:t>OPEN, IN_PROGRESS, RESOLVED</w:t>
-            </w:r>
-          </w:p>
-        </w:tc>
-      </w:tr>
-      <w:tr>
-        <w:tc>
-          <w:tcPr>
-            <w:tcW w:w="2800" w:type="dxa"/>
-            <w:tcBorders>
-              <w:top w:val="single" w:sz="1" w:space="0" w:color="CCCCCC"/>
-              <w:left w:val="single" w:sz="1" w:space="0" w:color="CCCCCC"/>
-              <w:bottom w:val="single" w:sz="1" w:space="0" w:color="CCCCCC"/>
-              <w:right w:val="single" w:sz="1" w:space="0" w:color="CCCCCC"/>
-            </w:tcBorders>
-            <w:shd w:val="clear" w:color="auto" w:fill="FFFFFF"/>
-            <w:tcMar>
-              <w:top w:w="80" w:type="dxa"/>
-              <w:left w:w="150" w:type="dxa"/>
-              <w:bottom w:w="80" w:type="dxa"/>
-              <w:right w:w="150" w:type="dxa"/>
-            </w:tcMar>
-          </w:tcPr>
-          <w:p>
-            <w:proofErr w:type="spellStart"/>
-            <w:r>
-              <w:rPr>
-                <w:sz w:val="20"/>
-                <w:szCs w:val="20"/>
-              </w:rPr>
-              <w:t>reported_at</w:t>
-            </w:r>
-            <w:proofErr w:type="spellEnd"/>
-            <w:r>
-              <w:rPr>
-                <w:sz w:val="20"/>
-                <w:szCs w:val="20"/>
-              </w:rPr>
-              <w:t xml:space="preserve">, </w:t>
-            </w:r>
-            <w:proofErr w:type="spellStart"/>
-            <w:r>
-              <w:rPr>
-                <w:sz w:val="20"/>
-                <w:szCs w:val="20"/>
-              </w:rPr>
-              <w:t>resolved_at</w:t>
-            </w:r>
-            <w:proofErr w:type="spellEnd"/>
-          </w:p>
-        </w:tc>
-        <w:tc>
-          <w:tcPr>
-            <w:tcW w:w="6560" w:type="dxa"/>
-            <w:tcBorders>
-              <w:top w:val="single" w:sz="1" w:space="0" w:color="CCCCCC"/>
-              <w:left w:val="single" w:sz="1" w:space="0" w:color="CCCCCC"/>
-              <w:bottom w:val="single" w:sz="1" w:space="0" w:color="CCCCCC"/>
-              <w:right w:val="single" w:sz="1" w:space="0" w:color="CCCCCC"/>
-            </w:tcBorders>
-            <w:shd w:val="clear" w:color="auto" w:fill="FFFFFF"/>
-            <w:tcMar>
-              <w:top w:w="80" w:type="dxa"/>
-              <w:left w:w="150" w:type="dxa"/>
-              <w:bottom w:w="80" w:type="dxa"/>
-              <w:right w:w="150" w:type="dxa"/>
-            </w:tcMar>
-          </w:tcPr>
-          <w:p>
-            <w:r>
-              <w:rPr>
-                <w:sz w:val="20"/>
-                <w:szCs w:val="20"/>
-              </w:rPr>
-              <w:t>Timeline tracking</w:t>
-            </w:r>
-          </w:p>
-        </w:tc>
-      </w:tr>
-      <w:tr>
-        <w:tc>
-          <w:tcPr>
-            <w:tcW w:w="2800" w:type="dxa"/>
-            <w:tcBorders>
-              <w:top w:val="single" w:sz="1" w:space="0" w:color="CCCCCC"/>
-              <w:left w:val="single" w:sz="1" w:space="0" w:color="CCCCCC"/>
-              <w:bottom w:val="single" w:sz="1" w:space="0" w:color="CCCCCC"/>
-              <w:right w:val="single" w:sz="1" w:space="0" w:color="CCCCCC"/>
-            </w:tcBorders>
-            <w:shd w:val="clear" w:color="auto" w:fill="F0F4FA"/>
-            <w:tcMar>
-              <w:top w:w="80" w:type="dxa"/>
-              <w:left w:w="150" w:type="dxa"/>
-              <w:bottom w:w="80" w:type="dxa"/>
-              <w:right w:w="150" w:type="dxa"/>
-            </w:tcMar>
-          </w:tcPr>
-          <w:p>
-            <w:r>
-              <w:rPr>
-                <w:sz w:val="20"/>
-                <w:szCs w:val="20"/>
-              </w:rPr>
-              <w:t>note</w:t>
-            </w:r>
-          </w:p>
-        </w:tc>
-        <w:tc>
-          <w:tcPr>
-            <w:tcW w:w="6560" w:type="dxa"/>
-            <w:tcBorders>
-              <w:top w:val="single" w:sz="1" w:space="0" w:color="CCCCCC"/>
-              <w:left w:val="single" w:sz="1" w:space="0" w:color="CCCCCC"/>
-              <w:bottom w:val="single" w:sz="1" w:space="0" w:color="CCCCCC"/>
-              <w:right w:val="single" w:sz="1" w:space="0" w:color="CCCCCC"/>
-            </w:tcBorders>
-            <w:shd w:val="clear" w:color="auto" w:fill="F0F4FA"/>
-            <w:tcMar>
-              <w:top w:w="80" w:type="dxa"/>
-              <w:left w:w="150" w:type="dxa"/>
-              <w:bottom w:w="80" w:type="dxa"/>
-              <w:right w:w="150" w:type="dxa"/>
-            </w:tcMar>
-          </w:tcPr>
-          <w:p>
-            <w:r>
-              <w:rPr>
-                <w:sz w:val="20"/>
-                <w:szCs w:val="20"/>
-              </w:rPr>
-              <w:t>Technician notes</w:t>
-            </w:r>
-          </w:p>
-        </w:tc>
-      </w:tr>
-    </w:tbl>
-    <w:p>
-      <w:pPr>
-        <w:spacing w:before="60" w:after="60"/>
-      </w:pPr>
-    </w:p>
-    <w:p>
-      <w:pPr>
-        <w:pStyle w:val="Heading2"/>
-      </w:pPr>
-      <w:r>
-        <w:t>Table: users (New)</w:t>
-      </w:r>
-    </w:p>
-    <w:tbl>
-      <w:tblPr>
-        <w:tblW w:w="9360" w:type="dxa"/>
-        <w:tblBorders>
-          <w:top w:val="single" w:sz="4" w:space="0" w:color="auto"/>
-          <w:left w:val="single" w:sz="4" w:space="0" w:color="auto"/>
-          <w:bottom w:val="single" w:sz="4" w:space="0" w:color="auto"/>
-          <w:right w:val="single" w:sz="4" w:space="0" w:color="auto"/>
-          <w:insideH w:val="single" w:sz="4" w:space="0" w:color="auto"/>
-          <w:insideV w:val="single" w:sz="4" w:space="0" w:color="auto"/>
-        </w:tblBorders>
-        <w:tblCellMar>
-          <w:left w:w="10" w:type="dxa"/>
-          <w:right w:w="10" w:type="dxa"/>
-        </w:tblCellMar>
-        <w:tblLook w:val="0000" w:firstRow="0" w:lastRow="0" w:firstColumn="0" w:lastColumn="0" w:noHBand="0" w:noVBand="0"/>
-      </w:tblPr>
-      <w:tblGrid>
-        <w:gridCol w:w="2800"/>
-        <w:gridCol w:w="6560"/>
-      </w:tblGrid>
-      <w:tr>
-        <w:trPr>
-          <w:tblHeader/>
-        </w:trPr>
-        <w:tc>
-          <w:tcPr>
-            <w:tcW w:w="2800" w:type="dxa"/>
-            <w:tcBorders>
-              <w:top w:val="single" w:sz="1" w:space="0" w:color="2563EB"/>
-              <w:left w:val="single" w:sz="1" w:space="0" w:color="2563EB"/>
-              <w:bottom w:val="single" w:sz="1" w:space="0" w:color="2563EB"/>
-              <w:right w:val="single" w:sz="1" w:space="0" w:color="2563EB"/>
-            </w:tcBorders>
-            <w:shd w:val="clear" w:color="auto" w:fill="1E3A5F"/>
-            <w:tcMar>
-              <w:top w:w="100" w:type="dxa"/>
-              <w:left w:w="150" w:type="dxa"/>
-              <w:bottom w:w="100" w:type="dxa"/>
-              <w:right w:w="150" w:type="dxa"/>
-            </w:tcMar>
-          </w:tcPr>
-          <w:p>
-            <w:r>
-              <w:rPr>
-                <w:b/>
-                <w:bCs/>
-                <w:color w:val="FFFFFF"/>
-                <w:sz w:val="20"/>
-                <w:szCs w:val="20"/>
-              </w:rPr>
-              <w:t>Column</w:t>
-            </w:r>
-          </w:p>
-        </w:tc>
-        <w:tc>
-          <w:tcPr>
-            <w:tcW w:w="6560" w:type="dxa"/>
-            <w:tcBorders>
-              <w:top w:val="single" w:sz="1" w:space="0" w:color="2563EB"/>
-              <w:left w:val="single" w:sz="1" w:space="0" w:color="2563EB"/>
-              <w:bottom w:val="single" w:sz="1" w:space="0" w:color="2563EB"/>
-              <w:right w:val="single" w:sz="1" w:space="0" w:color="2563EB"/>
-            </w:tcBorders>
-            <w:shd w:val="clear" w:color="auto" w:fill="1E3A5F"/>
-            <w:tcMar>
-              <w:top w:w="100" w:type="dxa"/>
-              <w:left w:w="150" w:type="dxa"/>
-              <w:bottom w:w="100" w:type="dxa"/>
-              <w:right w:w="150" w:type="dxa"/>
-            </w:tcMar>
-          </w:tcPr>
-          <w:p>
-            <w:r>
-              <w:rPr>
-                <w:b/>
-                <w:bCs/>
-                <w:color w:val="FFFFFF"/>
-                <w:sz w:val="20"/>
-                <w:szCs w:val="20"/>
-              </w:rPr>
-              <w:t>Notes</w:t>
-            </w:r>
-          </w:p>
-        </w:tc>
-      </w:tr>
-      <w:tr>
-        <w:tc>
-          <w:tcPr>
-            <w:tcW w:w="2800" w:type="dxa"/>
-            <w:tcBorders>
-              <w:top w:val="single" w:sz="1" w:space="0" w:color="CCCCCC"/>
-              <w:left w:val="single" w:sz="1" w:space="0" w:color="CCCCCC"/>
-              <w:bottom w:val="single" w:sz="1" w:space="0" w:color="CCCCCC"/>
-              <w:right w:val="single" w:sz="1" w:space="0" w:color="CCCCCC"/>
-            </w:tcBorders>
-            <w:shd w:val="clear" w:color="auto" w:fill="F0F4FA"/>
-            <w:tcMar>
-              <w:top w:w="80" w:type="dxa"/>
-              <w:left w:w="150" w:type="dxa"/>
-              <w:bottom w:w="80" w:type="dxa"/>
-              <w:right w:w="150" w:type="dxa"/>
-            </w:tcMar>
-          </w:tcPr>
-          <w:p>
-            <w:r>
-              <w:rPr>
-                <w:sz w:val="20"/>
-                <w:szCs w:val="20"/>
-              </w:rPr>
               <w:t>id</w:t>
             </w:r>
           </w:p>
@@ -5873,7 +6743,6 @@
         <w:pStyle w:val="Heading2"/>
       </w:pPr>
       <w:r>
-        <w:lastRenderedPageBreak/>
         <w:t>Assignment APIs</w:t>
       </w:r>
     </w:p>
@@ -5916,7 +6785,13 @@
       </w:r>
       <w:proofErr w:type="spellEnd"/>
       <w:r>
-        <w:t>/assignments/{id}/return — return asset (AUTH)</w:t>
+        <w:t xml:space="preserve">/assignments/{id}/return — return asset </w:t>
+      </w:r>
+      <w:r>
+        <w:t>change the statue (</w:t>
+      </w:r>
+      <w:r>
+        <w:t>AUTH)</w:t>
       </w:r>
     </w:p>
     <w:p>
@@ -5942,14 +6817,6 @@
     </w:p>
     <w:p>
       <w:pPr>
-        <w:pStyle w:val="Heading2"/>
-      </w:pPr>
-      <w:r>
-        <w:t>Procurement APIs</w:t>
-      </w:r>
-    </w:p>
-    <w:p>
-      <w:pPr>
         <w:pStyle w:val="ListParagraph"/>
         <w:numPr>
           <w:ilvl w:val="0"/>
@@ -5958,7 +6825,7 @@
         <w:spacing w:before="40" w:after="40"/>
       </w:pPr>
       <w:r>
-        <w:t>POST /</w:t>
+        <w:t>UPDATE /</w:t>
       </w:r>
       <w:proofErr w:type="spellStart"/>
       <w:r>
@@ -5966,7 +6833,23 @@
       </w:r>
       <w:proofErr w:type="spellEnd"/>
       <w:r>
-        <w:t>/assets/{id}/procurement — create (AUTH)</w:t>
+        <w:t xml:space="preserve">/assignment/{id} </w:t>
+      </w:r>
+      <w:r>
+        <w:t>—</w:t>
+      </w:r>
+      <w:r>
+        <w:t xml:space="preserve"> update the assignments</w:t>
+      </w:r>
+      <w:bookmarkStart w:id="0" w:name="_GoBack"/>
+      <w:bookmarkEnd w:id="0"/>
+    </w:p>
+    <w:p>
+      <w:pPr>
+        <w:pStyle w:val="Heading2"/>
+      </w:pPr>
+      <w:r>
+        <w:t>Procurement APIs</w:t>
       </w:r>
     </w:p>
     <w:p>
@@ -5979,7 +6862,7 @@
         <w:spacing w:before="40" w:after="40"/>
       </w:pPr>
       <w:r>
-        <w:t>PUT /</w:t>
+        <w:t>POST /</w:t>
       </w:r>
       <w:proofErr w:type="spellStart"/>
       <w:r>
@@ -5987,15 +6870,7 @@
       </w:r>
       <w:proofErr w:type="spellEnd"/>
       <w:r>
-        <w:t>/assets/{id}/procurement — update (AUTH)</w:t>
-      </w:r>
-    </w:p>
-    <w:p>
-      <w:pPr>
-        <w:pStyle w:val="Heading2"/>
-      </w:pPr>
-      <w:r>
-        <w:t>Issue APIs</w:t>
+        <w:t>/assets/{id}/procurement — create (AUTH)</w:t>
       </w:r>
     </w:p>
     <w:p>
@@ -6008,7 +6883,7 @@
         <w:spacing w:before="40" w:after="40"/>
       </w:pPr>
       <w:r>
-        <w:t>POST /</w:t>
+        <w:t>PUT /</w:t>
       </w:r>
       <w:proofErr w:type="spellStart"/>
       <w:r>
@@ -6016,7 +6891,15 @@
       </w:r>
       <w:proofErr w:type="spellEnd"/>
       <w:r>
-        <w:t>/assets/{id}/issues — report issue (AUTH)</w:t>
+        <w:t>/assets/{id}/procurement — update (AUTH)</w:t>
+      </w:r>
+    </w:p>
+    <w:p>
+      <w:pPr>
+        <w:pStyle w:val="Heading2"/>
+      </w:pPr>
+      <w:r>
+        <w:t>Issue APIs</w:t>
       </w:r>
     </w:p>
     <w:p>
@@ -6029,7 +6912,7 @@
         <w:spacing w:before="40" w:after="40"/>
       </w:pPr>
       <w:r>
-        <w:t>PUT /</w:t>
+        <w:t>POST /</w:t>
       </w:r>
       <w:proofErr w:type="spellStart"/>
       <w:r>
@@ -6037,7 +6920,7 @@
       </w:r>
       <w:proofErr w:type="spellEnd"/>
       <w:r>
-        <w:t>/issues/{id} — update issue (AUTH)</w:t>
+        <w:t>/assets/{id}/issues — report issue (AUTH)</w:t>
       </w:r>
     </w:p>
     <w:p>
@@ -6050,7 +6933,7 @@
         <w:spacing w:before="40" w:after="40"/>
       </w:pPr>
       <w:r>
-        <w:t>GET /</w:t>
+        <w:t>PUT /</w:t>
       </w:r>
       <w:proofErr w:type="spellStart"/>
       <w:r>
@@ -6058,15 +6941,7 @@
       </w:r>
       <w:proofErr w:type="spellEnd"/>
       <w:r>
-        <w:t>/assets/{id}/issues — view issues (AUTH)</w:t>
-      </w:r>
-    </w:p>
-    <w:p>
-      <w:pPr>
-        <w:pStyle w:val="Heading2"/>
-      </w:pPr>
-      <w:r>
-        <w:t>Report APIs (Public)</w:t>
+        <w:t>/issues/{id} — update issue (AUTH)</w:t>
       </w:r>
     </w:p>
     <w:p>
@@ -6079,6 +6954,36 @@
         <w:spacing w:before="40" w:after="40"/>
       </w:pPr>
       <w:r>
+        <w:t>GET /</w:t>
+      </w:r>
+      <w:proofErr w:type="spellStart"/>
+      <w:r>
+        <w:t>api</w:t>
+      </w:r>
+      <w:proofErr w:type="spellEnd"/>
+      <w:r>
+        <w:t>/assets/{id}/issues — view issues (AUTH)</w:t>
+      </w:r>
+    </w:p>
+    <w:p>
+      <w:pPr>
+        <w:pStyle w:val="Heading2"/>
+      </w:pPr>
+      <w:r>
+        <w:t>Report APIs (Public)</w:t>
+      </w:r>
+    </w:p>
+    <w:p>
+      <w:pPr>
+        <w:pStyle w:val="ListParagraph"/>
+        <w:numPr>
+          <w:ilvl w:val="0"/>
+          <w:numId w:val="2"/>
+        </w:numPr>
+        <w:spacing w:before="40" w:after="40"/>
+      </w:pPr>
+      <w:r>
+        <w:lastRenderedPageBreak/>
         <w:t>GET /</w:t>
       </w:r>
       <w:proofErr w:type="spellStart"/>
@@ -6708,7 +7613,6 @@
         <w:pStyle w:val="Heading2"/>
       </w:pPr>
       <w:r>
-        <w:lastRenderedPageBreak/>
         <w:t>Assignment Rules</w:t>
       </w:r>
     </w:p>
@@ -6977,11 +7881,6 @@
       <w:r>
         <w:t>Avoid in version 1: microservices, a workflow engine, and a very complex permission matrix.</w:t>
       </w:r>
-    </w:p>
-    <w:p>
-      <w:pPr>
-        <w:spacing w:before="60" w:after="60"/>
-      </w:pPr>
     </w:p>
     <w:p>
       <w:pPr>
@@ -7493,7 +8392,6 @@
                 <w:sz w:val="20"/>
                 <w:szCs w:val="20"/>
               </w:rPr>
-              <w:lastRenderedPageBreak/>
               <w:t>Spring Security + JWT</w:t>
             </w:r>
           </w:p>
@@ -7788,6 +8686,7 @@
         <w:spacing w:before="80" w:after="80"/>
       </w:pPr>
       <w:r>
+        <w:lastRenderedPageBreak/>
         <w:t>Authentication is handled via JWT-based Spring Security, with role-based access control separating public read-only views (dashboard, asset status) from protected management operations. The first release focuses on core asset lifecycle functions — asset registration, assignment, return, issue tracking, and reporting — while leaving room for future extensions as the process matures.</w:t>
       </w:r>
     </w:p>
@@ -7993,6 +8892,345 @@
 <file path=word/numbering.xml><?xml version="1.0" encoding="utf-8"?>
 <w:numbering xmlns:wpc="http://schemas.microsoft.com/office/word/2010/wordprocessingCanvas" xmlns:cx="http://schemas.microsoft.com/office/drawing/2014/chartex" xmlns:cx1="http://schemas.microsoft.com/office/drawing/2015/9/8/chartex" xmlns:cx2="http://schemas.microsoft.com/office/drawing/2015/10/21/chartex" xmlns:cx3="http://schemas.microsoft.com/office/drawing/2016/5/9/chartex" xmlns:cx4="http://schemas.microsoft.com/office/drawing/2016/5/10/chartex" xmlns:cx5="http://schemas.microsoft.com/office/drawing/2016/5/11/chartex" xmlns:cx6="http://schemas.microsoft.com/office/drawing/2016/5/12/chartex" xmlns:cx7="http://schemas.microsoft.com/office/drawing/2016/5/13/chartex" xmlns:cx8="http://schemas.microsoft.com/office/drawing/2016/5/14/chartex" xmlns:mc="http://schemas.openxmlformats.org/markup-compatibility/2006" xmlns:aink="http://schemas.microsoft.com/office/drawing/2016/ink" xmlns:am3d="http://schemas.microsoft.com/office/drawing/2017/model3d" xmlns:o="urn:schemas-microsoft-com:office:office" xmlns:r="http://schemas.openxmlformats.org/officeDocument/2006/relationships" xmlns:m="http://schemas.openxmlformats.org/officeDocument/2006/math" xmlns:v="urn:schemas-microsoft-com:vml" xmlns:wp14="http://schemas.microsoft.com/office/word/2010/wordprocessingDrawing" xmlns:wp="http://schemas.openxmlformats.org/drawingml/2006/wordprocessingDrawing" xmlns:w10="urn:schemas-microsoft-com:office:word" xmlns:w="http://schemas.openxmlformats.org/wordprocessingml/2006/main" xmlns:w14="http://schemas.microsoft.com/office/word/2010/wordml" xmlns:w15="http://schemas.microsoft.com/office/word/2012/wordml" xmlns:w16cid="http://schemas.microsoft.com/office/word/2016/wordml/cid" xmlns:w16se="http://schemas.microsoft.com/office/word/2015/wordml/symex" xmlns:wpg="http://schemas.microsoft.com/office/word/2010/wordprocessingGroup" xmlns:wpi="http://schemas.microsoft.com/office/word/2010/wordprocessingInk" xmlns:wne="http://schemas.microsoft.com/office/word/2006/wordml" xmlns:wps="http://schemas.microsoft.com/office/word/2010/wordprocessingShape" mc:Ignorable="w14 w15 w16se w16cid wp14">
   <w:abstractNum w:abstractNumId="0" w15:restartNumberingAfterBreak="0">
+    <w:nsid w:val="26C474BB"/>
+    <w:multiLevelType w:val="hybridMultilevel"/>
+    <w:tmpl w:val="3FD89FDA"/>
+    <w:lvl w:ilvl="0" w:tplc="08090001">
+      <w:start w:val="1"/>
+      <w:numFmt w:val="bullet"/>
+      <w:lvlText w:val=""/>
+      <w:lvlJc w:val="left"/>
+      <w:pPr>
+        <w:ind w:left="720" w:hanging="360"/>
+      </w:pPr>
+      <w:rPr>
+        <w:rFonts w:ascii="Symbol" w:hAnsi="Symbol" w:hint="default"/>
+      </w:rPr>
+    </w:lvl>
+    <w:lvl w:ilvl="1" w:tplc="08090003" w:tentative="1">
+      <w:start w:val="1"/>
+      <w:numFmt w:val="bullet"/>
+      <w:lvlText w:val="o"/>
+      <w:lvlJc w:val="left"/>
+      <w:pPr>
+        <w:ind w:left="1440" w:hanging="360"/>
+      </w:pPr>
+      <w:rPr>
+        <w:rFonts w:ascii="Courier New" w:hAnsi="Courier New" w:cs="Courier New" w:hint="default"/>
+      </w:rPr>
+    </w:lvl>
+    <w:lvl w:ilvl="2" w:tplc="08090005" w:tentative="1">
+      <w:start w:val="1"/>
+      <w:numFmt w:val="bullet"/>
+      <w:lvlText w:val=""/>
+      <w:lvlJc w:val="left"/>
+      <w:pPr>
+        <w:ind w:left="2160" w:hanging="360"/>
+      </w:pPr>
+      <w:rPr>
+        <w:rFonts w:ascii="Wingdings" w:hAnsi="Wingdings" w:hint="default"/>
+      </w:rPr>
+    </w:lvl>
+    <w:lvl w:ilvl="3" w:tplc="08090001" w:tentative="1">
+      <w:start w:val="1"/>
+      <w:numFmt w:val="bullet"/>
+      <w:lvlText w:val=""/>
+      <w:lvlJc w:val="left"/>
+      <w:pPr>
+        <w:ind w:left="2880" w:hanging="360"/>
+      </w:pPr>
+      <w:rPr>
+        <w:rFonts w:ascii="Symbol" w:hAnsi="Symbol" w:hint="default"/>
+      </w:rPr>
+    </w:lvl>
+    <w:lvl w:ilvl="4" w:tplc="08090003" w:tentative="1">
+      <w:start w:val="1"/>
+      <w:numFmt w:val="bullet"/>
+      <w:lvlText w:val="o"/>
+      <w:lvlJc w:val="left"/>
+      <w:pPr>
+        <w:ind w:left="3600" w:hanging="360"/>
+      </w:pPr>
+      <w:rPr>
+        <w:rFonts w:ascii="Courier New" w:hAnsi="Courier New" w:cs="Courier New" w:hint="default"/>
+      </w:rPr>
+    </w:lvl>
+    <w:lvl w:ilvl="5" w:tplc="08090005" w:tentative="1">
+      <w:start w:val="1"/>
+      <w:numFmt w:val="bullet"/>
+      <w:lvlText w:val=""/>
+      <w:lvlJc w:val="left"/>
+      <w:pPr>
+        <w:ind w:left="4320" w:hanging="360"/>
+      </w:pPr>
+      <w:rPr>
+        <w:rFonts w:ascii="Wingdings" w:hAnsi="Wingdings" w:hint="default"/>
+      </w:rPr>
+    </w:lvl>
+    <w:lvl w:ilvl="6" w:tplc="08090001" w:tentative="1">
+      <w:start w:val="1"/>
+      <w:numFmt w:val="bullet"/>
+      <w:lvlText w:val=""/>
+      <w:lvlJc w:val="left"/>
+      <w:pPr>
+        <w:ind w:left="5040" w:hanging="360"/>
+      </w:pPr>
+      <w:rPr>
+        <w:rFonts w:ascii="Symbol" w:hAnsi="Symbol" w:hint="default"/>
+      </w:rPr>
+    </w:lvl>
+    <w:lvl w:ilvl="7" w:tplc="08090003" w:tentative="1">
+      <w:start w:val="1"/>
+      <w:numFmt w:val="bullet"/>
+      <w:lvlText w:val="o"/>
+      <w:lvlJc w:val="left"/>
+      <w:pPr>
+        <w:ind w:left="5760" w:hanging="360"/>
+      </w:pPr>
+      <w:rPr>
+        <w:rFonts w:ascii="Courier New" w:hAnsi="Courier New" w:cs="Courier New" w:hint="default"/>
+      </w:rPr>
+    </w:lvl>
+    <w:lvl w:ilvl="8" w:tplc="08090005" w:tentative="1">
+      <w:start w:val="1"/>
+      <w:numFmt w:val="bullet"/>
+      <w:lvlText w:val=""/>
+      <w:lvlJc w:val="left"/>
+      <w:pPr>
+        <w:ind w:left="6480" w:hanging="360"/>
+      </w:pPr>
+      <w:rPr>
+        <w:rFonts w:ascii="Wingdings" w:hAnsi="Wingdings" w:hint="default"/>
+      </w:rPr>
+    </w:lvl>
+  </w:abstractNum>
+  <w:abstractNum w:abstractNumId="1" w15:restartNumberingAfterBreak="0">
+    <w:nsid w:val="48360EEC"/>
+    <w:multiLevelType w:val="hybridMultilevel"/>
+    <w:tmpl w:val="6BF02FA0"/>
+    <w:lvl w:ilvl="0" w:tplc="08090001">
+      <w:start w:val="1"/>
+      <w:numFmt w:val="bullet"/>
+      <w:lvlText w:val=""/>
+      <w:lvlJc w:val="left"/>
+      <w:pPr>
+        <w:ind w:left="720" w:hanging="360"/>
+      </w:pPr>
+      <w:rPr>
+        <w:rFonts w:ascii="Symbol" w:hAnsi="Symbol" w:hint="default"/>
+      </w:rPr>
+    </w:lvl>
+    <w:lvl w:ilvl="1" w:tplc="08090003" w:tentative="1">
+      <w:start w:val="1"/>
+      <w:numFmt w:val="bullet"/>
+      <w:lvlText w:val="o"/>
+      <w:lvlJc w:val="left"/>
+      <w:pPr>
+        <w:ind w:left="1440" w:hanging="360"/>
+      </w:pPr>
+      <w:rPr>
+        <w:rFonts w:ascii="Courier New" w:hAnsi="Courier New" w:cs="Courier New" w:hint="default"/>
+      </w:rPr>
+    </w:lvl>
+    <w:lvl w:ilvl="2" w:tplc="08090005" w:tentative="1">
+      <w:start w:val="1"/>
+      <w:numFmt w:val="bullet"/>
+      <w:lvlText w:val=""/>
+      <w:lvlJc w:val="left"/>
+      <w:pPr>
+        <w:ind w:left="2160" w:hanging="360"/>
+      </w:pPr>
+      <w:rPr>
+        <w:rFonts w:ascii="Wingdings" w:hAnsi="Wingdings" w:hint="default"/>
+      </w:rPr>
+    </w:lvl>
+    <w:lvl w:ilvl="3" w:tplc="08090001" w:tentative="1">
+      <w:start w:val="1"/>
+      <w:numFmt w:val="bullet"/>
+      <w:lvlText w:val=""/>
+      <w:lvlJc w:val="left"/>
+      <w:pPr>
+        <w:ind w:left="2880" w:hanging="360"/>
+      </w:pPr>
+      <w:rPr>
+        <w:rFonts w:ascii="Symbol" w:hAnsi="Symbol" w:hint="default"/>
+      </w:rPr>
+    </w:lvl>
+    <w:lvl w:ilvl="4" w:tplc="08090003" w:tentative="1">
+      <w:start w:val="1"/>
+      <w:numFmt w:val="bullet"/>
+      <w:lvlText w:val="o"/>
+      <w:lvlJc w:val="left"/>
+      <w:pPr>
+        <w:ind w:left="3600" w:hanging="360"/>
+      </w:pPr>
+      <w:rPr>
+        <w:rFonts w:ascii="Courier New" w:hAnsi="Courier New" w:cs="Courier New" w:hint="default"/>
+      </w:rPr>
+    </w:lvl>
+    <w:lvl w:ilvl="5" w:tplc="08090005" w:tentative="1">
+      <w:start w:val="1"/>
+      <w:numFmt w:val="bullet"/>
+      <w:lvlText w:val=""/>
+      <w:lvlJc w:val="left"/>
+      <w:pPr>
+        <w:ind w:left="4320" w:hanging="360"/>
+      </w:pPr>
+      <w:rPr>
+        <w:rFonts w:ascii="Wingdings" w:hAnsi="Wingdings" w:hint="default"/>
+      </w:rPr>
+    </w:lvl>
+    <w:lvl w:ilvl="6" w:tplc="08090001" w:tentative="1">
+      <w:start w:val="1"/>
+      <w:numFmt w:val="bullet"/>
+      <w:lvlText w:val=""/>
+      <w:lvlJc w:val="left"/>
+      <w:pPr>
+        <w:ind w:left="5040" w:hanging="360"/>
+      </w:pPr>
+      <w:rPr>
+        <w:rFonts w:ascii="Symbol" w:hAnsi="Symbol" w:hint="default"/>
+      </w:rPr>
+    </w:lvl>
+    <w:lvl w:ilvl="7" w:tplc="08090003" w:tentative="1">
+      <w:start w:val="1"/>
+      <w:numFmt w:val="bullet"/>
+      <w:lvlText w:val="o"/>
+      <w:lvlJc w:val="left"/>
+      <w:pPr>
+        <w:ind w:left="5760" w:hanging="360"/>
+      </w:pPr>
+      <w:rPr>
+        <w:rFonts w:ascii="Courier New" w:hAnsi="Courier New" w:cs="Courier New" w:hint="default"/>
+      </w:rPr>
+    </w:lvl>
+    <w:lvl w:ilvl="8" w:tplc="08090005" w:tentative="1">
+      <w:start w:val="1"/>
+      <w:numFmt w:val="bullet"/>
+      <w:lvlText w:val=""/>
+      <w:lvlJc w:val="left"/>
+      <w:pPr>
+        <w:ind w:left="6480" w:hanging="360"/>
+      </w:pPr>
+      <w:rPr>
+        <w:rFonts w:ascii="Wingdings" w:hAnsi="Wingdings" w:hint="default"/>
+      </w:rPr>
+    </w:lvl>
+  </w:abstractNum>
+  <w:abstractNum w:abstractNumId="2" w15:restartNumberingAfterBreak="0">
+    <w:nsid w:val="4DFE60A9"/>
+    <w:multiLevelType w:val="hybridMultilevel"/>
+    <w:tmpl w:val="DE9A790E"/>
+    <w:lvl w:ilvl="0" w:tplc="08090001">
+      <w:start w:val="1"/>
+      <w:numFmt w:val="bullet"/>
+      <w:lvlText w:val=""/>
+      <w:lvlJc w:val="left"/>
+      <w:pPr>
+        <w:ind w:left="900" w:hanging="360"/>
+      </w:pPr>
+      <w:rPr>
+        <w:rFonts w:ascii="Symbol" w:hAnsi="Symbol" w:hint="default"/>
+      </w:rPr>
+    </w:lvl>
+    <w:lvl w:ilvl="1" w:tplc="08090003" w:tentative="1">
+      <w:start w:val="1"/>
+      <w:numFmt w:val="bullet"/>
+      <w:lvlText w:val="o"/>
+      <w:lvlJc w:val="left"/>
+      <w:pPr>
+        <w:ind w:left="1620" w:hanging="360"/>
+      </w:pPr>
+      <w:rPr>
+        <w:rFonts w:ascii="Courier New" w:hAnsi="Courier New" w:cs="Courier New" w:hint="default"/>
+      </w:rPr>
+    </w:lvl>
+    <w:lvl w:ilvl="2" w:tplc="08090005" w:tentative="1">
+      <w:start w:val="1"/>
+      <w:numFmt w:val="bullet"/>
+      <w:lvlText w:val=""/>
+      <w:lvlJc w:val="left"/>
+      <w:pPr>
+        <w:ind w:left="2340" w:hanging="360"/>
+      </w:pPr>
+      <w:rPr>
+        <w:rFonts w:ascii="Wingdings" w:hAnsi="Wingdings" w:hint="default"/>
+      </w:rPr>
+    </w:lvl>
+    <w:lvl w:ilvl="3" w:tplc="08090001" w:tentative="1">
+      <w:start w:val="1"/>
+      <w:numFmt w:val="bullet"/>
+      <w:lvlText w:val=""/>
+      <w:lvlJc w:val="left"/>
+      <w:pPr>
+        <w:ind w:left="3060" w:hanging="360"/>
+      </w:pPr>
+      <w:rPr>
+        <w:rFonts w:ascii="Symbol" w:hAnsi="Symbol" w:hint="default"/>
+      </w:rPr>
+    </w:lvl>
+    <w:lvl w:ilvl="4" w:tplc="08090003" w:tentative="1">
+      <w:start w:val="1"/>
+      <w:numFmt w:val="bullet"/>
+      <w:lvlText w:val="o"/>
+      <w:lvlJc w:val="left"/>
+      <w:pPr>
+        <w:ind w:left="3780" w:hanging="360"/>
+      </w:pPr>
+      <w:rPr>
+        <w:rFonts w:ascii="Courier New" w:hAnsi="Courier New" w:cs="Courier New" w:hint="default"/>
+      </w:rPr>
+    </w:lvl>
+    <w:lvl w:ilvl="5" w:tplc="08090005" w:tentative="1">
+      <w:start w:val="1"/>
+      <w:numFmt w:val="bullet"/>
+      <w:lvlText w:val=""/>
+      <w:lvlJc w:val="left"/>
+      <w:pPr>
+        <w:ind w:left="4500" w:hanging="360"/>
+      </w:pPr>
+      <w:rPr>
+        <w:rFonts w:ascii="Wingdings" w:hAnsi="Wingdings" w:hint="default"/>
+      </w:rPr>
+    </w:lvl>
+    <w:lvl w:ilvl="6" w:tplc="08090001" w:tentative="1">
+      <w:start w:val="1"/>
+      <w:numFmt w:val="bullet"/>
+      <w:lvlText w:val=""/>
+      <w:lvlJc w:val="left"/>
+      <w:pPr>
+        <w:ind w:left="5220" w:hanging="360"/>
+      </w:pPr>
+      <w:rPr>
+        <w:rFonts w:ascii="Symbol" w:hAnsi="Symbol" w:hint="default"/>
+      </w:rPr>
+    </w:lvl>
+    <w:lvl w:ilvl="7" w:tplc="08090003" w:tentative="1">
+      <w:start w:val="1"/>
+      <w:numFmt w:val="bullet"/>
+      <w:lvlText w:val="o"/>
+      <w:lvlJc w:val="left"/>
+      <w:pPr>
+        <w:ind w:left="5940" w:hanging="360"/>
+      </w:pPr>
+      <w:rPr>
+        <w:rFonts w:ascii="Courier New" w:hAnsi="Courier New" w:cs="Courier New" w:hint="default"/>
+      </w:rPr>
+    </w:lvl>
+    <w:lvl w:ilvl="8" w:tplc="08090005" w:tentative="1">
+      <w:start w:val="1"/>
+      <w:numFmt w:val="bullet"/>
+      <w:lvlText w:val=""/>
+      <w:lvlJc w:val="left"/>
+      <w:pPr>
+        <w:ind w:left="6660" w:hanging="360"/>
+      </w:pPr>
+      <w:rPr>
+        <w:rFonts w:ascii="Wingdings" w:hAnsi="Wingdings" w:hint="default"/>
+      </w:rPr>
+    </w:lvl>
+  </w:abstractNum>
+  <w:abstractNum w:abstractNumId="3" w15:restartNumberingAfterBreak="0">
     <w:nsid w:val="5A541A43"/>
     <w:multiLevelType w:val="hybridMultilevel"/>
     <w:tmpl w:val="6CC05AF0"/>
@@ -8078,7 +9316,7 @@
       </w:pPr>
     </w:lvl>
   </w:abstractNum>
-  <w:abstractNum w:abstractNumId="1" w15:restartNumberingAfterBreak="0">
+  <w:abstractNum w:abstractNumId="4" w15:restartNumberingAfterBreak="0">
     <w:nsid w:val="7FD721C9"/>
     <w:multiLevelType w:val="hybridMultilevel"/>
     <w:tmpl w:val="B21EBA76"/>
@@ -8133,16 +9371,25 @@
     </w:lvl>
   </w:abstractNum>
   <w:num w:numId="1">
-    <w:abstractNumId w:val="0"/>
+    <w:abstractNumId w:val="3"/>
     <w:lvlOverride w:ilvl="0">
       <w:startOverride w:val="1"/>
     </w:lvlOverride>
   </w:num>
   <w:num w:numId="2">
-    <w:abstractNumId w:val="1"/>
+    <w:abstractNumId w:val="4"/>
     <w:lvlOverride w:ilvl="0">
       <w:startOverride w:val="1"/>
     </w:lvlOverride>
+  </w:num>
+  <w:num w:numId="3">
+    <w:abstractNumId w:val="0"/>
+  </w:num>
+  <w:num w:numId="4">
+    <w:abstractNumId w:val="1"/>
+  </w:num>
+  <w:num w:numId="5">
+    <w:abstractNumId w:val="2"/>
   </w:num>
 </w:numbering>
 </file>
@@ -8772,6 +10019,36 @@
       <w:szCs w:val="36"/>
     </w:rPr>
   </w:style>
+  <w:style w:type="paragraph" w:customStyle="1" w:styleId="Default">
+    <w:name w:val="Default"/>
+    <w:rsid w:val="00D94589"/>
+    <w:pPr>
+      <w:autoSpaceDE w:val="0"/>
+      <w:autoSpaceDN w:val="0"/>
+      <w:adjustRightInd w:val="0"/>
+    </w:pPr>
+    <w:rPr>
+      <w:rFonts w:ascii="Times New Roman" w:hAnsi="Times New Roman" w:cs="Times New Roman"/>
+      <w:color w:val="000000"/>
+      <w:sz w:val="24"/>
+      <w:szCs w:val="24"/>
+    </w:rPr>
+  </w:style>
+  <w:style w:type="paragraph" w:styleId="NormalWeb">
+    <w:name w:val="Normal (Web)"/>
+    <w:basedOn w:val="Normal"/>
+    <w:uiPriority w:val="99"/>
+    <w:unhideWhenUsed/>
+    <w:rsid w:val="00EC33C3"/>
+    <w:pPr>
+      <w:spacing w:before="100" w:beforeAutospacing="1" w:after="100" w:afterAutospacing="1"/>
+    </w:pPr>
+    <w:rPr>
+      <w:rFonts w:ascii="Times New Roman" w:eastAsia="Times New Roman" w:hAnsi="Times New Roman" w:cs="Times New Roman"/>
+      <w:sz w:val="24"/>
+      <w:szCs w:val="24"/>
+    </w:rPr>
+  </w:style>
 </w:styles>
 </file>
 

</xml_diff>

<commit_message>
docs: update the document
</commit_message>
<xml_diff>
--- a/document/TID_Asset_Management_Project_Perspective.docx
+++ b/document/TID_Asset_Management_Project_Perspective.docx
@@ -2273,7 +2273,7 @@
               <w:bottom w:val="single" w:sz="1" w:space="0" w:color="CCCCCC"/>
               <w:right w:val="single" w:sz="1" w:space="0" w:color="CCCCCC"/>
             </w:tcBorders>
-            <w:shd w:val="clear" w:color="auto" w:fill="F0F4FA"/>
+            <w:shd w:val="clear" w:color="auto" w:fill="F2F2F2" w:themeFill="background1" w:themeFillShade="F2"/>
             <w:tcMar>
               <w:top w:w="80" w:type="dxa"/>
               <w:left w:w="150" w:type="dxa"/>
@@ -2306,7 +2306,7 @@
               <w:bottom w:val="single" w:sz="1" w:space="0" w:color="CCCCCC"/>
               <w:right w:val="single" w:sz="1" w:space="0" w:color="CCCCCC"/>
             </w:tcBorders>
-            <w:shd w:val="clear" w:color="auto" w:fill="F0F4FA"/>
+            <w:shd w:val="clear" w:color="auto" w:fill="F2F2F2" w:themeFill="background1" w:themeFillShade="F2"/>
             <w:tcMar>
               <w:top w:w="80" w:type="dxa"/>
               <w:left w:w="150" w:type="dxa"/>
@@ -2339,7 +2339,7 @@
               <w:bottom w:val="single" w:sz="1" w:space="0" w:color="CCCCCC"/>
               <w:right w:val="single" w:sz="1" w:space="0" w:color="CCCCCC"/>
             </w:tcBorders>
-            <w:shd w:val="clear" w:color="auto" w:fill="F0F4FA"/>
+            <w:shd w:val="clear" w:color="auto" w:fill="F2F2F2" w:themeFill="background1" w:themeFillShade="F2"/>
             <w:tcMar>
               <w:top w:w="80" w:type="dxa"/>
               <w:left w:w="150" w:type="dxa"/>
@@ -2374,7 +2374,7 @@
               <w:bottom w:val="single" w:sz="1" w:space="0" w:color="CCCCCC"/>
               <w:right w:val="single" w:sz="1" w:space="0" w:color="CCCCCC"/>
             </w:tcBorders>
-            <w:shd w:val="clear" w:color="auto" w:fill="FFFFFF"/>
+            <w:shd w:val="clear" w:color="auto" w:fill="F2F2F2" w:themeFill="background1" w:themeFillShade="F2"/>
             <w:tcMar>
               <w:top w:w="80" w:type="dxa"/>
               <w:left w:w="150" w:type="dxa"/>
@@ -2409,7 +2409,7 @@
               <w:bottom w:val="single" w:sz="1" w:space="0" w:color="CCCCCC"/>
               <w:right w:val="single" w:sz="1" w:space="0" w:color="CCCCCC"/>
             </w:tcBorders>
-            <w:shd w:val="clear" w:color="auto" w:fill="FFFFFF"/>
+            <w:shd w:val="clear" w:color="auto" w:fill="F2F2F2" w:themeFill="background1" w:themeFillShade="F2"/>
             <w:tcMar>
               <w:top w:w="80" w:type="dxa"/>
               <w:left w:w="150" w:type="dxa"/>
@@ -2442,7 +2442,7 @@
               <w:bottom w:val="single" w:sz="1" w:space="0" w:color="CCCCCC"/>
               <w:right w:val="single" w:sz="1" w:space="0" w:color="CCCCCC"/>
             </w:tcBorders>
-            <w:shd w:val="clear" w:color="auto" w:fill="FFFFFF"/>
+            <w:shd w:val="clear" w:color="auto" w:fill="F2F2F2" w:themeFill="background1" w:themeFillShade="F2"/>
             <w:tcMar>
               <w:top w:w="80" w:type="dxa"/>
               <w:left w:w="150" w:type="dxa"/>
@@ -2477,7 +2477,7 @@
               <w:bottom w:val="single" w:sz="1" w:space="0" w:color="CCCCCC"/>
               <w:right w:val="single" w:sz="1" w:space="0" w:color="CCCCCC"/>
             </w:tcBorders>
-            <w:shd w:val="clear" w:color="auto" w:fill="F0F4FA"/>
+            <w:shd w:val="clear" w:color="auto" w:fill="F2F2F2" w:themeFill="background1" w:themeFillShade="F2"/>
             <w:tcMar>
               <w:top w:w="80" w:type="dxa"/>
               <w:left w:w="150" w:type="dxa"/>
@@ -2512,7 +2512,7 @@
               <w:bottom w:val="single" w:sz="1" w:space="0" w:color="CCCCCC"/>
               <w:right w:val="single" w:sz="1" w:space="0" w:color="CCCCCC"/>
             </w:tcBorders>
-            <w:shd w:val="clear" w:color="auto" w:fill="F0F4FA"/>
+            <w:shd w:val="clear" w:color="auto" w:fill="F2F2F2" w:themeFill="background1" w:themeFillShade="F2"/>
             <w:tcMar>
               <w:top w:w="80" w:type="dxa"/>
               <w:left w:w="150" w:type="dxa"/>
@@ -2545,7 +2545,7 @@
               <w:bottom w:val="single" w:sz="1" w:space="0" w:color="CCCCCC"/>
               <w:right w:val="single" w:sz="1" w:space="0" w:color="CCCCCC"/>
             </w:tcBorders>
-            <w:shd w:val="clear" w:color="auto" w:fill="F0F4FA"/>
+            <w:shd w:val="clear" w:color="auto" w:fill="F2F2F2" w:themeFill="background1" w:themeFillShade="F2"/>
             <w:tcMar>
               <w:top w:w="80" w:type="dxa"/>
               <w:left w:w="150" w:type="dxa"/>
@@ -2580,7 +2580,7 @@
               <w:bottom w:val="single" w:sz="1" w:space="0" w:color="CCCCCC"/>
               <w:right w:val="single" w:sz="1" w:space="0" w:color="CCCCCC"/>
             </w:tcBorders>
-            <w:shd w:val="clear" w:color="auto" w:fill="FFFFFF"/>
+            <w:shd w:val="clear" w:color="auto" w:fill="F2F2F2" w:themeFill="background1" w:themeFillShade="F2"/>
             <w:tcMar>
               <w:top w:w="80" w:type="dxa"/>
               <w:left w:w="150" w:type="dxa"/>
@@ -2615,7 +2615,7 @@
               <w:bottom w:val="single" w:sz="1" w:space="0" w:color="CCCCCC"/>
               <w:right w:val="single" w:sz="1" w:space="0" w:color="CCCCCC"/>
             </w:tcBorders>
-            <w:shd w:val="clear" w:color="auto" w:fill="FFFFFF"/>
+            <w:shd w:val="clear" w:color="auto" w:fill="F2F2F2" w:themeFill="background1" w:themeFillShade="F2"/>
             <w:tcMar>
               <w:top w:w="80" w:type="dxa"/>
               <w:left w:w="150" w:type="dxa"/>
@@ -2648,7 +2648,7 @@
               <w:bottom w:val="single" w:sz="1" w:space="0" w:color="CCCCCC"/>
               <w:right w:val="single" w:sz="1" w:space="0" w:color="CCCCCC"/>
             </w:tcBorders>
-            <w:shd w:val="clear" w:color="auto" w:fill="FFFFFF"/>
+            <w:shd w:val="clear" w:color="auto" w:fill="F2F2F2" w:themeFill="background1" w:themeFillShade="F2"/>
             <w:tcMar>
               <w:top w:w="80" w:type="dxa"/>
               <w:left w:w="150" w:type="dxa"/>
@@ -2683,7 +2683,7 @@
               <w:bottom w:val="single" w:sz="1" w:space="0" w:color="CCCCCC"/>
               <w:right w:val="single" w:sz="1" w:space="0" w:color="CCCCCC"/>
             </w:tcBorders>
-            <w:shd w:val="clear" w:color="auto" w:fill="F0F4FA"/>
+            <w:shd w:val="clear" w:color="auto" w:fill="F2F2F2" w:themeFill="background1" w:themeFillShade="F2"/>
             <w:tcMar>
               <w:top w:w="80" w:type="dxa"/>
               <w:left w:w="150" w:type="dxa"/>
@@ -2718,7 +2718,7 @@
               <w:bottom w:val="single" w:sz="1" w:space="0" w:color="CCCCCC"/>
               <w:right w:val="single" w:sz="1" w:space="0" w:color="CCCCCC"/>
             </w:tcBorders>
-            <w:shd w:val="clear" w:color="auto" w:fill="F0F4FA"/>
+            <w:shd w:val="clear" w:color="auto" w:fill="F2F2F2" w:themeFill="background1" w:themeFillShade="F2"/>
             <w:tcMar>
               <w:top w:w="80" w:type="dxa"/>
               <w:left w:w="150" w:type="dxa"/>
@@ -2749,7 +2749,7 @@
               <w:bottom w:val="single" w:sz="1" w:space="0" w:color="CCCCCC"/>
               <w:right w:val="single" w:sz="1" w:space="0" w:color="CCCCCC"/>
             </w:tcBorders>
-            <w:shd w:val="clear" w:color="auto" w:fill="F0F4FA"/>
+            <w:shd w:val="clear" w:color="auto" w:fill="F2F2F2" w:themeFill="background1" w:themeFillShade="F2"/>
             <w:tcMar>
               <w:top w:w="80" w:type="dxa"/>
               <w:left w:w="150" w:type="dxa"/>
@@ -2786,7 +2786,7 @@
               <w:bottom w:val="single" w:sz="1" w:space="0" w:color="CCCCCC"/>
               <w:right w:val="single" w:sz="1" w:space="0" w:color="CCCCCC"/>
             </w:tcBorders>
-            <w:shd w:val="clear" w:color="auto" w:fill="FFFFFF"/>
+            <w:shd w:val="clear" w:color="auto" w:fill="F2F2F2" w:themeFill="background1" w:themeFillShade="F2"/>
             <w:tcMar>
               <w:top w:w="80" w:type="dxa"/>
               <w:left w:w="150" w:type="dxa"/>
@@ -2819,7 +2819,7 @@
               <w:bottom w:val="single" w:sz="1" w:space="0" w:color="CCCCCC"/>
               <w:right w:val="single" w:sz="1" w:space="0" w:color="CCCCCC"/>
             </w:tcBorders>
-            <w:shd w:val="clear" w:color="auto" w:fill="FFFFFF"/>
+            <w:shd w:val="clear" w:color="auto" w:fill="F2F2F2" w:themeFill="background1" w:themeFillShade="F2"/>
             <w:tcMar>
               <w:top w:w="80" w:type="dxa"/>
               <w:left w:w="150" w:type="dxa"/>
@@ -2852,7 +2852,7 @@
               <w:bottom w:val="single" w:sz="1" w:space="0" w:color="CCCCCC"/>
               <w:right w:val="single" w:sz="1" w:space="0" w:color="CCCCCC"/>
             </w:tcBorders>
-            <w:shd w:val="clear" w:color="auto" w:fill="FFFFFF"/>
+            <w:shd w:val="clear" w:color="auto" w:fill="F2F2F2" w:themeFill="background1" w:themeFillShade="F2"/>
             <w:tcMar>
               <w:top w:w="80" w:type="dxa"/>
               <w:left w:w="150" w:type="dxa"/>
@@ -2887,7 +2887,7 @@
               <w:bottom w:val="single" w:sz="1" w:space="0" w:color="CCCCCC"/>
               <w:right w:val="single" w:sz="1" w:space="0" w:color="CCCCCC"/>
             </w:tcBorders>
-            <w:shd w:val="clear" w:color="auto" w:fill="F0F4FA"/>
+            <w:shd w:val="clear" w:color="auto" w:fill="F2F2F2" w:themeFill="background1" w:themeFillShade="F2"/>
             <w:tcMar>
               <w:top w:w="80" w:type="dxa"/>
               <w:left w:w="150" w:type="dxa"/>
@@ -2920,7 +2920,7 @@
               <w:bottom w:val="single" w:sz="1" w:space="0" w:color="CCCCCC"/>
               <w:right w:val="single" w:sz="1" w:space="0" w:color="CCCCCC"/>
             </w:tcBorders>
-            <w:shd w:val="clear" w:color="auto" w:fill="F0F4FA"/>
+            <w:shd w:val="clear" w:color="auto" w:fill="F2F2F2" w:themeFill="background1" w:themeFillShade="F2"/>
             <w:tcMar>
               <w:top w:w="80" w:type="dxa"/>
               <w:left w:w="150" w:type="dxa"/>
@@ -2953,7 +2953,7 @@
               <w:bottom w:val="single" w:sz="1" w:space="0" w:color="CCCCCC"/>
               <w:right w:val="single" w:sz="1" w:space="0" w:color="CCCCCC"/>
             </w:tcBorders>
-            <w:shd w:val="clear" w:color="auto" w:fill="F0F4FA"/>
+            <w:shd w:val="clear" w:color="auto" w:fill="F2F2F2" w:themeFill="background1" w:themeFillShade="F2"/>
             <w:tcMar>
               <w:top w:w="80" w:type="dxa"/>
               <w:left w:w="150" w:type="dxa"/>
@@ -2988,7 +2988,7 @@
               <w:bottom w:val="single" w:sz="1" w:space="0" w:color="CCCCCC"/>
               <w:right w:val="single" w:sz="1" w:space="0" w:color="CCCCCC"/>
             </w:tcBorders>
-            <w:shd w:val="clear" w:color="auto" w:fill="FFFFFF"/>
+            <w:shd w:val="clear" w:color="auto" w:fill="F2F2F2" w:themeFill="background1" w:themeFillShade="F2"/>
             <w:tcMar>
               <w:top w:w="80" w:type="dxa"/>
               <w:left w:w="150" w:type="dxa"/>
@@ -3021,7 +3021,7 @@
               <w:bottom w:val="single" w:sz="1" w:space="0" w:color="CCCCCC"/>
               <w:right w:val="single" w:sz="1" w:space="0" w:color="CCCCCC"/>
             </w:tcBorders>
-            <w:shd w:val="clear" w:color="auto" w:fill="FFFFFF"/>
+            <w:shd w:val="clear" w:color="auto" w:fill="F2F2F2" w:themeFill="background1" w:themeFillShade="F2"/>
             <w:tcMar>
               <w:top w:w="80" w:type="dxa"/>
               <w:left w:w="150" w:type="dxa"/>
@@ -3054,7 +3054,7 @@
               <w:bottom w:val="single" w:sz="1" w:space="0" w:color="CCCCCC"/>
               <w:right w:val="single" w:sz="1" w:space="0" w:color="CCCCCC"/>
             </w:tcBorders>
-            <w:shd w:val="clear" w:color="auto" w:fill="FFFFFF"/>
+            <w:shd w:val="clear" w:color="auto" w:fill="F2F2F2" w:themeFill="background1" w:themeFillShade="F2"/>
             <w:tcMar>
               <w:top w:w="80" w:type="dxa"/>
               <w:left w:w="150" w:type="dxa"/>
@@ -3090,7 +3090,7 @@
               <w:bottom w:val="single" w:sz="1" w:space="0" w:color="CCCCCC"/>
               <w:right w:val="single" w:sz="1" w:space="0" w:color="CCCCCC"/>
             </w:tcBorders>
-            <w:shd w:val="clear" w:color="auto" w:fill="F0F4FA"/>
+            <w:shd w:val="clear" w:color="auto" w:fill="F2F2F2" w:themeFill="background1" w:themeFillShade="F2"/>
             <w:tcMar>
               <w:top w:w="80" w:type="dxa"/>
               <w:left w:w="150" w:type="dxa"/>
@@ -3161,7 +3161,7 @@
               <w:bottom w:val="single" w:sz="1" w:space="0" w:color="CCCCCC"/>
               <w:right w:val="single" w:sz="1" w:space="0" w:color="CCCCCC"/>
             </w:tcBorders>
-            <w:shd w:val="clear" w:color="auto" w:fill="F0F4FA"/>
+            <w:shd w:val="clear" w:color="auto" w:fill="F2F2F2" w:themeFill="background1" w:themeFillShade="F2"/>
             <w:tcMar>
               <w:top w:w="80" w:type="dxa"/>
               <w:left w:w="150" w:type="dxa"/>
@@ -3194,7 +3194,7 @@
               <w:bottom w:val="single" w:sz="1" w:space="0" w:color="CCCCCC"/>
               <w:right w:val="single" w:sz="1" w:space="0" w:color="CCCCCC"/>
             </w:tcBorders>
-            <w:shd w:val="clear" w:color="auto" w:fill="F0F4FA"/>
+            <w:shd w:val="clear" w:color="auto" w:fill="F2F2F2" w:themeFill="background1" w:themeFillShade="F2"/>
             <w:tcMar>
               <w:top w:w="80" w:type="dxa"/>
               <w:left w:w="150" w:type="dxa"/>
@@ -3229,7 +3229,7 @@
               <w:bottom w:val="single" w:sz="1" w:space="0" w:color="CCCCCC"/>
               <w:right w:val="single" w:sz="1" w:space="0" w:color="CCCCCC"/>
             </w:tcBorders>
-            <w:shd w:val="clear" w:color="auto" w:fill="FFFFFF"/>
+            <w:shd w:val="clear" w:color="auto" w:fill="F2F2F2" w:themeFill="background1" w:themeFillShade="F2"/>
             <w:tcMar>
               <w:top w:w="80" w:type="dxa"/>
               <w:left w:w="150" w:type="dxa"/>
@@ -3264,7 +3264,7 @@
               <w:bottom w:val="single" w:sz="1" w:space="0" w:color="CCCCCC"/>
               <w:right w:val="single" w:sz="1" w:space="0" w:color="CCCCCC"/>
             </w:tcBorders>
-            <w:shd w:val="clear" w:color="auto" w:fill="FFFFFF"/>
+            <w:shd w:val="clear" w:color="auto" w:fill="F2F2F2" w:themeFill="background1" w:themeFillShade="F2"/>
             <w:tcMar>
               <w:top w:w="80" w:type="dxa"/>
               <w:left w:w="150" w:type="dxa"/>
@@ -3297,7 +3297,7 @@
               <w:bottom w:val="single" w:sz="1" w:space="0" w:color="CCCCCC"/>
               <w:right w:val="single" w:sz="1" w:space="0" w:color="CCCCCC"/>
             </w:tcBorders>
-            <w:shd w:val="clear" w:color="auto" w:fill="FFFFFF"/>
+            <w:shd w:val="clear" w:color="auto" w:fill="F2F2F2" w:themeFill="background1" w:themeFillShade="F2"/>
             <w:tcMar>
               <w:top w:w="80" w:type="dxa"/>
               <w:left w:w="150" w:type="dxa"/>
@@ -3332,7 +3332,7 @@
               <w:bottom w:val="single" w:sz="1" w:space="0" w:color="CCCCCC"/>
               <w:right w:val="single" w:sz="1" w:space="0" w:color="CCCCCC"/>
             </w:tcBorders>
-            <w:shd w:val="clear" w:color="auto" w:fill="F0F4FA"/>
+            <w:shd w:val="clear" w:color="auto" w:fill="F2F2F2" w:themeFill="background1" w:themeFillShade="F2"/>
             <w:tcMar>
               <w:top w:w="80" w:type="dxa"/>
               <w:left w:w="150" w:type="dxa"/>
@@ -3367,7 +3367,7 @@
               <w:bottom w:val="single" w:sz="1" w:space="0" w:color="CCCCCC"/>
               <w:right w:val="single" w:sz="1" w:space="0" w:color="CCCCCC"/>
             </w:tcBorders>
-            <w:shd w:val="clear" w:color="auto" w:fill="F0F4FA"/>
+            <w:shd w:val="clear" w:color="auto" w:fill="F2F2F2" w:themeFill="background1" w:themeFillShade="F2"/>
             <w:tcMar>
               <w:top w:w="80" w:type="dxa"/>
               <w:left w:w="150" w:type="dxa"/>
@@ -3400,7 +3400,7 @@
               <w:bottom w:val="single" w:sz="1" w:space="0" w:color="CCCCCC"/>
               <w:right w:val="single" w:sz="1" w:space="0" w:color="CCCCCC"/>
             </w:tcBorders>
-            <w:shd w:val="clear" w:color="auto" w:fill="F0F4FA"/>
+            <w:shd w:val="clear" w:color="auto" w:fill="F2F2F2" w:themeFill="background1" w:themeFillShade="F2"/>
             <w:tcMar>
               <w:top w:w="80" w:type="dxa"/>
               <w:left w:w="150" w:type="dxa"/>
@@ -3435,7 +3435,7 @@
               <w:bottom w:val="single" w:sz="1" w:space="0" w:color="CCCCCC"/>
               <w:right w:val="single" w:sz="1" w:space="0" w:color="CCCCCC"/>
             </w:tcBorders>
-            <w:shd w:val="clear" w:color="auto" w:fill="FFFFFF"/>
+            <w:shd w:val="clear" w:color="auto" w:fill="F2F2F2" w:themeFill="background1" w:themeFillShade="F2"/>
             <w:tcMar>
               <w:top w:w="80" w:type="dxa"/>
               <w:left w:w="150" w:type="dxa"/>
@@ -3478,7 +3478,7 @@
               <w:bottom w:val="single" w:sz="1" w:space="0" w:color="CCCCCC"/>
               <w:right w:val="single" w:sz="1" w:space="0" w:color="CCCCCC"/>
             </w:tcBorders>
-            <w:shd w:val="clear" w:color="auto" w:fill="FFFFFF"/>
+            <w:shd w:val="clear" w:color="auto" w:fill="F2F2F2" w:themeFill="background1" w:themeFillShade="F2"/>
             <w:tcMar>
               <w:top w:w="80" w:type="dxa"/>
               <w:left w:w="150" w:type="dxa"/>
@@ -3511,7 +3511,7 @@
               <w:bottom w:val="single" w:sz="1" w:space="0" w:color="CCCCCC"/>
               <w:right w:val="single" w:sz="1" w:space="0" w:color="CCCCCC"/>
             </w:tcBorders>
-            <w:shd w:val="clear" w:color="auto" w:fill="FFFFFF"/>
+            <w:shd w:val="clear" w:color="auto" w:fill="F2F2F2" w:themeFill="background1" w:themeFillShade="F2"/>
             <w:tcMar>
               <w:top w:w="80" w:type="dxa"/>
               <w:left w:w="150" w:type="dxa"/>
@@ -3546,7 +3546,7 @@
               <w:bottom w:val="single" w:sz="1" w:space="0" w:color="CCCCCC"/>
               <w:right w:val="single" w:sz="1" w:space="0" w:color="CCCCCC"/>
             </w:tcBorders>
-            <w:shd w:val="clear" w:color="auto" w:fill="F0F4FA"/>
+            <w:shd w:val="clear" w:color="auto" w:fill="F2F2F2" w:themeFill="background1" w:themeFillShade="F2"/>
             <w:tcMar>
               <w:top w:w="80" w:type="dxa"/>
               <w:left w:w="150" w:type="dxa"/>
@@ -3581,7 +3581,7 @@
               <w:bottom w:val="single" w:sz="1" w:space="0" w:color="CCCCCC"/>
               <w:right w:val="single" w:sz="1" w:space="0" w:color="CCCCCC"/>
             </w:tcBorders>
-            <w:shd w:val="clear" w:color="auto" w:fill="F0F4FA"/>
+            <w:shd w:val="clear" w:color="auto" w:fill="F2F2F2" w:themeFill="background1" w:themeFillShade="F2"/>
             <w:tcMar>
               <w:top w:w="80" w:type="dxa"/>
               <w:left w:w="150" w:type="dxa"/>
@@ -3614,7 +3614,7 @@
               <w:bottom w:val="single" w:sz="1" w:space="0" w:color="CCCCCC"/>
               <w:right w:val="single" w:sz="1" w:space="0" w:color="CCCCCC"/>
             </w:tcBorders>
-            <w:shd w:val="clear" w:color="auto" w:fill="F0F4FA"/>
+            <w:shd w:val="clear" w:color="auto" w:fill="F2F2F2" w:themeFill="background1" w:themeFillShade="F2"/>
             <w:tcMar>
               <w:top w:w="80" w:type="dxa"/>
               <w:left w:w="150" w:type="dxa"/>
@@ -3649,7 +3649,7 @@
               <w:bottom w:val="single" w:sz="1" w:space="0" w:color="CCCCCC"/>
               <w:right w:val="single" w:sz="1" w:space="0" w:color="CCCCCC"/>
             </w:tcBorders>
-            <w:shd w:val="clear" w:color="auto" w:fill="F0F4FA"/>
+            <w:shd w:val="clear" w:color="auto" w:fill="F2F2F2" w:themeFill="background1" w:themeFillShade="F2"/>
             <w:tcMar>
               <w:top w:w="80" w:type="dxa"/>
               <w:left w:w="150" w:type="dxa"/>
@@ -3684,7 +3684,7 @@
               <w:bottom w:val="single" w:sz="1" w:space="0" w:color="CCCCCC"/>
               <w:right w:val="single" w:sz="1" w:space="0" w:color="CCCCCC"/>
             </w:tcBorders>
-            <w:shd w:val="clear" w:color="auto" w:fill="F0F4FA"/>
+            <w:shd w:val="clear" w:color="auto" w:fill="F2F2F2" w:themeFill="background1" w:themeFillShade="F2"/>
             <w:tcMar>
               <w:top w:w="80" w:type="dxa"/>
               <w:left w:w="150" w:type="dxa"/>
@@ -3719,7 +3719,7 @@
               <w:bottom w:val="single" w:sz="1" w:space="0" w:color="CCCCCC"/>
               <w:right w:val="single" w:sz="1" w:space="0" w:color="CCCCCC"/>
             </w:tcBorders>
-            <w:shd w:val="clear" w:color="auto" w:fill="F0F4FA"/>
+            <w:shd w:val="clear" w:color="auto" w:fill="F2F2F2" w:themeFill="background1" w:themeFillShade="F2"/>
             <w:tcMar>
               <w:top w:w="80" w:type="dxa"/>
               <w:left w:w="150" w:type="dxa"/>
@@ -3742,6 +3742,14 @@
                 <w:highlight w:val="yellow"/>
               </w:rPr>
               <w:t>Base64 for image for the product</w:t>
+            </w:r>
+            <w:r>
+              <w:rPr>
+                <w:sz w:val="20"/>
+                <w:szCs w:val="20"/>
+                <w:highlight w:val="yellow"/>
+              </w:rPr>
+              <w:t xml:space="preserve"> </w:t>
             </w:r>
           </w:p>
         </w:tc>
@@ -3756,7 +3764,7 @@
               <w:bottom w:val="single" w:sz="1" w:space="0" w:color="CCCCCC"/>
               <w:right w:val="single" w:sz="1" w:space="0" w:color="CCCCCC"/>
             </w:tcBorders>
-            <w:shd w:val="clear" w:color="auto" w:fill="FFFFFF"/>
+            <w:shd w:val="clear" w:color="auto" w:fill="F2F2F2" w:themeFill="background1" w:themeFillShade="F2"/>
             <w:tcMar>
               <w:top w:w="80" w:type="dxa"/>
               <w:left w:w="150" w:type="dxa"/>
@@ -3767,6 +3775,8 @@
           <w:p>
             <w:pPr>
               <w:rPr>
+                <w:sz w:val="20"/>
+                <w:szCs w:val="20"/>
                 <w:highlight w:val="yellow"/>
               </w:rPr>
             </w:pPr>
@@ -3777,6 +3787,121 @@
                 <w:szCs w:val="20"/>
                 <w:highlight w:val="yellow"/>
               </w:rPr>
+              <w:t>latest_used</w:t>
+            </w:r>
+            <w:proofErr w:type="spellEnd"/>
+            <w:r>
+              <w:rPr>
+                <w:sz w:val="20"/>
+                <w:szCs w:val="20"/>
+                <w:highlight w:val="yellow"/>
+              </w:rPr>
+              <w:t xml:space="preserve"> / previous used</w:t>
+            </w:r>
+          </w:p>
+        </w:tc>
+        <w:tc>
+          <w:tcPr>
+            <w:tcW w:w="2000" w:type="dxa"/>
+            <w:tcBorders>
+              <w:top w:val="single" w:sz="1" w:space="0" w:color="CCCCCC"/>
+              <w:left w:val="single" w:sz="1" w:space="0" w:color="CCCCCC"/>
+              <w:bottom w:val="single" w:sz="1" w:space="0" w:color="CCCCCC"/>
+              <w:right w:val="single" w:sz="1" w:space="0" w:color="CCCCCC"/>
+            </w:tcBorders>
+            <w:shd w:val="clear" w:color="auto" w:fill="F2F2F2" w:themeFill="background1" w:themeFillShade="F2"/>
+            <w:tcMar>
+              <w:top w:w="80" w:type="dxa"/>
+              <w:left w:w="150" w:type="dxa"/>
+              <w:bottom w:w="80" w:type="dxa"/>
+              <w:right w:w="150" w:type="dxa"/>
+            </w:tcMar>
+          </w:tcPr>
+          <w:p>
+            <w:pPr>
+              <w:rPr>
+                <w:sz w:val="20"/>
+                <w:szCs w:val="20"/>
+                <w:highlight w:val="yellow"/>
+              </w:rPr>
+            </w:pPr>
+            <w:r>
+              <w:rPr>
+                <w:sz w:val="20"/>
+                <w:szCs w:val="20"/>
+                <w:highlight w:val="yellow"/>
+              </w:rPr>
+              <w:t>VARCHAR</w:t>
+            </w:r>
+          </w:p>
+        </w:tc>
+        <w:tc>
+          <w:tcPr>
+            <w:tcW w:w="4760" w:type="dxa"/>
+            <w:tcBorders>
+              <w:top w:val="single" w:sz="1" w:space="0" w:color="CCCCCC"/>
+              <w:left w:val="single" w:sz="1" w:space="0" w:color="CCCCCC"/>
+              <w:bottom w:val="single" w:sz="1" w:space="0" w:color="CCCCCC"/>
+              <w:right w:val="single" w:sz="1" w:space="0" w:color="CCCCCC"/>
+            </w:tcBorders>
+            <w:shd w:val="clear" w:color="auto" w:fill="F2F2F2" w:themeFill="background1" w:themeFillShade="F2"/>
+            <w:tcMar>
+              <w:top w:w="80" w:type="dxa"/>
+              <w:left w:w="150" w:type="dxa"/>
+              <w:bottom w:w="80" w:type="dxa"/>
+              <w:right w:w="150" w:type="dxa"/>
+            </w:tcMar>
+          </w:tcPr>
+          <w:p>
+            <w:pPr>
+              <w:rPr>
+                <w:sz w:val="20"/>
+                <w:szCs w:val="20"/>
+                <w:highlight w:val="yellow"/>
+              </w:rPr>
+            </w:pPr>
+            <w:r>
+              <w:rPr>
+                <w:sz w:val="20"/>
+                <w:szCs w:val="20"/>
+                <w:highlight w:val="yellow"/>
+              </w:rPr>
+              <w:t>Name User Used the laptop</w:t>
+            </w:r>
+          </w:p>
+        </w:tc>
+      </w:tr>
+      <w:tr>
+        <w:tc>
+          <w:tcPr>
+            <w:tcW w:w="2600" w:type="dxa"/>
+            <w:tcBorders>
+              <w:top w:val="single" w:sz="1" w:space="0" w:color="CCCCCC"/>
+              <w:left w:val="single" w:sz="1" w:space="0" w:color="CCCCCC"/>
+              <w:bottom w:val="single" w:sz="1" w:space="0" w:color="CCCCCC"/>
+              <w:right w:val="single" w:sz="1" w:space="0" w:color="CCCCCC"/>
+            </w:tcBorders>
+            <w:shd w:val="clear" w:color="auto" w:fill="F2F2F2" w:themeFill="background1" w:themeFillShade="F2"/>
+            <w:tcMar>
+              <w:top w:w="80" w:type="dxa"/>
+              <w:left w:w="150" w:type="dxa"/>
+              <w:bottom w:w="80" w:type="dxa"/>
+              <w:right w:w="150" w:type="dxa"/>
+            </w:tcMar>
+          </w:tcPr>
+          <w:p>
+            <w:pPr>
+              <w:rPr>
+                <w:highlight w:val="yellow"/>
+              </w:rPr>
+            </w:pPr>
+            <w:proofErr w:type="spellStart"/>
+            <w:r>
+              <w:rPr>
+                <w:sz w:val="20"/>
+                <w:szCs w:val="20"/>
+                <w:highlight w:val="yellow"/>
+              </w:rPr>
               <w:t>created_at</w:t>
             </w:r>
             <w:proofErr w:type="spellEnd"/>
@@ -3809,7 +3934,7 @@
               <w:bottom w:val="single" w:sz="1" w:space="0" w:color="CCCCCC"/>
               <w:right w:val="single" w:sz="1" w:space="0" w:color="CCCCCC"/>
             </w:tcBorders>
-            <w:shd w:val="clear" w:color="auto" w:fill="FFFFFF"/>
+            <w:shd w:val="clear" w:color="auto" w:fill="F2F2F2" w:themeFill="background1" w:themeFillShade="F2"/>
             <w:tcMar>
               <w:top w:w="80" w:type="dxa"/>
               <w:left w:w="150" w:type="dxa"/>
@@ -3842,7 +3967,7 @@
               <w:bottom w:val="single" w:sz="1" w:space="0" w:color="CCCCCC"/>
               <w:right w:val="single" w:sz="1" w:space="0" w:color="CCCCCC"/>
             </w:tcBorders>
-            <w:shd w:val="clear" w:color="auto" w:fill="FFFFFF"/>
+            <w:shd w:val="clear" w:color="auto" w:fill="F2F2F2" w:themeFill="background1" w:themeFillShade="F2"/>
             <w:tcMar>
               <w:top w:w="80" w:type="dxa"/>
               <w:left w:w="150" w:type="dxa"/>
@@ -3878,10 +4003,16 @@
         <w:pStyle w:val="Heading2"/>
       </w:pPr>
       <w:r>
+        <w:rPr>
+          <w:highlight w:val="yellow"/>
+        </w:rPr>
         <w:t xml:space="preserve">Table: </w:t>
       </w:r>
       <w:proofErr w:type="spellStart"/>
       <w:r>
+        <w:rPr>
+          <w:highlight w:val="yellow"/>
+        </w:rPr>
         <w:t>asset_assignments</w:t>
       </w:r>
       <w:proofErr w:type="spellEnd"/>
@@ -3934,6 +4065,7 @@
               <w:rPr>
                 <w:sz w:val="20"/>
                 <w:szCs w:val="20"/>
+                <w:highlight w:val="yellow"/>
               </w:rPr>
             </w:pPr>
             <w:r>
@@ -3943,6 +4075,7 @@
                 <w:color w:val="FFFFFF"/>
                 <w:sz w:val="20"/>
                 <w:szCs w:val="20"/>
+                <w:highlight w:val="yellow"/>
               </w:rPr>
               <w:t>Column</w:t>
             </w:r>
@@ -3970,6 +4103,7 @@
               <w:rPr>
                 <w:sz w:val="20"/>
                 <w:szCs w:val="20"/>
+                <w:highlight w:val="yellow"/>
               </w:rPr>
             </w:pPr>
             <w:r>
@@ -3979,6 +4113,7 @@
                 <w:color w:val="FFFFFF"/>
                 <w:sz w:val="20"/>
                 <w:szCs w:val="20"/>
+                <w:highlight w:val="yellow"/>
               </w:rPr>
               <w:t>Notes</w:t>
             </w:r>
@@ -4008,12 +4143,14 @@
               <w:rPr>
                 <w:sz w:val="20"/>
                 <w:szCs w:val="20"/>
+                <w:highlight w:val="yellow"/>
               </w:rPr>
             </w:pPr>
             <w:r>
               <w:rPr>
                 <w:sz w:val="20"/>
                 <w:szCs w:val="20"/>
+                <w:highlight w:val="yellow"/>
               </w:rPr>
               <w:t xml:space="preserve">id, </w:t>
             </w:r>
@@ -4022,6 +4159,7 @@
               <w:rPr>
                 <w:sz w:val="20"/>
                 <w:szCs w:val="20"/>
+                <w:highlight w:val="yellow"/>
               </w:rPr>
               <w:t>asset_id</w:t>
             </w:r>
@@ -4050,12 +4188,14 @@
               <w:rPr>
                 <w:sz w:val="20"/>
                 <w:szCs w:val="20"/>
+                <w:highlight w:val="yellow"/>
               </w:rPr>
             </w:pPr>
             <w:r>
               <w:rPr>
                 <w:sz w:val="20"/>
                 <w:szCs w:val="20"/>
+                <w:highlight w:val="yellow"/>
               </w:rPr>
               <w:t>FK to assets</w:t>
             </w:r>
@@ -4085,6 +4225,7 @@
               <w:rPr>
                 <w:sz w:val="20"/>
                 <w:szCs w:val="20"/>
+                <w:highlight w:val="yellow"/>
               </w:rPr>
             </w:pPr>
             <w:proofErr w:type="spellStart"/>
@@ -4092,6 +4233,7 @@
               <w:rPr>
                 <w:sz w:val="20"/>
                 <w:szCs w:val="20"/>
+                <w:highlight w:val="yellow"/>
               </w:rPr>
               <w:t>assigned_to</w:t>
             </w:r>
@@ -4120,12 +4262,14 @@
               <w:rPr>
                 <w:sz w:val="20"/>
                 <w:szCs w:val="20"/>
+                <w:highlight w:val="yellow"/>
               </w:rPr>
             </w:pPr>
             <w:r>
               <w:rPr>
                 <w:sz w:val="20"/>
                 <w:szCs w:val="20"/>
+                <w:highlight w:val="yellow"/>
               </w:rPr>
               <w:t>Employee name or ID</w:t>
             </w:r>
@@ -4155,12 +4299,14 @@
               <w:rPr>
                 <w:sz w:val="20"/>
                 <w:szCs w:val="20"/>
+                <w:highlight w:val="yellow"/>
               </w:rPr>
             </w:pPr>
             <w:r>
               <w:rPr>
                 <w:sz w:val="20"/>
                 <w:szCs w:val="20"/>
+                <w:highlight w:val="yellow"/>
               </w:rPr>
               <w:t xml:space="preserve">department, </w:t>
             </w:r>
@@ -4188,12 +4334,14 @@
               <w:rPr>
                 <w:sz w:val="20"/>
                 <w:szCs w:val="20"/>
+                <w:highlight w:val="yellow"/>
               </w:rPr>
             </w:pPr>
             <w:r>
               <w:rPr>
                 <w:sz w:val="20"/>
                 <w:szCs w:val="20"/>
+                <w:highlight w:val="yellow"/>
               </w:rPr>
               <w:t xml:space="preserve">ENUM: </w:t>
             </w:r>
@@ -4208,12 +4356,14 @@
               <w:rPr>
                 <w:sz w:val="20"/>
                 <w:szCs w:val="20"/>
+                <w:highlight w:val="yellow"/>
               </w:rPr>
             </w:pPr>
             <w:r>
               <w:rPr>
                 <w:sz w:val="20"/>
                 <w:szCs w:val="20"/>
+                <w:highlight w:val="yellow"/>
               </w:rPr>
               <w:t>Office Admin</w:t>
             </w:r>
@@ -4228,12 +4378,14 @@
               <w:rPr>
                 <w:sz w:val="20"/>
                 <w:szCs w:val="20"/>
+                <w:highlight w:val="yellow"/>
               </w:rPr>
             </w:pPr>
             <w:r>
               <w:rPr>
                 <w:sz w:val="20"/>
                 <w:szCs w:val="20"/>
+                <w:highlight w:val="yellow"/>
               </w:rPr>
               <w:t>Tax &amp; Accounting Advisory</w:t>
             </w:r>
@@ -4241,6 +4393,7 @@
               <w:rPr>
                 <w:sz w:val="20"/>
                 <w:szCs w:val="20"/>
+                <w:highlight w:val="yellow"/>
               </w:rPr>
               <w:t xml:space="preserve"> </w:t>
             </w:r>
@@ -4255,12 +4408,14 @@
               <w:rPr>
                 <w:sz w:val="20"/>
                 <w:szCs w:val="20"/>
+                <w:highlight w:val="yellow"/>
               </w:rPr>
             </w:pPr>
             <w:r>
               <w:rPr>
                 <w:sz w:val="20"/>
                 <w:szCs w:val="20"/>
+                <w:highlight w:val="yellow"/>
               </w:rPr>
               <w:t>Legal &amp; Corporate Advisory</w:t>
             </w:r>
@@ -4275,12 +4430,14 @@
               <w:rPr>
                 <w:sz w:val="20"/>
                 <w:szCs w:val="20"/>
+                <w:highlight w:val="yellow"/>
               </w:rPr>
             </w:pPr>
             <w:r>
               <w:rPr>
                 <w:sz w:val="20"/>
                 <w:szCs w:val="20"/>
+                <w:highlight w:val="yellow"/>
               </w:rPr>
               <w:t>Audit &amp; Assurance</w:t>
             </w:r>
@@ -4295,12 +4452,14 @@
               <w:rPr>
                 <w:sz w:val="20"/>
                 <w:szCs w:val="20"/>
+                <w:highlight w:val="yellow"/>
               </w:rPr>
             </w:pPr>
             <w:r>
               <w:rPr>
                 <w:sz w:val="20"/>
                 <w:szCs w:val="20"/>
+                <w:highlight w:val="yellow"/>
               </w:rPr>
               <w:t>Practice Development &amp; Management</w:t>
             </w:r>
@@ -4315,12 +4474,14 @@
               <w:rPr>
                 <w:sz w:val="20"/>
                 <w:szCs w:val="20"/>
+                <w:highlight w:val="yellow"/>
               </w:rPr>
             </w:pPr>
             <w:r>
               <w:rPr>
                 <w:sz w:val="20"/>
                 <w:szCs w:val="20"/>
+                <w:highlight w:val="yellow"/>
               </w:rPr>
               <w:t>Client &amp; Operation Management</w:t>
             </w:r>
@@ -4335,12 +4496,14 @@
               <w:rPr>
                 <w:sz w:val="20"/>
                 <w:szCs w:val="20"/>
+                <w:highlight w:val="yellow"/>
               </w:rPr>
             </w:pPr>
             <w:r>
               <w:rPr>
                 <w:sz w:val="20"/>
                 <w:szCs w:val="20"/>
+                <w:highlight w:val="yellow"/>
               </w:rPr>
               <w:t>Finance &amp; Human Resource</w:t>
             </w:r>
@@ -4355,12 +4518,14 @@
               <w:rPr>
                 <w:sz w:val="20"/>
                 <w:szCs w:val="20"/>
+                <w:highlight w:val="yellow"/>
               </w:rPr>
             </w:pPr>
             <w:r>
               <w:rPr>
                 <w:sz w:val="20"/>
                 <w:szCs w:val="20"/>
+                <w:highlight w:val="yellow"/>
               </w:rPr>
               <w:t>Technology Innovation and Development</w:t>
             </w:r>
@@ -4390,6 +4555,7 @@
               <w:rPr>
                 <w:sz w:val="20"/>
                 <w:szCs w:val="20"/>
+                <w:highlight w:val="yellow"/>
               </w:rPr>
             </w:pPr>
             <w:proofErr w:type="spellStart"/>
@@ -4397,6 +4563,7 @@
               <w:rPr>
                 <w:sz w:val="20"/>
                 <w:szCs w:val="20"/>
+                <w:highlight w:val="yellow"/>
               </w:rPr>
               <w:t>job_title</w:t>
             </w:r>
@@ -4425,12 +4592,14 @@
               <w:rPr>
                 <w:sz w:val="20"/>
                 <w:szCs w:val="20"/>
+                <w:highlight w:val="yellow"/>
               </w:rPr>
             </w:pPr>
             <w:r>
               <w:rPr>
                 <w:sz w:val="20"/>
                 <w:szCs w:val="20"/>
+                <w:highlight w:val="yellow"/>
               </w:rPr>
               <w:t>ENUM</w:t>
             </w:r>
@@ -4438,6 +4607,7 @@
               <w:rPr>
                 <w:sz w:val="20"/>
                 <w:szCs w:val="20"/>
+                <w:highlight w:val="yellow"/>
               </w:rPr>
               <w:t>:</w:t>
             </w:r>
@@ -4454,6 +4624,7 @@
                 <w:rFonts w:ascii="Arial" w:hAnsi="Arial" w:cs="Arial"/>
                 <w:sz w:val="20"/>
                 <w:szCs w:val="20"/>
+                <w:highlight w:val="yellow"/>
               </w:rPr>
             </w:pPr>
             <w:r>
@@ -4461,6 +4632,7 @@
                 <w:rFonts w:ascii="Arial" w:hAnsi="Arial" w:cs="Arial"/>
                 <w:sz w:val="20"/>
                 <w:szCs w:val="20"/>
+                <w:highlight w:val="yellow"/>
               </w:rPr>
               <w:t>Assistant Manager</w:t>
             </w:r>
@@ -4477,6 +4649,7 @@
                 <w:rFonts w:ascii="Arial" w:hAnsi="Arial" w:cs="Arial"/>
                 <w:sz w:val="20"/>
                 <w:szCs w:val="20"/>
+                <w:highlight w:val="yellow"/>
               </w:rPr>
             </w:pPr>
             <w:r>
@@ -4484,7 +4657,9 @@
                 <w:rFonts w:ascii="Arial" w:hAnsi="Arial" w:cs="Arial"/>
                 <w:sz w:val="20"/>
                 <w:szCs w:val="20"/>
-              </w:rPr>
+                <w:highlight w:val="yellow"/>
+              </w:rPr>
+              <w:lastRenderedPageBreak/>
               <w:t>Associate</w:t>
             </w:r>
           </w:p>
@@ -4500,6 +4675,7 @@
                 <w:rFonts w:ascii="Arial" w:hAnsi="Arial" w:cs="Arial"/>
                 <w:sz w:val="20"/>
                 <w:szCs w:val="20"/>
+                <w:highlight w:val="yellow"/>
               </w:rPr>
             </w:pPr>
             <w:r>
@@ -4507,6 +4683,7 @@
                 <w:rFonts w:ascii="Arial" w:hAnsi="Arial" w:cs="Arial"/>
                 <w:sz w:val="20"/>
                 <w:szCs w:val="20"/>
+                <w:highlight w:val="yellow"/>
               </w:rPr>
               <w:t>Associate Director</w:t>
             </w:r>
@@ -4523,6 +4700,7 @@
                 <w:rFonts w:ascii="Arial" w:hAnsi="Arial" w:cs="Arial"/>
                 <w:sz w:val="20"/>
                 <w:szCs w:val="20"/>
+                <w:highlight w:val="yellow"/>
               </w:rPr>
             </w:pPr>
             <w:r>
@@ -4530,6 +4708,7 @@
                 <w:rFonts w:ascii="Arial" w:hAnsi="Arial" w:cs="Arial"/>
                 <w:sz w:val="20"/>
                 <w:szCs w:val="20"/>
+                <w:highlight w:val="yellow"/>
               </w:rPr>
               <w:t>Consultant</w:t>
             </w:r>
@@ -4546,6 +4725,7 @@
                 <w:rFonts w:ascii="Arial" w:hAnsi="Arial" w:cs="Arial"/>
                 <w:sz w:val="20"/>
                 <w:szCs w:val="20"/>
+                <w:highlight w:val="yellow"/>
               </w:rPr>
             </w:pPr>
             <w:r>
@@ -4553,8 +4733,8 @@
                 <w:rFonts w:ascii="Arial" w:hAnsi="Arial" w:cs="Arial"/>
                 <w:sz w:val="20"/>
                 <w:szCs w:val="20"/>
-              </w:rPr>
-              <w:lastRenderedPageBreak/>
+                <w:highlight w:val="yellow"/>
+              </w:rPr>
               <w:t>Director</w:t>
             </w:r>
           </w:p>
@@ -4570,6 +4750,7 @@
                 <w:rFonts w:ascii="Arial" w:hAnsi="Arial" w:cs="Arial"/>
                 <w:sz w:val="20"/>
                 <w:szCs w:val="20"/>
+                <w:highlight w:val="yellow"/>
               </w:rPr>
             </w:pPr>
             <w:r>
@@ -4577,6 +4758,7 @@
                 <w:rFonts w:ascii="Arial" w:hAnsi="Arial" w:cs="Arial"/>
                 <w:sz w:val="20"/>
                 <w:szCs w:val="20"/>
+                <w:highlight w:val="yellow"/>
               </w:rPr>
               <w:t>Executive</w:t>
             </w:r>
@@ -4593,6 +4775,7 @@
                 <w:rFonts w:ascii="Arial" w:hAnsi="Arial" w:cs="Arial"/>
                 <w:sz w:val="20"/>
                 <w:szCs w:val="20"/>
+                <w:highlight w:val="yellow"/>
               </w:rPr>
             </w:pPr>
             <w:r>
@@ -4600,6 +4783,7 @@
                 <w:rFonts w:ascii="Arial" w:hAnsi="Arial" w:cs="Arial"/>
                 <w:sz w:val="20"/>
                 <w:szCs w:val="20"/>
+                <w:highlight w:val="yellow"/>
               </w:rPr>
               <w:t>Executive Assistant</w:t>
             </w:r>
@@ -4616,6 +4800,7 @@
                 <w:rFonts w:ascii="Arial" w:hAnsi="Arial" w:cs="Arial"/>
                 <w:sz w:val="20"/>
                 <w:szCs w:val="20"/>
+                <w:highlight w:val="yellow"/>
               </w:rPr>
             </w:pPr>
             <w:r>
@@ -4623,6 +4808,7 @@
                 <w:rFonts w:ascii="Arial" w:hAnsi="Arial" w:cs="Arial"/>
                 <w:sz w:val="20"/>
                 <w:szCs w:val="20"/>
+                <w:highlight w:val="yellow"/>
               </w:rPr>
               <w:t>Intern</w:t>
             </w:r>
@@ -4639,6 +4825,7 @@
                 <w:rFonts w:ascii="Arial" w:hAnsi="Arial" w:cs="Arial"/>
                 <w:sz w:val="20"/>
                 <w:szCs w:val="20"/>
+                <w:highlight w:val="yellow"/>
               </w:rPr>
             </w:pPr>
             <w:r>
@@ -4646,6 +4833,7 @@
                 <w:rFonts w:ascii="Arial" w:hAnsi="Arial" w:cs="Arial"/>
                 <w:sz w:val="20"/>
                 <w:szCs w:val="20"/>
+                <w:highlight w:val="yellow"/>
               </w:rPr>
               <w:t>Manager</w:t>
             </w:r>
@@ -4662,6 +4850,7 @@
                 <w:rFonts w:ascii="Arial" w:hAnsi="Arial" w:cs="Arial"/>
                 <w:sz w:val="20"/>
                 <w:szCs w:val="20"/>
+                <w:highlight w:val="yellow"/>
               </w:rPr>
             </w:pPr>
             <w:r>
@@ -4669,6 +4858,7 @@
                 <w:rFonts w:ascii="Arial" w:hAnsi="Arial" w:cs="Arial"/>
                 <w:sz w:val="20"/>
                 <w:szCs w:val="20"/>
+                <w:highlight w:val="yellow"/>
               </w:rPr>
               <w:t xml:space="preserve">Personal Assistant </w:t>
             </w:r>
@@ -4677,6 +4867,7 @@
                 <w:rFonts w:ascii="Arial" w:hAnsi="Arial" w:cs="Arial"/>
                 <w:sz w:val="20"/>
                 <w:szCs w:val="20"/>
+                <w:highlight w:val="yellow"/>
               </w:rPr>
               <w:t>to</w:t>
             </w:r>
@@ -4685,6 +4876,7 @@
                 <w:rFonts w:ascii="Arial" w:hAnsi="Arial" w:cs="Arial"/>
                 <w:sz w:val="20"/>
                 <w:szCs w:val="20"/>
+                <w:highlight w:val="yellow"/>
               </w:rPr>
               <w:t xml:space="preserve"> Managing Partner</w:t>
             </w:r>
@@ -4701,6 +4893,7 @@
                 <w:rFonts w:ascii="Arial" w:hAnsi="Arial" w:cs="Arial"/>
                 <w:sz w:val="20"/>
                 <w:szCs w:val="20"/>
+                <w:highlight w:val="yellow"/>
               </w:rPr>
             </w:pPr>
             <w:r>
@@ -4708,6 +4901,7 @@
                 <w:rFonts w:ascii="Arial" w:hAnsi="Arial" w:cs="Arial"/>
                 <w:sz w:val="20"/>
                 <w:szCs w:val="20"/>
+                <w:highlight w:val="yellow"/>
               </w:rPr>
               <w:t>Receptionist</w:t>
             </w:r>
@@ -4724,6 +4918,7 @@
                 <w:rFonts w:ascii="Arial" w:hAnsi="Arial" w:cs="Arial"/>
                 <w:sz w:val="20"/>
                 <w:szCs w:val="20"/>
+                <w:highlight w:val="yellow"/>
               </w:rPr>
             </w:pPr>
             <w:r>
@@ -4731,6 +4926,7 @@
                 <w:rFonts w:ascii="Arial" w:hAnsi="Arial" w:cs="Arial"/>
                 <w:sz w:val="20"/>
                 <w:szCs w:val="20"/>
+                <w:highlight w:val="yellow"/>
               </w:rPr>
               <w:t>Senior Admin Executive</w:t>
             </w:r>
@@ -4747,6 +4943,7 @@
                 <w:rFonts w:ascii="Arial" w:hAnsi="Arial" w:cs="Arial"/>
                 <w:sz w:val="20"/>
                 <w:szCs w:val="20"/>
+                <w:highlight w:val="yellow"/>
               </w:rPr>
             </w:pPr>
             <w:r>
@@ -4754,6 +4951,7 @@
                 <w:rFonts w:ascii="Arial" w:hAnsi="Arial" w:cs="Arial"/>
                 <w:sz w:val="20"/>
                 <w:szCs w:val="20"/>
+                <w:highlight w:val="yellow"/>
               </w:rPr>
               <w:t>Senior Associate</w:t>
             </w:r>
@@ -4770,6 +4968,7 @@
                 <w:rFonts w:ascii="Arial" w:hAnsi="Arial" w:cs="Arial"/>
                 <w:sz w:val="20"/>
                 <w:szCs w:val="20"/>
+                <w:highlight w:val="yellow"/>
               </w:rPr>
             </w:pPr>
             <w:r>
@@ -4777,6 +4976,7 @@
                 <w:rFonts w:ascii="Arial" w:hAnsi="Arial" w:cs="Arial"/>
                 <w:sz w:val="20"/>
                 <w:szCs w:val="20"/>
+                <w:highlight w:val="yellow"/>
               </w:rPr>
               <w:t>Senior Consultant</w:t>
             </w:r>
@@ -4793,6 +4993,7 @@
                 <w:rFonts w:ascii="Arial" w:hAnsi="Arial" w:cs="Arial"/>
                 <w:sz w:val="20"/>
                 <w:szCs w:val="20"/>
+                <w:highlight w:val="yellow"/>
               </w:rPr>
             </w:pPr>
             <w:r>
@@ -4800,6 +5001,7 @@
                 <w:rFonts w:ascii="Arial" w:hAnsi="Arial" w:cs="Arial"/>
                 <w:sz w:val="20"/>
                 <w:szCs w:val="20"/>
+                <w:highlight w:val="yellow"/>
               </w:rPr>
               <w:t>Senior Executive</w:t>
             </w:r>
@@ -4816,6 +5018,7 @@
                 <w:rFonts w:ascii="Arial" w:hAnsi="Arial" w:cs="Arial"/>
                 <w:sz w:val="20"/>
                 <w:szCs w:val="20"/>
+                <w:highlight w:val="yellow"/>
               </w:rPr>
             </w:pPr>
             <w:r>
@@ -4823,6 +5026,7 @@
                 <w:rFonts w:ascii="Arial" w:hAnsi="Arial" w:cs="Arial"/>
                 <w:sz w:val="20"/>
                 <w:szCs w:val="20"/>
+                <w:highlight w:val="yellow"/>
               </w:rPr>
               <w:t>Senior I</w:t>
             </w:r>
@@ -4831,6 +5035,7 @@
                 <w:rFonts w:ascii="Arial" w:hAnsi="Arial" w:cs="Arial"/>
                 <w:sz w:val="20"/>
                 <w:szCs w:val="20"/>
+                <w:highlight w:val="yellow"/>
               </w:rPr>
               <w:t>T</w:t>
             </w:r>
@@ -4839,6 +5044,7 @@
                 <w:rFonts w:ascii="Arial" w:hAnsi="Arial" w:cs="Arial"/>
                 <w:sz w:val="20"/>
                 <w:szCs w:val="20"/>
+                <w:highlight w:val="yellow"/>
               </w:rPr>
               <w:t xml:space="preserve"> Executive</w:t>
             </w:r>
@@ -4855,6 +5061,7 @@
                 <w:rFonts w:ascii="Arial" w:hAnsi="Arial" w:cs="Arial"/>
                 <w:sz w:val="20"/>
                 <w:szCs w:val="20"/>
+                <w:highlight w:val="yellow"/>
               </w:rPr>
             </w:pPr>
             <w:r>
@@ -4862,6 +5069,7 @@
                 <w:rFonts w:ascii="Arial" w:hAnsi="Arial" w:cs="Arial"/>
                 <w:sz w:val="20"/>
                 <w:szCs w:val="20"/>
+                <w:highlight w:val="yellow"/>
               </w:rPr>
               <w:t>Senior Manager</w:t>
             </w:r>
@@ -4878,6 +5086,7 @@
                 <w:rFonts w:ascii="Arial" w:hAnsi="Arial" w:cs="Arial"/>
                 <w:sz w:val="20"/>
                 <w:szCs w:val="20"/>
+                <w:highlight w:val="yellow"/>
               </w:rPr>
             </w:pPr>
             <w:r>
@@ -4885,6 +5094,7 @@
                 <w:rFonts w:ascii="Arial" w:hAnsi="Arial" w:cs="Arial"/>
                 <w:sz w:val="20"/>
                 <w:szCs w:val="20"/>
+                <w:highlight w:val="yellow"/>
               </w:rPr>
               <w:t>Supervisor</w:t>
             </w:r>
@@ -4914,6 +5124,7 @@
               <w:rPr>
                 <w:sz w:val="20"/>
                 <w:szCs w:val="20"/>
+                <w:highlight w:val="yellow"/>
               </w:rPr>
             </w:pPr>
             <w:proofErr w:type="spellStart"/>
@@ -4921,14 +5132,24 @@
               <w:rPr>
                 <w:sz w:val="20"/>
                 <w:szCs w:val="20"/>
+                <w:highlight w:val="yellow"/>
               </w:rPr>
               <w:lastRenderedPageBreak/>
-              <w:t>Assigned_</w:t>
-            </w:r>
-            <w:r>
-              <w:rPr>
-                <w:sz w:val="20"/>
-                <w:szCs w:val="20"/>
+              <w:t>a</w:t>
+            </w:r>
+            <w:r>
+              <w:rPr>
+                <w:sz w:val="20"/>
+                <w:szCs w:val="20"/>
+                <w:highlight w:val="yellow"/>
+              </w:rPr>
+              <w:t>ssigned_</w:t>
+            </w:r>
+            <w:r>
+              <w:rPr>
+                <w:sz w:val="20"/>
+                <w:szCs w:val="20"/>
+                <w:highlight w:val="yellow"/>
               </w:rPr>
               <w:t>b</w:t>
             </w:r>
@@ -4936,6 +5157,7 @@
               <w:rPr>
                 <w:sz w:val="20"/>
                 <w:szCs w:val="20"/>
+                <w:highlight w:val="yellow"/>
               </w:rPr>
               <w:t>y</w:t>
             </w:r>
@@ -4964,12 +5186,14 @@
               <w:rPr>
                 <w:sz w:val="20"/>
                 <w:szCs w:val="20"/>
+                <w:highlight w:val="yellow"/>
               </w:rPr>
             </w:pPr>
             <w:r>
               <w:rPr>
                 <w:sz w:val="20"/>
                 <w:szCs w:val="20"/>
+                <w:highlight w:val="yellow"/>
               </w:rPr>
               <w:t xml:space="preserve">TID name for assigned </w:t>
             </w:r>
@@ -4977,6 +5201,7 @@
               <w:rPr>
                 <w:sz w:val="20"/>
                 <w:szCs w:val="20"/>
+                <w:highlight w:val="yellow"/>
               </w:rPr>
               <w:t>by</w:t>
             </w:r>
@@ -4984,6 +5209,7 @@
               <w:rPr>
                 <w:sz w:val="20"/>
                 <w:szCs w:val="20"/>
+                <w:highlight w:val="yellow"/>
               </w:rPr>
               <w:t xml:space="preserve"> (ENUM; Michael Ang Wei Poh, Seak Sophanna, Ty Sopheaktra)</w:t>
             </w:r>
@@ -5013,6 +5239,7 @@
               <w:rPr>
                 <w:sz w:val="20"/>
                 <w:szCs w:val="20"/>
+                <w:highlight w:val="yellow"/>
               </w:rPr>
             </w:pPr>
             <w:proofErr w:type="spellStart"/>
@@ -5020,8 +5247,17 @@
               <w:rPr>
                 <w:sz w:val="20"/>
                 <w:szCs w:val="20"/>
-              </w:rPr>
-              <w:t>Latest_user</w:t>
+                <w:highlight w:val="yellow"/>
+              </w:rPr>
+              <w:t>l</w:t>
+            </w:r>
+            <w:r>
+              <w:rPr>
+                <w:sz w:val="20"/>
+                <w:szCs w:val="20"/>
+                <w:highlight w:val="yellow"/>
+              </w:rPr>
+              <w:t>atest_user</w:t>
             </w:r>
             <w:proofErr w:type="spellEnd"/>
           </w:p>
@@ -5048,14 +5284,162 @@
               <w:rPr>
                 <w:sz w:val="20"/>
                 <w:szCs w:val="20"/>
+                <w:highlight w:val="yellow"/>
               </w:rPr>
             </w:pPr>
             <w:r>
               <w:rPr>
                 <w:sz w:val="20"/>
                 <w:szCs w:val="20"/>
+                <w:highlight w:val="yellow"/>
               </w:rPr>
               <w:t>the previous user used the asset</w:t>
+            </w:r>
+          </w:p>
+        </w:tc>
+      </w:tr>
+      <w:tr>
+        <w:tc>
+          <w:tcPr>
+            <w:tcW w:w="2800" w:type="dxa"/>
+            <w:tcBorders>
+              <w:top w:val="single" w:sz="1" w:space="0" w:color="CCCCCC"/>
+              <w:left w:val="single" w:sz="1" w:space="0" w:color="CCCCCC"/>
+              <w:bottom w:val="single" w:sz="1" w:space="0" w:color="CCCCCC"/>
+              <w:right w:val="single" w:sz="1" w:space="0" w:color="CCCCCC"/>
+            </w:tcBorders>
+            <w:shd w:val="clear" w:color="auto" w:fill="FFFFFF"/>
+            <w:tcMar>
+              <w:top w:w="80" w:type="dxa"/>
+              <w:left w:w="150" w:type="dxa"/>
+              <w:bottom w:w="80" w:type="dxa"/>
+              <w:right w:w="150" w:type="dxa"/>
+            </w:tcMar>
+          </w:tcPr>
+          <w:p>
+            <w:pPr>
+              <w:rPr>
+                <w:sz w:val="20"/>
+                <w:szCs w:val="20"/>
+                <w:highlight w:val="yellow"/>
+              </w:rPr>
+            </w:pPr>
+            <w:proofErr w:type="spellStart"/>
+            <w:r>
+              <w:rPr>
+                <w:sz w:val="20"/>
+                <w:szCs w:val="20"/>
+                <w:highlight w:val="yellow"/>
+              </w:rPr>
+              <w:t>returned_condition</w:t>
+            </w:r>
+            <w:proofErr w:type="spellEnd"/>
+          </w:p>
+        </w:tc>
+        <w:tc>
+          <w:tcPr>
+            <w:tcW w:w="6560" w:type="dxa"/>
+            <w:tcBorders>
+              <w:top w:val="single" w:sz="1" w:space="0" w:color="CCCCCC"/>
+              <w:left w:val="single" w:sz="1" w:space="0" w:color="CCCCCC"/>
+              <w:bottom w:val="single" w:sz="1" w:space="0" w:color="CCCCCC"/>
+              <w:right w:val="single" w:sz="1" w:space="0" w:color="CCCCCC"/>
+            </w:tcBorders>
+            <w:shd w:val="clear" w:color="auto" w:fill="FFFFFF"/>
+            <w:tcMar>
+              <w:top w:w="80" w:type="dxa"/>
+              <w:left w:w="150" w:type="dxa"/>
+              <w:bottom w:w="80" w:type="dxa"/>
+              <w:right w:w="150" w:type="dxa"/>
+            </w:tcMar>
+          </w:tcPr>
+          <w:p>
+            <w:pPr>
+              <w:rPr>
+                <w:sz w:val="20"/>
+                <w:szCs w:val="20"/>
+                <w:highlight w:val="yellow"/>
+              </w:rPr>
+            </w:pPr>
+            <w:r>
+              <w:rPr>
+                <w:sz w:val="20"/>
+                <w:szCs w:val="20"/>
+                <w:highlight w:val="yellow"/>
+              </w:rPr>
+              <w:t>Purpose return of returning</w:t>
+            </w:r>
+          </w:p>
+        </w:tc>
+      </w:tr>
+      <w:tr>
+        <w:tc>
+          <w:tcPr>
+            <w:tcW w:w="2800" w:type="dxa"/>
+            <w:tcBorders>
+              <w:top w:val="single" w:sz="1" w:space="0" w:color="CCCCCC"/>
+              <w:left w:val="single" w:sz="1" w:space="0" w:color="CCCCCC"/>
+              <w:bottom w:val="single" w:sz="1" w:space="0" w:color="CCCCCC"/>
+              <w:right w:val="single" w:sz="1" w:space="0" w:color="CCCCCC"/>
+            </w:tcBorders>
+            <w:shd w:val="clear" w:color="auto" w:fill="FFFFFF"/>
+            <w:tcMar>
+              <w:top w:w="80" w:type="dxa"/>
+              <w:left w:w="150" w:type="dxa"/>
+              <w:bottom w:w="80" w:type="dxa"/>
+              <w:right w:w="150" w:type="dxa"/>
+            </w:tcMar>
+          </w:tcPr>
+          <w:p>
+            <w:pPr>
+              <w:rPr>
+                <w:sz w:val="20"/>
+                <w:szCs w:val="20"/>
+                <w:highlight w:val="yellow"/>
+              </w:rPr>
+            </w:pPr>
+            <w:r>
+              <w:rPr>
+                <w:sz w:val="20"/>
+                <w:szCs w:val="20"/>
+                <w:highlight w:val="yellow"/>
+              </w:rPr>
+              <w:t>Noted</w:t>
+            </w:r>
+          </w:p>
+        </w:tc>
+        <w:tc>
+          <w:tcPr>
+            <w:tcW w:w="6560" w:type="dxa"/>
+            <w:tcBorders>
+              <w:top w:val="single" w:sz="1" w:space="0" w:color="CCCCCC"/>
+              <w:left w:val="single" w:sz="1" w:space="0" w:color="CCCCCC"/>
+              <w:bottom w:val="single" w:sz="1" w:space="0" w:color="CCCCCC"/>
+              <w:right w:val="single" w:sz="1" w:space="0" w:color="CCCCCC"/>
+            </w:tcBorders>
+            <w:shd w:val="clear" w:color="auto" w:fill="FFFFFF"/>
+            <w:tcMar>
+              <w:top w:w="80" w:type="dxa"/>
+              <w:left w:w="150" w:type="dxa"/>
+              <w:bottom w:w="80" w:type="dxa"/>
+              <w:right w:w="150" w:type="dxa"/>
+            </w:tcMar>
+          </w:tcPr>
+          <w:p>
+            <w:pPr>
+              <w:rPr>
+                <w:sz w:val="20"/>
+                <w:szCs w:val="20"/>
+                <w:highlight w:val="yellow"/>
+              </w:rPr>
+            </w:pPr>
+            <w:r>
+              <w:rPr>
+                <w:sz w:val="20"/>
+                <w:szCs w:val="20"/>
+                <w:highlight w:val="yellow"/>
+              </w:rPr>
+              <w:t>Text</w:t>
             </w:r>
           </w:p>
         </w:tc>
@@ -5086,6 +5470,7 @@
               <w:rPr>
                 <w:sz w:val="20"/>
                 <w:szCs w:val="20"/>
+                <w:highlight w:val="yellow"/>
               </w:rPr>
             </w:pPr>
             <w:proofErr w:type="spellStart"/>
@@ -5093,13 +5478,15 @@
               <w:rPr>
                 <w:sz w:val="20"/>
                 <w:szCs w:val="20"/>
-              </w:rPr>
-              <w:t>A</w:t>
-            </w:r>
-            <w:r>
-              <w:rPr>
-                <w:sz w:val="20"/>
-                <w:szCs w:val="20"/>
+                <w:highlight w:val="yellow"/>
+              </w:rPr>
+              <w:t>a</w:t>
+            </w:r>
+            <w:r>
+              <w:rPr>
+                <w:sz w:val="20"/>
+                <w:szCs w:val="20"/>
+                <w:highlight w:val="yellow"/>
               </w:rPr>
               <w:t>ssigned_date</w:t>
             </w:r>
@@ -5108,6 +5495,7 @@
               <w:rPr>
                 <w:sz w:val="20"/>
                 <w:szCs w:val="20"/>
+                <w:highlight w:val="yellow"/>
               </w:rPr>
               <w:t xml:space="preserve">, </w:t>
             </w:r>
@@ -5116,13 +5504,15 @@
               <w:rPr>
                 <w:sz w:val="20"/>
                 <w:szCs w:val="20"/>
-              </w:rPr>
-              <w:t>R</w:t>
-            </w:r>
-            <w:r>
-              <w:rPr>
-                <w:sz w:val="20"/>
-                <w:szCs w:val="20"/>
+                <w:highlight w:val="yellow"/>
+              </w:rPr>
+              <w:t>r</w:t>
+            </w:r>
+            <w:r>
+              <w:rPr>
+                <w:sz w:val="20"/>
+                <w:szCs w:val="20"/>
+                <w:highlight w:val="yellow"/>
               </w:rPr>
               <w:t>eturned_date</w:t>
             </w:r>
@@ -5151,12 +5541,14 @@
               <w:rPr>
                 <w:sz w:val="20"/>
                 <w:szCs w:val="20"/>
+                <w:highlight w:val="yellow"/>
               </w:rPr>
             </w:pPr>
             <w:r>
               <w:rPr>
                 <w:sz w:val="20"/>
                 <w:szCs w:val="20"/>
+                <w:highlight w:val="yellow"/>
               </w:rPr>
               <w:t>Lifecycle dates</w:t>
             </w:r>
@@ -5827,6 +6219,7 @@
                 <w:sz w:val="20"/>
                 <w:szCs w:val="20"/>
               </w:rPr>
+              <w:lastRenderedPageBreak/>
               <w:t>issue_status</w:t>
             </w:r>
             <w:proofErr w:type="spellEnd"/>
@@ -6001,7 +6394,6 @@
         <w:pStyle w:val="Heading2"/>
       </w:pPr>
       <w:r>
-        <w:lastRenderedPageBreak/>
         <w:t>Table: users (New)</w:t>
       </w:r>
     </w:p>
@@ -6756,15 +7148,27 @@
         <w:spacing w:before="40" w:after="40"/>
       </w:pPr>
       <w:r>
+        <w:rPr>
+          <w:highlight w:val="yellow"/>
+        </w:rPr>
         <w:t>POST /</w:t>
       </w:r>
       <w:proofErr w:type="spellStart"/>
       <w:r>
+        <w:rPr>
+          <w:highlight w:val="yellow"/>
+        </w:rPr>
         <w:t>api</w:t>
       </w:r>
       <w:proofErr w:type="spellEnd"/>
       <w:r>
-        <w:t>/assignments — assign asset (AUTH)</w:t>
+        <w:rPr>
+          <w:highlight w:val="yellow"/>
+        </w:rPr>
+        <w:t>/assignments — assign asset</w:t>
+      </w:r>
+      <w:r>
+        <w:t xml:space="preserve"> (AUTH)</w:t>
       </w:r>
     </w:p>
     <w:p>
@@ -6777,18 +7181,33 @@
         <w:spacing w:before="40" w:after="40"/>
       </w:pPr>
       <w:r>
+        <w:rPr>
+          <w:highlight w:val="yellow"/>
+        </w:rPr>
         <w:t>POST /</w:t>
       </w:r>
       <w:proofErr w:type="spellStart"/>
       <w:r>
+        <w:rPr>
+          <w:highlight w:val="yellow"/>
+        </w:rPr>
         <w:t>api</w:t>
       </w:r>
       <w:proofErr w:type="spellEnd"/>
       <w:r>
+        <w:rPr>
+          <w:highlight w:val="yellow"/>
+        </w:rPr>
         <w:t xml:space="preserve">/assignments/{id}/return — return asset </w:t>
       </w:r>
       <w:r>
-        <w:t>change the statue (</w:t>
+        <w:rPr>
+          <w:highlight w:val="yellow"/>
+        </w:rPr>
+        <w:t>change the statue</w:t>
+      </w:r>
+      <w:r>
+        <w:t xml:space="preserve"> (</w:t>
       </w:r>
       <w:r>
         <w:t>AUTH)</w:t>
@@ -6804,15 +7223,27 @@
         <w:spacing w:before="40" w:after="40"/>
       </w:pPr>
       <w:r>
+        <w:rPr>
+          <w:highlight w:val="yellow"/>
+        </w:rPr>
         <w:t>GET /</w:t>
       </w:r>
       <w:proofErr w:type="spellStart"/>
       <w:r>
+        <w:rPr>
+          <w:highlight w:val="yellow"/>
+        </w:rPr>
         <w:t>api</w:t>
       </w:r>
       <w:proofErr w:type="spellEnd"/>
       <w:r>
-        <w:t>/assets/{id}/assignments — view history (AUTH)</w:t>
+        <w:rPr>
+          <w:highlight w:val="yellow"/>
+        </w:rPr>
+        <w:t>/assets/{id}/assignments — view history</w:t>
+      </w:r>
+      <w:r>
+        <w:t xml:space="preserve"> (AUTH)</w:t>
       </w:r>
     </w:p>
     <w:p>
@@ -6825,31 +7256,27 @@
         <w:spacing w:before="40" w:after="40"/>
       </w:pPr>
       <w:r>
+        <w:rPr>
+          <w:highlight w:val="yellow"/>
+        </w:rPr>
         <w:t>UPDATE /</w:t>
       </w:r>
       <w:proofErr w:type="spellStart"/>
       <w:r>
+        <w:rPr>
+          <w:highlight w:val="yellow"/>
+        </w:rPr>
         <w:t>api</w:t>
       </w:r>
       <w:proofErr w:type="spellEnd"/>
       <w:r>
-        <w:t xml:space="preserve">/assignment/{id} </w:t>
-      </w:r>
-      <w:r>
-        <w:t>—</w:t>
-      </w:r>
-      <w:r>
-        <w:t xml:space="preserve"> update the assignments</w:t>
-      </w:r>
-      <w:bookmarkStart w:id="0" w:name="_GoBack"/>
-      <w:bookmarkEnd w:id="0"/>
-    </w:p>
-    <w:p>
-      <w:pPr>
-        <w:pStyle w:val="Heading2"/>
-      </w:pPr>
-      <w:r>
-        <w:t>Procurement APIs</w:t>
+        <w:rPr>
+          <w:highlight w:val="yellow"/>
+        </w:rPr>
+        <w:t>/assignment/{id} — update the assignments</w:t>
+      </w:r>
+      <w:r>
+        <w:t xml:space="preserve"> (AUTH)</w:t>
       </w:r>
     </w:p>
     <w:p>
@@ -6862,15 +7289,35 @@
         <w:spacing w:before="40" w:after="40"/>
       </w:pPr>
       <w:r>
-        <w:t>POST /</w:t>
+        <w:rPr>
+          <w:highlight w:val="yellow"/>
+        </w:rPr>
+        <w:t>DELETE /</w:t>
       </w:r>
       <w:proofErr w:type="spellStart"/>
       <w:r>
+        <w:rPr>
+          <w:highlight w:val="yellow"/>
+        </w:rPr>
         <w:t>api</w:t>
       </w:r>
       <w:proofErr w:type="spellEnd"/>
       <w:r>
-        <w:t>/assets/{id}/procurement — create (AUTH)</w:t>
+        <w:rPr>
+          <w:highlight w:val="yellow"/>
+        </w:rPr>
+        <w:t>/assignment/{id}/return – delete the assignments</w:t>
+      </w:r>
+      <w:r>
+        <w:t xml:space="preserve"> (AUTH)</w:t>
+      </w:r>
+    </w:p>
+    <w:p>
+      <w:pPr>
+        <w:pStyle w:val="Heading2"/>
+      </w:pPr>
+      <w:r>
+        <w:t>Procurement APIs</w:t>
       </w:r>
     </w:p>
     <w:p>
@@ -6883,7 +7330,7 @@
         <w:spacing w:before="40" w:after="40"/>
       </w:pPr>
       <w:r>
-        <w:t>PUT /</w:t>
+        <w:t>POST /</w:t>
       </w:r>
       <w:proofErr w:type="spellStart"/>
       <w:r>
@@ -6891,15 +7338,7 @@
       </w:r>
       <w:proofErr w:type="spellEnd"/>
       <w:r>
-        <w:t>/assets/{id}/procurement — update (AUTH)</w:t>
-      </w:r>
-    </w:p>
-    <w:p>
-      <w:pPr>
-        <w:pStyle w:val="Heading2"/>
-      </w:pPr>
-      <w:r>
-        <w:t>Issue APIs</w:t>
+        <w:t>/assets/{id}/procurement — create (AUTH)</w:t>
       </w:r>
     </w:p>
     <w:p>
@@ -6912,7 +7351,20 @@
         <w:spacing w:before="40" w:after="40"/>
       </w:pPr>
       <w:r>
-        <w:t>POST /</w:t>
+        <w:lastRenderedPageBreak/>
+        <w:t>P</w:t>
+      </w:r>
+      <w:r>
+        <w:t>A</w:t>
+      </w:r>
+      <w:r>
+        <w:t>T</w:t>
+      </w:r>
+      <w:r>
+        <w:t>CH</w:t>
+      </w:r>
+      <w:r>
+        <w:t xml:space="preserve"> /</w:t>
       </w:r>
       <w:proofErr w:type="spellStart"/>
       <w:r>
@@ -6920,7 +7372,7 @@
       </w:r>
       <w:proofErr w:type="spellEnd"/>
       <w:r>
-        <w:t>/assets/{id}/issues — report issue (AUTH)</w:t>
+        <w:t>/assets/{id}/procurement — update (AUTH)</w:t>
       </w:r>
     </w:p>
     <w:p>
@@ -6933,7 +7385,7 @@
         <w:spacing w:before="40" w:after="40"/>
       </w:pPr>
       <w:r>
-        <w:t>PUT /</w:t>
+        <w:t>GET /</w:t>
       </w:r>
       <w:proofErr w:type="spellStart"/>
       <w:r>
@@ -6941,7 +7393,7 @@
       </w:r>
       <w:proofErr w:type="spellEnd"/>
       <w:r>
-        <w:t>/issues/{id} — update issue (AUTH)</w:t>
+        <w:t>/assets/{id}/procurement/ — view (AUTH)</w:t>
       </w:r>
     </w:p>
     <w:p>
@@ -6953,16 +7405,27 @@
         </w:numPr>
         <w:spacing w:before="40" w:after="40"/>
       </w:pPr>
-      <w:r>
-        <w:t>GET /</w:t>
-      </w:r>
       <w:proofErr w:type="spellStart"/>
       <w:r>
+        <w:t>D</w:t>
+      </w:r>
+      <w:proofErr w:type="spellEnd"/>
+      <w:r>
+        <w:t>ELETE /</w:t>
+      </w:r>
+      <w:proofErr w:type="spellStart"/>
+      <w:r>
         <w:t>api</w:t>
       </w:r>
       <w:proofErr w:type="spellEnd"/>
       <w:r>
-        <w:t>/assets/{id}/issues — view issues (AUTH)</w:t>
+        <w:t>/assets/</w:t>
+      </w:r>
+      <w:r>
+        <w:t>procurement</w:t>
+      </w:r>
+      <w:r>
+        <w:t>/{id} — delete (AUTH)</w:t>
       </w:r>
     </w:p>
     <w:p>
@@ -6970,7 +7433,7 @@
         <w:pStyle w:val="Heading2"/>
       </w:pPr>
       <w:r>
-        <w:t>Report APIs (Public)</w:t>
+        <w:t>Issue APIs</w:t>
       </w:r>
     </w:p>
     <w:p>
@@ -6983,7 +7446,77 @@
         <w:spacing w:before="40" w:after="40"/>
       </w:pPr>
       <w:r>
-        <w:lastRenderedPageBreak/>
+        <w:t>POST /</w:t>
+      </w:r>
+      <w:proofErr w:type="spellStart"/>
+      <w:r>
+        <w:t>api</w:t>
+      </w:r>
+      <w:proofErr w:type="spellEnd"/>
+      <w:r>
+        <w:t>/assets/{id}/issues — report issue (AUTH)</w:t>
+      </w:r>
+    </w:p>
+    <w:p>
+      <w:pPr>
+        <w:pStyle w:val="ListParagraph"/>
+        <w:numPr>
+          <w:ilvl w:val="0"/>
+          <w:numId w:val="2"/>
+        </w:numPr>
+        <w:spacing w:before="40" w:after="40"/>
+      </w:pPr>
+      <w:r>
+        <w:t>PUT /</w:t>
+      </w:r>
+      <w:proofErr w:type="spellStart"/>
+      <w:r>
+        <w:t>api</w:t>
+      </w:r>
+      <w:proofErr w:type="spellEnd"/>
+      <w:r>
+        <w:t>/issues/{id} — update issue (AUTH)</w:t>
+      </w:r>
+    </w:p>
+    <w:p>
+      <w:pPr>
+        <w:pStyle w:val="ListParagraph"/>
+        <w:numPr>
+          <w:ilvl w:val="0"/>
+          <w:numId w:val="2"/>
+        </w:numPr>
+        <w:spacing w:before="40" w:after="40"/>
+      </w:pPr>
+      <w:r>
+        <w:t>GET /</w:t>
+      </w:r>
+      <w:proofErr w:type="spellStart"/>
+      <w:r>
+        <w:t>api</w:t>
+      </w:r>
+      <w:proofErr w:type="spellEnd"/>
+      <w:r>
+        <w:t>/assets/{id}/issues — view issues (AUTH)</w:t>
+      </w:r>
+    </w:p>
+    <w:p>
+      <w:pPr>
+        <w:pStyle w:val="Heading2"/>
+      </w:pPr>
+      <w:r>
+        <w:t>Report APIs (Public)</w:t>
+      </w:r>
+    </w:p>
+    <w:p>
+      <w:pPr>
+        <w:pStyle w:val="ListParagraph"/>
+        <w:numPr>
+          <w:ilvl w:val="0"/>
+          <w:numId w:val="2"/>
+        </w:numPr>
+        <w:spacing w:before="40" w:after="40"/>
+      </w:pPr>
+      <w:r>
         <w:t>GET /</w:t>
       </w:r>
       <w:proofErr w:type="spellStart"/>
@@ -7660,6 +8193,7 @@
         <w:pStyle w:val="Heading2"/>
       </w:pPr>
       <w:r>
+        <w:lastRenderedPageBreak/>
         <w:t>Procurement Rules</w:t>
       </w:r>
     </w:p>
@@ -8686,7 +9220,6 @@
         <w:spacing w:before="80" w:after="80"/>
       </w:pPr>
       <w:r>
-        <w:lastRenderedPageBreak/>
         <w:t>Authentication is handled via JWT-based Spring Security, with role-based access control separating public read-only views (dashboard, asset status) from protected management operations. The first release focuses on core asset lifecycle functions — asset registration, assignment, return, issue tracking, and reporting — while leaving room for future extensions as the process matures.</w:t>
       </w:r>
     </w:p>
@@ -8715,6 +9248,8 @@
       <w:pPr>
         <w:spacing w:before="60" w:after="60"/>
       </w:pPr>
+      <w:bookmarkStart w:id="0" w:name="_GoBack"/>
+      <w:bookmarkEnd w:id="0"/>
     </w:p>
     <w:sectPr>
       <w:footerReference w:type="default" r:id="rId7"/>

</xml_diff>

<commit_message>
docs: Add temporary Word document lock file for project perspective.
</commit_message>
<xml_diff>
--- a/document/TID_Asset_Management_Project_Perspective.docx
+++ b/document/TID_Asset_Management_Project_Perspective.docx
@@ -535,8 +535,6 @@
       <w:r>
         <w:t>Issue Module</w:t>
       </w:r>
-      <w:bookmarkStart w:id="0" w:name="_GoBack"/>
-      <w:bookmarkEnd w:id="0"/>
     </w:p>
     <w:p>
       <w:pPr>
@@ -1913,7 +1911,79 @@
                 <w:szCs w:val="20"/>
                 <w:highlight w:val="yellow"/>
               </w:rPr>
-              <w:t>AVAILABLE, IN_USE, UNDER_REPAIR, LOST, DAMAGED</w:t>
+              <w:t xml:space="preserve">AVAILABLE, IN_USE, </w:t>
+            </w:r>
+            <w:r>
+              <w:rPr>
+                <w:rStyle w:val="hljs-string"/>
+                <w:highlight w:val="yellow"/>
+              </w:rPr>
+              <w:t>'DAMAGED'</w:t>
+            </w:r>
+            <w:r>
+              <w:rPr>
+                <w:highlight w:val="yellow"/>
+              </w:rPr>
+              <w:t xml:space="preserve">, </w:t>
+            </w:r>
+            <w:r>
+              <w:rPr>
+                <w:rStyle w:val="hljs-string"/>
+                <w:highlight w:val="yellow"/>
+              </w:rPr>
+              <w:t>'UNDER_REPAIR'</w:t>
+            </w:r>
+            <w:r>
+              <w:rPr>
+                <w:highlight w:val="yellow"/>
+              </w:rPr>
+              <w:t xml:space="preserve">, </w:t>
+            </w:r>
+            <w:r>
+              <w:rPr>
+                <w:rStyle w:val="hljs-string"/>
+                <w:highlight w:val="yellow"/>
+              </w:rPr>
+              <w:t>'LOST'</w:t>
+            </w:r>
+            <w:r>
+              <w:rPr>
+                <w:highlight w:val="yellow"/>
+              </w:rPr>
+              <w:t xml:space="preserve">, </w:t>
+            </w:r>
+            <w:r>
+              <w:rPr>
+                <w:rStyle w:val="hljs-string"/>
+                <w:highlight w:val="yellow"/>
+              </w:rPr>
+              <w:t>'MALFUNCTION'</w:t>
+            </w:r>
+            <w:r>
+              <w:rPr>
+                <w:highlight w:val="yellow"/>
+              </w:rPr>
+              <w:t xml:space="preserve">, </w:t>
+            </w:r>
+            <w:r>
+              <w:rPr>
+                <w:rStyle w:val="hljs-string"/>
+                <w:highlight w:val="yellow"/>
+              </w:rPr>
+              <w:t>'MAINTENANCE'</w:t>
+            </w:r>
+            <w:r>
+              <w:rPr>
+                <w:highlight w:val="yellow"/>
+              </w:rPr>
+              <w:t xml:space="preserve">, </w:t>
+            </w:r>
+            <w:r>
+              <w:rPr>
+                <w:rStyle w:val="hljs-string"/>
+                <w:highlight w:val="yellow"/>
+              </w:rPr>
+              <w:t>'OTHER'</w:t>
             </w:r>
           </w:p>
         </w:tc>
@@ -4103,14 +4173,7 @@
                 <w:sz w:val="20"/>
                 <w:szCs w:val="20"/>
               </w:rPr>
-              <w:t>Check with User Token head</w:t>
-            </w:r>
-            <w:r>
-              <w:rPr>
-                <w:sz w:val="20"/>
-                <w:szCs w:val="20"/>
-              </w:rPr>
-              <w:t xml:space="preserve"> and put username</w:t>
+              <w:t>Check with User Token head and put username</w:t>
             </w:r>
           </w:p>
         </w:tc>
@@ -4138,15 +4201,19 @@
               <w:rPr>
                 <w:sz w:val="20"/>
                 <w:szCs w:val="20"/>
-              </w:rPr>
-            </w:pPr>
-            <w:r>
-              <w:rPr>
-                <w:sz w:val="20"/>
-                <w:szCs w:val="20"/>
-              </w:rPr>
-              <w:t>Issue_</w:t>
-            </w:r>
+                <w:highlight w:val="yellow"/>
+              </w:rPr>
+            </w:pPr>
+            <w:proofErr w:type="spellStart"/>
+            <w:r>
+              <w:rPr>
+                <w:sz w:val="20"/>
+                <w:szCs w:val="20"/>
+                <w:highlight w:val="yellow"/>
+              </w:rPr>
+              <w:t>returned_condition</w:t>
+            </w:r>
+            <w:proofErr w:type="spellEnd"/>
           </w:p>
         </w:tc>
         <w:tc>
@@ -4171,152 +4238,16 @@
               <w:rPr>
                 <w:sz w:val="20"/>
                 <w:szCs w:val="20"/>
-              </w:rPr>
-            </w:pPr>
-          </w:p>
-        </w:tc>
-      </w:tr>
-      <w:tr>
-        <w:tc>
-          <w:tcPr>
-            <w:tcW w:w="2800" w:type="dxa"/>
-            <w:tcBorders>
-              <w:top w:val="single" w:sz="1" w:space="0" w:color="CCCCCC"/>
-              <w:left w:val="single" w:sz="1" w:space="0" w:color="CCCCCC"/>
-              <w:bottom w:val="single" w:sz="1" w:space="0" w:color="CCCCCC"/>
-              <w:right w:val="single" w:sz="1" w:space="0" w:color="CCCCCC"/>
-            </w:tcBorders>
-            <w:shd w:val="clear" w:color="auto" w:fill="FFFFFF"/>
-            <w:tcMar>
-              <w:top w:w="80" w:type="dxa"/>
-              <w:left w:w="150" w:type="dxa"/>
-              <w:bottom w:w="80" w:type="dxa"/>
-              <w:right w:w="150" w:type="dxa"/>
-            </w:tcMar>
-          </w:tcPr>
-          <w:p>
-            <w:pPr>
-              <w:rPr>
-                <w:sz w:val="20"/>
-                <w:szCs w:val="20"/>
-              </w:rPr>
-            </w:pPr>
-            <w:proofErr w:type="spellStart"/>
-            <w:r>
-              <w:rPr>
-                <w:sz w:val="20"/>
-                <w:szCs w:val="20"/>
-              </w:rPr>
-              <w:t>returned_condition</w:t>
-            </w:r>
-            <w:proofErr w:type="spellEnd"/>
-          </w:p>
-        </w:tc>
-        <w:tc>
-          <w:tcPr>
-            <w:tcW w:w="6560" w:type="dxa"/>
-            <w:tcBorders>
-              <w:top w:val="single" w:sz="1" w:space="0" w:color="CCCCCC"/>
-              <w:left w:val="single" w:sz="1" w:space="0" w:color="CCCCCC"/>
-              <w:bottom w:val="single" w:sz="1" w:space="0" w:color="CCCCCC"/>
-              <w:right w:val="single" w:sz="1" w:space="0" w:color="CCCCCC"/>
-            </w:tcBorders>
-            <w:shd w:val="clear" w:color="auto" w:fill="FFFFFF"/>
-            <w:tcMar>
-              <w:top w:w="80" w:type="dxa"/>
-              <w:left w:w="150" w:type="dxa"/>
-              <w:bottom w:w="80" w:type="dxa"/>
-              <w:right w:w="150" w:type="dxa"/>
-            </w:tcMar>
-          </w:tcPr>
-          <w:p>
-            <w:pPr>
-              <w:rPr>
-                <w:sz w:val="20"/>
-                <w:szCs w:val="20"/>
-              </w:rPr>
-            </w:pPr>
-            <w:r>
-              <w:rPr>
-                <w:sz w:val="20"/>
-                <w:szCs w:val="20"/>
+                <w:highlight w:val="yellow"/>
+              </w:rPr>
+            </w:pPr>
+            <w:r>
+              <w:rPr>
+                <w:sz w:val="20"/>
+                <w:szCs w:val="20"/>
+                <w:highlight w:val="yellow"/>
               </w:rPr>
               <w:t>Purpose return of returning</w:t>
-            </w:r>
-            <w:r>
-              <w:rPr>
-                <w:sz w:val="20"/>
-                <w:szCs w:val="20"/>
-              </w:rPr>
-              <w:t xml:space="preserve"> if not issue</w:t>
-            </w:r>
-          </w:p>
-        </w:tc>
-      </w:tr>
-      <w:tr>
-        <w:tc>
-          <w:tcPr>
-            <w:tcW w:w="2800" w:type="dxa"/>
-            <w:tcBorders>
-              <w:top w:val="single" w:sz="1" w:space="0" w:color="CCCCCC"/>
-              <w:left w:val="single" w:sz="1" w:space="0" w:color="CCCCCC"/>
-              <w:bottom w:val="single" w:sz="1" w:space="0" w:color="CCCCCC"/>
-              <w:right w:val="single" w:sz="1" w:space="0" w:color="CCCCCC"/>
-            </w:tcBorders>
-            <w:shd w:val="clear" w:color="auto" w:fill="FFFFFF"/>
-            <w:tcMar>
-              <w:top w:w="80" w:type="dxa"/>
-              <w:left w:w="150" w:type="dxa"/>
-              <w:bottom w:w="80" w:type="dxa"/>
-              <w:right w:w="150" w:type="dxa"/>
-            </w:tcMar>
-          </w:tcPr>
-          <w:p>
-            <w:pPr>
-              <w:rPr>
-                <w:sz w:val="20"/>
-                <w:szCs w:val="20"/>
-              </w:rPr>
-            </w:pPr>
-            <w:r>
-              <w:rPr>
-                <w:sz w:val="20"/>
-                <w:szCs w:val="20"/>
-              </w:rPr>
-              <w:t>Noted</w:t>
-            </w:r>
-          </w:p>
-        </w:tc>
-        <w:tc>
-          <w:tcPr>
-            <w:tcW w:w="6560" w:type="dxa"/>
-            <w:tcBorders>
-              <w:top w:val="single" w:sz="1" w:space="0" w:color="CCCCCC"/>
-              <w:left w:val="single" w:sz="1" w:space="0" w:color="CCCCCC"/>
-              <w:bottom w:val="single" w:sz="1" w:space="0" w:color="CCCCCC"/>
-              <w:right w:val="single" w:sz="1" w:space="0" w:color="CCCCCC"/>
-            </w:tcBorders>
-            <w:shd w:val="clear" w:color="auto" w:fill="FFFFFF"/>
-            <w:tcMar>
-              <w:top w:w="80" w:type="dxa"/>
-              <w:left w:w="150" w:type="dxa"/>
-              <w:bottom w:w="80" w:type="dxa"/>
-              <w:right w:w="150" w:type="dxa"/>
-            </w:tcMar>
-          </w:tcPr>
-          <w:p>
-            <w:pPr>
-              <w:rPr>
-                <w:sz w:val="20"/>
-                <w:szCs w:val="20"/>
-              </w:rPr>
-            </w:pPr>
-            <w:r>
-              <w:rPr>
-                <w:sz w:val="20"/>
-                <w:szCs w:val="20"/>
-              </w:rPr>
-              <w:t>Text</w:t>
             </w:r>
           </w:p>
         </w:tc>
@@ -4357,7 +4288,6 @@
                 <w:szCs w:val="20"/>
                 <w:highlight w:val="yellow"/>
               </w:rPr>
-              <w:lastRenderedPageBreak/>
               <w:t>a</w:t>
             </w:r>
             <w:r>
@@ -5022,12 +4952,21 @@
     <w:p>
       <w:pPr>
         <w:pStyle w:val="Heading2"/>
-      </w:pPr>
-      <w:r>
+        <w:rPr>
+          <w:highlight w:val="yellow"/>
+        </w:rPr>
+      </w:pPr>
+      <w:r>
+        <w:rPr>
+          <w:highlight w:val="yellow"/>
+        </w:rPr>
         <w:t xml:space="preserve">Table: </w:t>
       </w:r>
       <w:proofErr w:type="spellStart"/>
       <w:r>
+        <w:rPr>
+          <w:highlight w:val="yellow"/>
+        </w:rPr>
         <w:t>asset_issues</w:t>
       </w:r>
       <w:proofErr w:type="spellEnd"/>
@@ -5075,6 +5014,11 @@
             </w:tcMar>
           </w:tcPr>
           <w:p>
+            <w:pPr>
+              <w:rPr>
+                <w:highlight w:val="yellow"/>
+              </w:rPr>
+            </w:pPr>
             <w:r>
               <w:rPr>
                 <w:b/>
@@ -5082,6 +5026,7 @@
                 <w:color w:val="FFFFFF"/>
                 <w:sz w:val="20"/>
                 <w:szCs w:val="20"/>
+                <w:highlight w:val="yellow"/>
               </w:rPr>
               <w:t>Column</w:t>
             </w:r>
@@ -5105,6 +5050,11 @@
             </w:tcMar>
           </w:tcPr>
           <w:p>
+            <w:pPr>
+              <w:rPr>
+                <w:highlight w:val="yellow"/>
+              </w:rPr>
+            </w:pPr>
             <w:r>
               <w:rPr>
                 <w:b/>
@@ -5112,6 +5062,7 @@
                 <w:color w:val="FFFFFF"/>
                 <w:sz w:val="20"/>
                 <w:szCs w:val="20"/>
+                <w:highlight w:val="yellow"/>
               </w:rPr>
               <w:t>Notes</w:t>
             </w:r>
@@ -5137,10 +5088,16 @@
             </w:tcMar>
           </w:tcPr>
           <w:p>
-            <w:r>
-              <w:rPr>
-                <w:sz w:val="20"/>
-                <w:szCs w:val="20"/>
+            <w:pPr>
+              <w:rPr>
+                <w:highlight w:val="yellow"/>
+              </w:rPr>
+            </w:pPr>
+            <w:r>
+              <w:rPr>
+                <w:sz w:val="20"/>
+                <w:szCs w:val="20"/>
+                <w:highlight w:val="yellow"/>
               </w:rPr>
               <w:t xml:space="preserve">id, </w:t>
             </w:r>
@@ -5149,6 +5106,7 @@
               <w:rPr>
                 <w:sz w:val="20"/>
                 <w:szCs w:val="20"/>
+                <w:highlight w:val="yellow"/>
               </w:rPr>
               <w:t>asset_id</w:t>
             </w:r>
@@ -5173,10 +5131,16 @@
             </w:tcMar>
           </w:tcPr>
           <w:p>
-            <w:r>
-              <w:rPr>
-                <w:sz w:val="20"/>
-                <w:szCs w:val="20"/>
+            <w:pPr>
+              <w:rPr>
+                <w:highlight w:val="yellow"/>
+              </w:rPr>
+            </w:pPr>
+            <w:r>
+              <w:rPr>
+                <w:sz w:val="20"/>
+                <w:szCs w:val="20"/>
+                <w:highlight w:val="yellow"/>
               </w:rPr>
               <w:t>FK to assets</w:t>
             </w:r>
@@ -5202,13 +5166,43 @@
             </w:tcMar>
           </w:tcPr>
           <w:p>
+            <w:pPr>
+              <w:rPr>
+                <w:highlight w:val="yellow"/>
+              </w:rPr>
+            </w:pPr>
             <w:proofErr w:type="spellStart"/>
             <w:r>
               <w:rPr>
                 <w:sz w:val="20"/>
                 <w:szCs w:val="20"/>
-              </w:rPr>
-              <w:t>issue_description</w:t>
+                <w:highlight w:val="yellow"/>
+              </w:rPr>
+              <w:t>I</w:t>
+            </w:r>
+            <w:r>
+              <w:rPr>
+                <w:sz w:val="20"/>
+                <w:szCs w:val="20"/>
+                <w:highlight w:val="yellow"/>
+              </w:rPr>
+              <w:t>ssu</w:t>
+            </w:r>
+            <w:r>
+              <w:rPr>
+                <w:sz w:val="20"/>
+                <w:szCs w:val="20"/>
+                <w:highlight w:val="yellow"/>
+              </w:rPr>
+              <w:t>e</w:t>
+            </w:r>
+            <w:r>
+              <w:rPr>
+                <w:sz w:val="20"/>
+                <w:szCs w:val="20"/>
+                <w:highlight w:val="yellow"/>
+              </w:rPr>
+              <w:t>_title</w:t>
             </w:r>
             <w:proofErr w:type="spellEnd"/>
           </w:p>
@@ -5231,12 +5225,82 @@
             </w:tcMar>
           </w:tcPr>
           <w:p>
-            <w:r>
-              <w:rPr>
-                <w:sz w:val="20"/>
-                <w:szCs w:val="20"/>
-              </w:rPr>
-              <w:t>Details of the issue</w:t>
+            <w:pPr>
+              <w:rPr>
+                <w:highlight w:val="yellow"/>
+              </w:rPr>
+            </w:pPr>
+            <w:r>
+              <w:rPr>
+                <w:rStyle w:val="hljs-string"/>
+                <w:highlight w:val="yellow"/>
+              </w:rPr>
+              <w:t>'DAMAGED'</w:t>
+            </w:r>
+            <w:r>
+              <w:rPr>
+                <w:highlight w:val="yellow"/>
+              </w:rPr>
+              <w:t xml:space="preserve">, </w:t>
+            </w:r>
+            <w:r>
+              <w:rPr>
+                <w:rStyle w:val="hljs-string"/>
+                <w:highlight w:val="yellow"/>
+              </w:rPr>
+              <w:t>'UNDER_REPAIR'</w:t>
+            </w:r>
+            <w:r>
+              <w:rPr>
+                <w:highlight w:val="yellow"/>
+              </w:rPr>
+              <w:t xml:space="preserve">, </w:t>
+            </w:r>
+            <w:r>
+              <w:rPr>
+                <w:rStyle w:val="hljs-string"/>
+                <w:highlight w:val="yellow"/>
+              </w:rPr>
+              <w:t>'LOST'</w:t>
+            </w:r>
+            <w:r>
+              <w:rPr>
+                <w:highlight w:val="yellow"/>
+              </w:rPr>
+              <w:t xml:space="preserve">, </w:t>
+            </w:r>
+            <w:r>
+              <w:rPr>
+                <w:rStyle w:val="hljs-string"/>
+                <w:highlight w:val="yellow"/>
+              </w:rPr>
+              <w:t>'MALFUNCTION'</w:t>
+            </w:r>
+            <w:r>
+              <w:rPr>
+                <w:highlight w:val="yellow"/>
+              </w:rPr>
+              <w:t xml:space="preserve">, </w:t>
+            </w:r>
+            <w:r>
+              <w:rPr>
+                <w:rStyle w:val="hljs-string"/>
+                <w:highlight w:val="yellow"/>
+              </w:rPr>
+              <w:t>'MAINTENANCE'</w:t>
+            </w:r>
+            <w:r>
+              <w:rPr>
+                <w:highlight w:val="yellow"/>
+              </w:rPr>
+              <w:t xml:space="preserve">, </w:t>
+            </w:r>
+            <w:r>
+              <w:rPr>
+                <w:rStyle w:val="hljs-string"/>
+                <w:highlight w:val="yellow"/>
+              </w:rPr>
+              <w:t>'OTHER'</w:t>
             </w:r>
           </w:p>
         </w:tc>
@@ -5260,11 +5324,17 @@
             </w:tcMar>
           </w:tcPr>
           <w:p>
+            <w:pPr>
+              <w:rPr>
+                <w:highlight w:val="yellow"/>
+              </w:rPr>
+            </w:pPr>
             <w:proofErr w:type="spellStart"/>
             <w:r>
               <w:rPr>
                 <w:sz w:val="20"/>
                 <w:szCs w:val="20"/>
+                <w:highlight w:val="yellow"/>
               </w:rPr>
               <w:t>issue_status</w:t>
             </w:r>
@@ -5289,12 +5359,26 @@
             </w:tcMar>
           </w:tcPr>
           <w:p>
-            <w:r>
-              <w:rPr>
-                <w:sz w:val="20"/>
-                <w:szCs w:val="20"/>
+            <w:pPr>
+              <w:rPr>
+                <w:highlight w:val="yellow"/>
+              </w:rPr>
+            </w:pPr>
+            <w:r>
+              <w:rPr>
+                <w:sz w:val="20"/>
+                <w:szCs w:val="20"/>
+                <w:highlight w:val="yellow"/>
               </w:rPr>
               <w:t>OPEN, IN_PROGRESS, RESOLVED</w:t>
+            </w:r>
+            <w:r>
+              <w:rPr>
+                <w:sz w:val="20"/>
+                <w:szCs w:val="20"/>
+                <w:highlight w:val="yellow"/>
+              </w:rPr>
+              <w:t>, CAN’T RESOLVED</w:t>
             </w:r>
           </w:p>
         </w:tc>
@@ -5318,11 +5402,17 @@
             </w:tcMar>
           </w:tcPr>
           <w:p>
+            <w:pPr>
+              <w:rPr>
+                <w:highlight w:val="yellow"/>
+              </w:rPr>
+            </w:pPr>
             <w:proofErr w:type="spellStart"/>
             <w:r>
               <w:rPr>
                 <w:sz w:val="20"/>
                 <w:szCs w:val="20"/>
+                <w:highlight w:val="yellow"/>
               </w:rPr>
               <w:t>reported_at</w:t>
             </w:r>
@@ -5331,6 +5421,7 @@
               <w:rPr>
                 <w:sz w:val="20"/>
                 <w:szCs w:val="20"/>
+                <w:highlight w:val="yellow"/>
               </w:rPr>
               <w:t xml:space="preserve">, </w:t>
             </w:r>
@@ -5339,6 +5430,7 @@
               <w:rPr>
                 <w:sz w:val="20"/>
                 <w:szCs w:val="20"/>
+                <w:highlight w:val="yellow"/>
               </w:rPr>
               <w:t>resolved_at</w:t>
             </w:r>
@@ -5363,10 +5455,16 @@
             </w:tcMar>
           </w:tcPr>
           <w:p>
-            <w:r>
-              <w:rPr>
-                <w:sz w:val="20"/>
-                <w:szCs w:val="20"/>
+            <w:pPr>
+              <w:rPr>
+                <w:highlight w:val="yellow"/>
+              </w:rPr>
+            </w:pPr>
+            <w:r>
+              <w:rPr>
+                <w:sz w:val="20"/>
+                <w:szCs w:val="20"/>
+                <w:highlight w:val="yellow"/>
               </w:rPr>
               <w:t>Timeline tracking</w:t>
             </w:r>
@@ -5392,19 +5490,18 @@
             </w:tcMar>
           </w:tcPr>
           <w:p>
-            <w:r>
-              <w:rPr>
-                <w:sz w:val="20"/>
-                <w:szCs w:val="20"/>
-              </w:rPr>
-              <w:t>N</w:t>
-            </w:r>
-            <w:r>
-              <w:rPr>
-                <w:sz w:val="20"/>
-                <w:szCs w:val="20"/>
-              </w:rPr>
-              <w:t>ote</w:t>
+            <w:pPr>
+              <w:rPr>
+                <w:highlight w:val="yellow"/>
+              </w:rPr>
+            </w:pPr>
+            <w:r>
+              <w:rPr>
+                <w:sz w:val="20"/>
+                <w:szCs w:val="20"/>
+                <w:highlight w:val="yellow"/>
+              </w:rPr>
+              <w:t>note</w:t>
             </w:r>
           </w:p>
         </w:tc>
@@ -5426,10 +5523,16 @@
             </w:tcMar>
           </w:tcPr>
           <w:p>
-            <w:r>
-              <w:rPr>
-                <w:sz w:val="20"/>
-                <w:szCs w:val="20"/>
+            <w:pPr>
+              <w:rPr>
+                <w:highlight w:val="yellow"/>
+              </w:rPr>
+            </w:pPr>
+            <w:r>
+              <w:rPr>
+                <w:sz w:val="20"/>
+                <w:szCs w:val="20"/>
+                <w:highlight w:val="yellow"/>
               </w:rPr>
               <w:t>Technician notes</w:t>
             </w:r>
@@ -5455,11 +5558,17 @@
             </w:tcMar>
           </w:tcPr>
           <w:p>
+            <w:pPr>
+              <w:rPr>
+                <w:highlight w:val="yellow"/>
+              </w:rPr>
+            </w:pPr>
             <w:proofErr w:type="spellStart"/>
             <w:r>
               <w:rPr>
                 <w:sz w:val="20"/>
                 <w:szCs w:val="20"/>
+                <w:highlight w:val="yellow"/>
               </w:rPr>
               <w:t>created_at</w:t>
             </w:r>
@@ -5468,6 +5577,7 @@
               <w:rPr>
                 <w:sz w:val="20"/>
                 <w:szCs w:val="20"/>
+                <w:highlight w:val="yellow"/>
               </w:rPr>
               <w:t xml:space="preserve"> / </w:t>
             </w:r>
@@ -5476,6 +5586,7 @@
               <w:rPr>
                 <w:sz w:val="20"/>
                 <w:szCs w:val="20"/>
+                <w:highlight w:val="yellow"/>
               </w:rPr>
               <w:t>updated_at</w:t>
             </w:r>
@@ -5504,6 +5615,7 @@
               <w:rPr>
                 <w:sz w:val="20"/>
                 <w:szCs w:val="20"/>
+                <w:highlight w:val="yellow"/>
               </w:rPr>
               <w:t>timestamps</w:t>
             </w:r>
@@ -6057,7 +6169,6 @@
                 <w:sz w:val="20"/>
                 <w:szCs w:val="20"/>
               </w:rPr>
-              <w:lastRenderedPageBreak/>
               <w:t>created_at</w:t>
             </w:r>
             <w:proofErr w:type="spellEnd"/>
@@ -6126,6 +6237,7 @@
         <w:pStyle w:val="Heading2"/>
       </w:pPr>
       <w:r>
+        <w:lastRenderedPageBreak/>
         <w:t>Authentication APIs</w:t>
       </w:r>
     </w:p>
@@ -7090,7 +7202,6 @@
         <w:pStyle w:val="Heading2"/>
       </w:pPr>
       <w:r>
-        <w:lastRenderedPageBreak/>
         <w:t>Issue APIs</w:t>
       </w:r>
     </w:p>
@@ -7183,6 +7294,7 @@
         <w:pStyle w:val="Heading2"/>
       </w:pPr>
       <w:r>
+        <w:lastRenderedPageBreak/>
         <w:t>Report APIs (Public)</w:t>
       </w:r>
     </w:p>
@@ -7336,14 +7448,7 @@
           <w:sz w:val="20"/>
           <w:szCs w:val="20"/>
         </w:rPr>
-        <w:t xml:space="preserve"> </w:t>
-      </w:r>
-      <w:r>
-        <w:rPr>
-          <w:sz w:val="20"/>
-          <w:szCs w:val="20"/>
-        </w:rPr>
-        <w:t>warranty</w:t>
+        <w:t xml:space="preserve"> warranty</w:t>
       </w:r>
       <w:r>
         <w:rPr>
@@ -7985,7 +8090,6 @@
         <w:spacing w:before="40" w:after="40"/>
       </w:pPr>
       <w:r>
-        <w:lastRenderedPageBreak/>
         <w:t>Purchase cost cannot be negative.</w:t>
       </w:r>
     </w:p>
@@ -8046,6 +8150,7 @@
         <w:spacing w:before="40" w:after="40"/>
       </w:pPr>
       <w:r>
+        <w:lastRenderedPageBreak/>
         <w:t>Failed login attempts should return 401 Unauthorized — never expose user existence.</w:t>
       </w:r>
     </w:p>
@@ -8687,6 +8792,7 @@
             </w:tcMar>
           </w:tcPr>
           <w:p>
+            <w:bookmarkStart w:id="0" w:name="_GoBack"/>
             <w:r>
               <w:rPr>
                 <w:sz w:val="20"/>
@@ -8694,6 +8800,7 @@
               </w:rPr>
               <w:t>Spring Security + JWT</w:t>
             </w:r>
+            <w:bookmarkEnd w:id="0"/>
           </w:p>
         </w:tc>
         <w:tc>
@@ -8973,20 +9080,20 @@
         <w:spacing w:before="80" w:after="80"/>
       </w:pPr>
       <w:r>
+        <w:t>The TID Asset Management System is an internal backend platform designed to centralize device inventory, assignment tracking, procurement records, warranty monitoring, and issue management for company assets. The system uses a modular monolith architecture with Spring Boot and PostgreSQL, organized by feature and layered by responsibility inside each module.</w:t>
+      </w:r>
+    </w:p>
+    <w:p>
+      <w:pPr>
+        <w:spacing w:before="60" w:after="60"/>
+      </w:pPr>
+    </w:p>
+    <w:p>
+      <w:pPr>
+        <w:spacing w:before="80" w:after="80"/>
+      </w:pPr>
+      <w:r>
         <w:lastRenderedPageBreak/>
-        <w:t>The TID Asset Management System is an internal backend platform designed to centralize device inventory, assignment tracking, procurement records, warranty monitoring, and issue management for company assets. The system uses a modular monolith architecture with Spring Boot and PostgreSQL, organized by feature and layered by responsibility inside each module.</w:t>
-      </w:r>
-    </w:p>
-    <w:p>
-      <w:pPr>
-        <w:spacing w:before="60" w:after="60"/>
-      </w:pPr>
-    </w:p>
-    <w:p>
-      <w:pPr>
-        <w:spacing w:before="80" w:after="80"/>
-      </w:pPr>
-      <w:r>
         <w:t>Authentication is handled via JWT-based Spring Security, with role-based access control separating public read-only views (dashboard, asset status) from protected management operations. The first release focuses on core asset lifecycle functions — asset registration, assignment, return, issue tracking, and reporting — while leaving room for future extensions as the process matures.</w:t>
       </w:r>
     </w:p>
@@ -10830,6 +10937,11 @@
       <w:szCs w:val="26"/>
     </w:rPr>
   </w:style>
+  <w:style w:type="character" w:customStyle="1" w:styleId="hljs-string">
+    <w:name w:val="hljs-string"/>
+    <w:basedOn w:val="DefaultParagraphFont"/>
+    <w:rsid w:val="0077525F"/>
+  </w:style>
 </w:styles>
 </file>
 

</xml_diff>

<commit_message>
docs: project perspective document
</commit_message>
<xml_diff>
--- a/document/TID_Asset_Management_Project_Perspective.docx
+++ b/document/TID_Asset_Management_Project_Perspective.docx
@@ -29,280 +29,8 @@
           <w:sz w:val="30"/>
           <w:szCs w:val="30"/>
         </w:rPr>
-        <w:t>Project Perspective and Backend Blueprint</w:t>
-      </w:r>
-    </w:p>
-    <w:p>
-      <w:pPr>
-        <w:spacing w:before="60" w:after="60"/>
-      </w:pPr>
-    </w:p>
-    <w:tbl>
-      <w:tblPr>
-        <w:tblW w:w="9360" w:type="dxa"/>
-        <w:tblBorders>
-          <w:top w:val="single" w:sz="4" w:space="0" w:color="auto"/>
-          <w:left w:val="single" w:sz="4" w:space="0" w:color="auto"/>
-          <w:bottom w:val="single" w:sz="4" w:space="0" w:color="auto"/>
-          <w:right w:val="single" w:sz="4" w:space="0" w:color="auto"/>
-          <w:insideH w:val="single" w:sz="4" w:space="0" w:color="auto"/>
-          <w:insideV w:val="single" w:sz="4" w:space="0" w:color="auto"/>
-        </w:tblBorders>
-        <w:tblCellMar>
-          <w:left w:w="10" w:type="dxa"/>
-          <w:right w:w="10" w:type="dxa"/>
-        </w:tblCellMar>
-        <w:tblLook w:val="0000" w:firstRow="0" w:lastRow="0" w:firstColumn="0" w:lastColumn="0" w:noHBand="0" w:noVBand="0"/>
-      </w:tblPr>
-      <w:tblGrid>
-        <w:gridCol w:w="2800"/>
-        <w:gridCol w:w="6560"/>
-      </w:tblGrid>
-      <w:tr>
-        <w:tc>
-          <w:tcPr>
-            <w:tcW w:w="2800" w:type="dxa"/>
-            <w:tcBorders>
-              <w:top w:val="single" w:sz="1" w:space="0" w:color="CCCCCC"/>
-              <w:left w:val="single" w:sz="1" w:space="0" w:color="CCCCCC"/>
-              <w:bottom w:val="single" w:sz="1" w:space="0" w:color="CCCCCC"/>
-              <w:right w:val="single" w:sz="1" w:space="0" w:color="CCCCCC"/>
-            </w:tcBorders>
-            <w:shd w:val="clear" w:color="auto" w:fill="F0F4FA"/>
-            <w:tcMar>
-              <w:top w:w="80" w:type="dxa"/>
-              <w:left w:w="150" w:type="dxa"/>
-              <w:bottom w:w="80" w:type="dxa"/>
-              <w:right w:w="150" w:type="dxa"/>
-            </w:tcMar>
-          </w:tcPr>
-          <w:p>
-            <w:r>
-              <w:rPr>
-                <w:sz w:val="20"/>
-                <w:szCs w:val="20"/>
-              </w:rPr>
-              <w:t>Recommended Architecture</w:t>
-            </w:r>
-          </w:p>
-        </w:tc>
-        <w:tc>
-          <w:tcPr>
-            <w:tcW w:w="6560" w:type="dxa"/>
-            <w:tcBorders>
-              <w:top w:val="single" w:sz="1" w:space="0" w:color="CCCCCC"/>
-              <w:left w:val="single" w:sz="1" w:space="0" w:color="CCCCCC"/>
-              <w:bottom w:val="single" w:sz="1" w:space="0" w:color="CCCCCC"/>
-              <w:right w:val="single" w:sz="1" w:space="0" w:color="CCCCCC"/>
-            </w:tcBorders>
-            <w:shd w:val="clear" w:color="auto" w:fill="F0F4FA"/>
-            <w:tcMar>
-              <w:top w:w="80" w:type="dxa"/>
-              <w:left w:w="150" w:type="dxa"/>
-              <w:bottom w:w="80" w:type="dxa"/>
-              <w:right w:w="150" w:type="dxa"/>
-            </w:tcMar>
-          </w:tcPr>
-          <w:p>
-            <w:r>
-              <w:rPr>
-                <w:sz w:val="20"/>
-                <w:szCs w:val="20"/>
-              </w:rPr>
-              <w:t>Modular monolith with package-by-feature and layered design inside each business module.</w:t>
-            </w:r>
-          </w:p>
-        </w:tc>
-      </w:tr>
-      <w:tr>
-        <w:tc>
-          <w:tcPr>
-            <w:tcW w:w="2800" w:type="dxa"/>
-            <w:tcBorders>
-              <w:top w:val="single" w:sz="1" w:space="0" w:color="CCCCCC"/>
-              <w:left w:val="single" w:sz="1" w:space="0" w:color="CCCCCC"/>
-              <w:bottom w:val="single" w:sz="1" w:space="0" w:color="CCCCCC"/>
-              <w:right w:val="single" w:sz="1" w:space="0" w:color="CCCCCC"/>
-            </w:tcBorders>
-            <w:shd w:val="clear" w:color="auto" w:fill="FFFFFF"/>
-            <w:tcMar>
-              <w:top w:w="80" w:type="dxa"/>
-              <w:left w:w="150" w:type="dxa"/>
-              <w:bottom w:w="80" w:type="dxa"/>
-              <w:right w:w="150" w:type="dxa"/>
-            </w:tcMar>
-          </w:tcPr>
-          <w:p>
-            <w:r>
-              <w:rPr>
-                <w:sz w:val="20"/>
-                <w:szCs w:val="20"/>
-              </w:rPr>
-              <w:t>Focus</w:t>
-            </w:r>
-          </w:p>
-        </w:tc>
-        <w:tc>
-          <w:tcPr>
-            <w:tcW w:w="6560" w:type="dxa"/>
-            <w:tcBorders>
-              <w:top w:val="single" w:sz="1" w:space="0" w:color="CCCCCC"/>
-              <w:left w:val="single" w:sz="1" w:space="0" w:color="CCCCCC"/>
-              <w:bottom w:val="single" w:sz="1" w:space="0" w:color="CCCCCC"/>
-              <w:right w:val="single" w:sz="1" w:space="0" w:color="CCCCCC"/>
-            </w:tcBorders>
-            <w:shd w:val="clear" w:color="auto" w:fill="FFFFFF"/>
-            <w:tcMar>
-              <w:top w:w="80" w:type="dxa"/>
-              <w:left w:w="150" w:type="dxa"/>
-              <w:bottom w:w="80" w:type="dxa"/>
-              <w:right w:w="150" w:type="dxa"/>
-            </w:tcMar>
-          </w:tcPr>
-          <w:p>
-            <w:r>
-              <w:rPr>
-                <w:sz w:val="20"/>
-                <w:szCs w:val="20"/>
-              </w:rPr>
-              <w:t>Real-world internal asset tracking with Spring Boot, PostgreSQL, security, testing, and reporting.</w:t>
-            </w:r>
-          </w:p>
-        </w:tc>
-      </w:tr>
-      <w:tr>
-        <w:tc>
-          <w:tcPr>
-            <w:tcW w:w="2800" w:type="dxa"/>
-            <w:tcBorders>
-              <w:top w:val="single" w:sz="1" w:space="0" w:color="CCCCCC"/>
-              <w:left w:val="single" w:sz="1" w:space="0" w:color="CCCCCC"/>
-              <w:bottom w:val="single" w:sz="1" w:space="0" w:color="CCCCCC"/>
-              <w:right w:val="single" w:sz="1" w:space="0" w:color="CCCCCC"/>
-            </w:tcBorders>
-            <w:shd w:val="clear" w:color="auto" w:fill="F0F4FA"/>
-            <w:tcMar>
-              <w:top w:w="80" w:type="dxa"/>
-              <w:left w:w="150" w:type="dxa"/>
-              <w:bottom w:w="80" w:type="dxa"/>
-              <w:right w:w="150" w:type="dxa"/>
-            </w:tcMar>
-          </w:tcPr>
-          <w:p>
-            <w:r>
-              <w:rPr>
-                <w:sz w:val="20"/>
-                <w:szCs w:val="20"/>
-              </w:rPr>
-              <w:t>Best Fit</w:t>
-            </w:r>
-          </w:p>
-        </w:tc>
-        <w:tc>
-          <w:tcPr>
-            <w:tcW w:w="6560" w:type="dxa"/>
-            <w:tcBorders>
-              <w:top w:val="single" w:sz="1" w:space="0" w:color="CCCCCC"/>
-              <w:left w:val="single" w:sz="1" w:space="0" w:color="CCCCCC"/>
-              <w:bottom w:val="single" w:sz="1" w:space="0" w:color="CCCCCC"/>
-              <w:right w:val="single" w:sz="1" w:space="0" w:color="CCCCCC"/>
-            </w:tcBorders>
-            <w:shd w:val="clear" w:color="auto" w:fill="F0F4FA"/>
-            <w:tcMar>
-              <w:top w:w="80" w:type="dxa"/>
-              <w:left w:w="150" w:type="dxa"/>
-              <w:bottom w:w="80" w:type="dxa"/>
-              <w:right w:w="150" w:type="dxa"/>
-            </w:tcMar>
-          </w:tcPr>
-          <w:p>
-            <w:r>
-              <w:rPr>
-                <w:sz w:val="20"/>
-                <w:szCs w:val="20"/>
-              </w:rPr>
-              <w:t>New projects that want to stay simple now without blocking future growth.</w:t>
-            </w:r>
-          </w:p>
-        </w:tc>
-      </w:tr>
-      <w:tr>
-        <w:tc>
-          <w:tcPr>
-            <w:tcW w:w="2800" w:type="dxa"/>
-            <w:tcBorders>
-              <w:top w:val="single" w:sz="1" w:space="0" w:color="CCCCCC"/>
-              <w:left w:val="single" w:sz="1" w:space="0" w:color="CCCCCC"/>
-              <w:bottom w:val="single" w:sz="1" w:space="0" w:color="CCCCCC"/>
-              <w:right w:val="single" w:sz="1" w:space="0" w:color="CCCCCC"/>
-            </w:tcBorders>
-            <w:shd w:val="clear" w:color="auto" w:fill="FFFFFF"/>
-            <w:tcMar>
-              <w:top w:w="80" w:type="dxa"/>
-              <w:left w:w="150" w:type="dxa"/>
-              <w:bottom w:w="80" w:type="dxa"/>
-              <w:right w:w="150" w:type="dxa"/>
-            </w:tcMar>
-          </w:tcPr>
-          <w:p>
-            <w:r>
-              <w:rPr>
-                <w:sz w:val="20"/>
-                <w:szCs w:val="20"/>
-              </w:rPr>
-              <w:t>Core Stack</w:t>
-            </w:r>
-          </w:p>
-        </w:tc>
-        <w:tc>
-          <w:tcPr>
-            <w:tcW w:w="6560" w:type="dxa"/>
-            <w:tcBorders>
-              <w:top w:val="single" w:sz="1" w:space="0" w:color="CCCCCC"/>
-              <w:left w:val="single" w:sz="1" w:space="0" w:color="CCCCCC"/>
-              <w:bottom w:val="single" w:sz="1" w:space="0" w:color="CCCCCC"/>
-              <w:right w:val="single" w:sz="1" w:space="0" w:color="CCCCCC"/>
-            </w:tcBorders>
-            <w:shd w:val="clear" w:color="auto" w:fill="FFFFFF"/>
-            <w:tcMar>
-              <w:top w:w="80" w:type="dxa"/>
-              <w:left w:w="150" w:type="dxa"/>
-              <w:bottom w:w="80" w:type="dxa"/>
-              <w:right w:w="150" w:type="dxa"/>
-            </w:tcMar>
-          </w:tcPr>
-          <w:p>
-            <w:r>
-              <w:rPr>
-                <w:sz w:val="20"/>
-                <w:szCs w:val="20"/>
-              </w:rPr>
-              <w:t xml:space="preserve">Spring Boot 3.x, Java 21, PostgreSQL, Flyway, Spring Security, Validation, Actuator, </w:t>
-            </w:r>
-            <w:proofErr w:type="spellStart"/>
-            <w:r>
-              <w:rPr>
-                <w:sz w:val="20"/>
-                <w:szCs w:val="20"/>
-              </w:rPr>
-              <w:t>Testcontainers</w:t>
-            </w:r>
-            <w:proofErr w:type="spellEnd"/>
-            <w:r>
-              <w:rPr>
-                <w:sz w:val="20"/>
-                <w:szCs w:val="20"/>
-              </w:rPr>
-              <w:t>, Gradle.</w:t>
-            </w:r>
-          </w:p>
-        </w:tc>
-      </w:tr>
-    </w:tbl>
-    <w:p>
-      <w:pPr>
-        <w:spacing w:before="60" w:after="60"/>
-      </w:pPr>
+        <w:t>Backend Blueprint</w:t>
+      </w:r>
     </w:p>
     <w:p>
       <w:pPr>
@@ -421,6 +149,12 @@
       <w:r>
         <w:t>3. Recommended System Scope</w:t>
       </w:r>
+      <w:r>
+        <w:t xml:space="preserve"> and </w:t>
+      </w:r>
+      <w:r>
+        <w:t>Important Business Rules</w:t>
+      </w:r>
     </w:p>
     <w:p>
       <w:pPr>
@@ -509,76 +243,76 @@
         <w:rPr>
           <w:highlight w:val="yellow"/>
         </w:rPr>
+        <w:t>Track vendor, purchase date, purchase cost, and warranty expiry</w:t>
+      </w:r>
+      <w:r>
+        <w:t>.</w:t>
+      </w:r>
+    </w:p>
+    <w:p>
+      <w:pPr>
+        <w:pStyle w:val="Heading2"/>
+      </w:pPr>
+      <w:r>
+        <w:t xml:space="preserve">D. </w:t>
+      </w:r>
+      <w:r>
+        <w:t xml:space="preserve">Asset </w:t>
+      </w:r>
+      <w:r>
+        <w:t xml:space="preserve">Maintenance / </w:t>
+      </w:r>
+      <w:r>
+        <w:t xml:space="preserve">Asset </w:t>
+      </w:r>
+      <w:r>
+        <w:t>Issue Module</w:t>
+      </w:r>
+    </w:p>
+    <w:p>
+      <w:pPr>
+        <w:spacing w:before="80" w:after="80"/>
+      </w:pPr>
+      <w:r>
+        <w:t>Track issue reports, repair status, maintenance notes, and security checks.</w:t>
+      </w:r>
+    </w:p>
+    <w:p>
+      <w:pPr>
+        <w:pStyle w:val="Heading2"/>
+      </w:pPr>
+      <w:r>
+        <w:t xml:space="preserve">E. </w:t>
+      </w:r>
+      <w:r>
+        <w:t xml:space="preserve">Asset </w:t>
+      </w:r>
+      <w:r>
+        <w:t>Reporting Module</w:t>
+      </w:r>
+    </w:p>
+    <w:p>
+      <w:pPr>
+        <w:spacing w:before="80" w:after="80"/>
+      </w:pPr>
+      <w:r>
+        <w:t>Provide dashboards and reports for asset counts, availability, warranty expiry, and issue tracking.</w:t>
+      </w:r>
+    </w:p>
+    <w:p>
+      <w:pPr>
+        <w:pStyle w:val="Heading2"/>
+      </w:pPr>
+      <w:r>
+        <w:t>F. User Management Module</w:t>
+      </w:r>
+    </w:p>
+    <w:p>
+      <w:pPr>
+        <w:spacing w:before="80" w:after="80"/>
+      </w:pPr>
+      <w:r>
         <w:lastRenderedPageBreak/>
-        <w:t>Track vendor, purchase date, purchase cost, and warranty expiry</w:t>
-      </w:r>
-      <w:r>
-        <w:t>.</w:t>
-      </w:r>
-    </w:p>
-    <w:p>
-      <w:pPr>
-        <w:pStyle w:val="Heading2"/>
-      </w:pPr>
-      <w:r>
-        <w:t xml:space="preserve">D. </w:t>
-      </w:r>
-      <w:r>
-        <w:t xml:space="preserve">Asset </w:t>
-      </w:r>
-      <w:r>
-        <w:t xml:space="preserve">Maintenance / </w:t>
-      </w:r>
-      <w:r>
-        <w:t xml:space="preserve">Asset </w:t>
-      </w:r>
-      <w:r>
-        <w:t>Issue Module</w:t>
-      </w:r>
-    </w:p>
-    <w:p>
-      <w:pPr>
-        <w:spacing w:before="80" w:after="80"/>
-      </w:pPr>
-      <w:r>
-        <w:t>Track issue reports, repair status, maintenance notes, and security checks.</w:t>
-      </w:r>
-    </w:p>
-    <w:p>
-      <w:pPr>
-        <w:pStyle w:val="Heading2"/>
-      </w:pPr>
-      <w:r>
-        <w:t xml:space="preserve">E. </w:t>
-      </w:r>
-      <w:r>
-        <w:t xml:space="preserve">Asset </w:t>
-      </w:r>
-      <w:r>
-        <w:t>Reporting Module</w:t>
-      </w:r>
-    </w:p>
-    <w:p>
-      <w:pPr>
-        <w:spacing w:before="80" w:after="80"/>
-      </w:pPr>
-      <w:r>
-        <w:t>Provide dashboards and reports for asset counts, availability, warranty expiry, and issue tracking.</w:t>
-      </w:r>
-    </w:p>
-    <w:p>
-      <w:pPr>
-        <w:pStyle w:val="Heading2"/>
-      </w:pPr>
-      <w:r>
-        <w:t>F. User Management Module</w:t>
-      </w:r>
-    </w:p>
-    <w:p>
-      <w:pPr>
-        <w:spacing w:before="80" w:after="80"/>
-      </w:pPr>
-      <w:r>
         <w:t xml:space="preserve">Only super admin can you modify with permission to each module or endpoint for admin user. </w:t>
       </w:r>
     </w:p>
@@ -810,7 +544,6 @@
         <w:spacing w:before="60" w:after="60"/>
       </w:pPr>
       <w:r>
-        <w:lastRenderedPageBreak/>
         <w:t>Authorization: The client includes the token in the Authorization: Bearer &lt;token&gt; header for every request.</w:t>
       </w:r>
     </w:p>
@@ -887,6 +620,7 @@
         <w:spacing w:before="60" w:after="60"/>
       </w:pPr>
       <w:r>
+        <w:lastRenderedPageBreak/>
         <w:t>JWT Configuration: Tokens are signed with the HS256 algorithm and have a default expiry of 8 hours.</w:t>
       </w:r>
     </w:p>
@@ -2695,7 +2429,6 @@
                 <w:szCs w:val="20"/>
                 <w:highlight w:val="yellow"/>
               </w:rPr>
-              <w:lastRenderedPageBreak/>
               <w:t>latest_used</w:t>
             </w:r>
             <w:proofErr w:type="spellEnd"/>
@@ -3152,6 +2885,7 @@
                 <w:szCs w:val="20"/>
                 <w:highlight w:val="yellow"/>
               </w:rPr>
+              <w:lastRenderedPageBreak/>
               <w:t>assigned_to</w:t>
             </w:r>
             <w:proofErr w:type="spellEnd"/>
@@ -4098,13 +3832,6 @@
                 <w:szCs w:val="20"/>
               </w:rPr>
             </w:pPr>
-            <w:r>
-              <w:rPr>
-                <w:sz w:val="20"/>
-                <w:szCs w:val="20"/>
-              </w:rPr>
-              <w:t>Check with User Token head and put username</w:t>
-            </w:r>
           </w:p>
         </w:tc>
       </w:tr>
@@ -4139,7 +3866,21 @@
                 <w:sz w:val="20"/>
                 <w:szCs w:val="20"/>
               </w:rPr>
-              <w:t>comfirm_return_by</w:t>
+              <w:t>co</w:t>
+            </w:r>
+            <w:r>
+              <w:rPr>
+                <w:sz w:val="20"/>
+                <w:szCs w:val="20"/>
+              </w:rPr>
+              <w:t>n</w:t>
+            </w:r>
+            <w:r>
+              <w:rPr>
+                <w:sz w:val="20"/>
+                <w:szCs w:val="20"/>
+              </w:rPr>
+              <w:t>firm_return_by</w:t>
             </w:r>
             <w:proofErr w:type="spellEnd"/>
           </w:p>
@@ -4168,13 +3909,134 @@
                 <w:szCs w:val="20"/>
               </w:rPr>
             </w:pPr>
-            <w:r>
-              <w:rPr>
-                <w:sz w:val="20"/>
-                <w:szCs w:val="20"/>
-              </w:rPr>
-              <w:t>Check with User Token head and put username</w:t>
-            </w:r>
+          </w:p>
+        </w:tc>
+      </w:tr>
+      <w:tr>
+        <w:tc>
+          <w:tcPr>
+            <w:tcW w:w="2800" w:type="dxa"/>
+            <w:tcBorders>
+              <w:top w:val="single" w:sz="1" w:space="0" w:color="CCCCCC"/>
+              <w:left w:val="single" w:sz="1" w:space="0" w:color="CCCCCC"/>
+              <w:bottom w:val="single" w:sz="1" w:space="0" w:color="CCCCCC"/>
+              <w:right w:val="single" w:sz="1" w:space="0" w:color="CCCCCC"/>
+            </w:tcBorders>
+            <w:shd w:val="clear" w:color="auto" w:fill="FFFFFF"/>
+            <w:tcMar>
+              <w:top w:w="80" w:type="dxa"/>
+              <w:left w:w="150" w:type="dxa"/>
+              <w:bottom w:w="80" w:type="dxa"/>
+              <w:right w:w="150" w:type="dxa"/>
+            </w:tcMar>
+          </w:tcPr>
+          <w:p>
+            <w:pPr>
+              <w:rPr>
+                <w:sz w:val="20"/>
+                <w:szCs w:val="20"/>
+              </w:rPr>
+            </w:pPr>
+            <w:proofErr w:type="spellStart"/>
+            <w:r>
+              <w:rPr>
+                <w:sz w:val="20"/>
+                <w:szCs w:val="20"/>
+              </w:rPr>
+              <w:t>assigned_by_user_id</w:t>
+            </w:r>
+            <w:proofErr w:type="spellEnd"/>
+          </w:p>
+        </w:tc>
+        <w:tc>
+          <w:tcPr>
+            <w:tcW w:w="6560" w:type="dxa"/>
+            <w:tcBorders>
+              <w:top w:val="single" w:sz="1" w:space="0" w:color="CCCCCC"/>
+              <w:left w:val="single" w:sz="1" w:space="0" w:color="CCCCCC"/>
+              <w:bottom w:val="single" w:sz="1" w:space="0" w:color="CCCCCC"/>
+              <w:right w:val="single" w:sz="1" w:space="0" w:color="CCCCCC"/>
+            </w:tcBorders>
+            <w:shd w:val="clear" w:color="auto" w:fill="FFFFFF"/>
+            <w:tcMar>
+              <w:top w:w="80" w:type="dxa"/>
+              <w:left w:w="150" w:type="dxa"/>
+              <w:bottom w:w="80" w:type="dxa"/>
+              <w:right w:w="150" w:type="dxa"/>
+            </w:tcMar>
+          </w:tcPr>
+          <w:p>
+            <w:pPr>
+              <w:rPr>
+                <w:sz w:val="20"/>
+                <w:szCs w:val="20"/>
+              </w:rPr>
+            </w:pPr>
+          </w:p>
+        </w:tc>
+      </w:tr>
+      <w:tr>
+        <w:tc>
+          <w:tcPr>
+            <w:tcW w:w="2800" w:type="dxa"/>
+            <w:tcBorders>
+              <w:top w:val="single" w:sz="1" w:space="0" w:color="CCCCCC"/>
+              <w:left w:val="single" w:sz="1" w:space="0" w:color="CCCCCC"/>
+              <w:bottom w:val="single" w:sz="1" w:space="0" w:color="CCCCCC"/>
+              <w:right w:val="single" w:sz="1" w:space="0" w:color="CCCCCC"/>
+            </w:tcBorders>
+            <w:shd w:val="clear" w:color="auto" w:fill="FFFFFF"/>
+            <w:tcMar>
+              <w:top w:w="80" w:type="dxa"/>
+              <w:left w:w="150" w:type="dxa"/>
+              <w:bottom w:w="80" w:type="dxa"/>
+              <w:right w:w="150" w:type="dxa"/>
+            </w:tcMar>
+          </w:tcPr>
+          <w:p>
+            <w:pPr>
+              <w:rPr>
+                <w:sz w:val="20"/>
+                <w:szCs w:val="20"/>
+              </w:rPr>
+            </w:pPr>
+            <w:proofErr w:type="spellStart"/>
+            <w:r>
+              <w:rPr>
+                <w:sz w:val="20"/>
+                <w:szCs w:val="20"/>
+              </w:rPr>
+              <w:t>Confirm_return_by_user_id</w:t>
+            </w:r>
+            <w:proofErr w:type="spellEnd"/>
+          </w:p>
+        </w:tc>
+        <w:tc>
+          <w:tcPr>
+            <w:tcW w:w="6560" w:type="dxa"/>
+            <w:tcBorders>
+              <w:top w:val="single" w:sz="1" w:space="0" w:color="CCCCCC"/>
+              <w:left w:val="single" w:sz="1" w:space="0" w:color="CCCCCC"/>
+              <w:bottom w:val="single" w:sz="1" w:space="0" w:color="CCCCCC"/>
+              <w:right w:val="single" w:sz="1" w:space="0" w:color="CCCCCC"/>
+            </w:tcBorders>
+            <w:shd w:val="clear" w:color="auto" w:fill="FFFFFF"/>
+            <w:tcMar>
+              <w:top w:w="80" w:type="dxa"/>
+              <w:left w:w="150" w:type="dxa"/>
+              <w:bottom w:w="80" w:type="dxa"/>
+              <w:right w:w="150" w:type="dxa"/>
+            </w:tcMar>
+          </w:tcPr>
+          <w:p>
+            <w:pPr>
+              <w:rPr>
+                <w:sz w:val="20"/>
+                <w:szCs w:val="20"/>
+              </w:rPr>
+            </w:pPr>
+            <w:bookmarkStart w:id="0" w:name="_GoBack"/>
+            <w:bookmarkEnd w:id="0"/>
           </w:p>
         </w:tc>
       </w:tr>
@@ -4689,6 +4551,7 @@
                 <w:szCs w:val="20"/>
                 <w:highlight w:val="yellow"/>
               </w:rPr>
+              <w:lastRenderedPageBreak/>
               <w:t>purchase_date</w:t>
             </w:r>
             <w:proofErr w:type="spellEnd"/>
@@ -5636,7 +5499,13 @@
         </w:tabs>
       </w:pPr>
       <w:r>
-        <w:t xml:space="preserve">Table: users </w:t>
+        <w:rPr>
+          <w:highlight w:val="yellow"/>
+        </w:rPr>
+        <w:t>Table: users</w:t>
+      </w:r>
+      <w:r>
+        <w:t xml:space="preserve"> </w:t>
       </w:r>
     </w:p>
     <w:tbl>
@@ -5744,10 +5613,16 @@
             </w:tcMar>
           </w:tcPr>
           <w:p>
-            <w:r>
-              <w:rPr>
-                <w:sz w:val="20"/>
-                <w:szCs w:val="20"/>
+            <w:pPr>
+              <w:rPr>
+                <w:highlight w:val="yellow"/>
+              </w:rPr>
+            </w:pPr>
+            <w:r>
+              <w:rPr>
+                <w:sz w:val="20"/>
+                <w:szCs w:val="20"/>
+                <w:highlight w:val="yellow"/>
               </w:rPr>
               <w:t>id</w:t>
             </w:r>
@@ -5771,10 +5646,16 @@
             </w:tcMar>
           </w:tcPr>
           <w:p>
-            <w:r>
-              <w:rPr>
-                <w:sz w:val="20"/>
-                <w:szCs w:val="20"/>
+            <w:pPr>
+              <w:rPr>
+                <w:highlight w:val="yellow"/>
+              </w:rPr>
+            </w:pPr>
+            <w:r>
+              <w:rPr>
+                <w:sz w:val="20"/>
+                <w:szCs w:val="20"/>
+                <w:highlight w:val="yellow"/>
               </w:rPr>
               <w:t>Auto-generated primary key</w:t>
             </w:r>
@@ -5804,12 +5685,14 @@
               <w:rPr>
                 <w:sz w:val="20"/>
                 <w:szCs w:val="20"/>
-              </w:rPr>
-            </w:pPr>
-            <w:r>
-              <w:rPr>
-                <w:sz w:val="20"/>
-                <w:szCs w:val="20"/>
+                <w:highlight w:val="yellow"/>
+              </w:rPr>
+            </w:pPr>
+            <w:r>
+              <w:rPr>
+                <w:sz w:val="20"/>
+                <w:szCs w:val="20"/>
+                <w:highlight w:val="yellow"/>
               </w:rPr>
               <w:t>Image</w:t>
             </w:r>
@@ -5837,12 +5720,14 @@
               <w:rPr>
                 <w:sz w:val="20"/>
                 <w:szCs w:val="20"/>
-              </w:rPr>
-            </w:pPr>
-            <w:r>
-              <w:rPr>
-                <w:sz w:val="20"/>
-                <w:szCs w:val="20"/>
+                <w:highlight w:val="yellow"/>
+              </w:rPr>
+            </w:pPr>
+            <w:r>
+              <w:rPr>
+                <w:sz w:val="20"/>
+                <w:szCs w:val="20"/>
+                <w:highlight w:val="yellow"/>
               </w:rPr>
               <w:t>VARCHAR</w:t>
             </w:r>
@@ -5868,10 +5753,16 @@
             </w:tcMar>
           </w:tcPr>
           <w:p>
-            <w:r>
-              <w:rPr>
-                <w:sz w:val="20"/>
-                <w:szCs w:val="20"/>
+            <w:pPr>
+              <w:rPr>
+                <w:highlight w:val="yellow"/>
+              </w:rPr>
+            </w:pPr>
+            <w:r>
+              <w:rPr>
+                <w:sz w:val="20"/>
+                <w:szCs w:val="20"/>
+                <w:highlight w:val="yellow"/>
               </w:rPr>
               <w:t>username / email</w:t>
             </w:r>
@@ -5895,10 +5786,16 @@
             </w:tcMar>
           </w:tcPr>
           <w:p>
-            <w:r>
-              <w:rPr>
-                <w:sz w:val="20"/>
-                <w:szCs w:val="20"/>
+            <w:pPr>
+              <w:rPr>
+                <w:highlight w:val="yellow"/>
+              </w:rPr>
+            </w:pPr>
+            <w:r>
+              <w:rPr>
+                <w:sz w:val="20"/>
+                <w:szCs w:val="20"/>
+                <w:highlight w:val="yellow"/>
               </w:rPr>
               <w:t>Unique login identifiers</w:t>
             </w:r>
@@ -5924,11 +5821,17 @@
             </w:tcMar>
           </w:tcPr>
           <w:p>
+            <w:pPr>
+              <w:rPr>
+                <w:highlight w:val="yellow"/>
+              </w:rPr>
+            </w:pPr>
             <w:proofErr w:type="spellStart"/>
             <w:r>
               <w:rPr>
                 <w:sz w:val="20"/>
                 <w:szCs w:val="20"/>
+                <w:highlight w:val="yellow"/>
               </w:rPr>
               <w:t>password_hash</w:t>
             </w:r>
@@ -5953,11 +5856,17 @@
             </w:tcMar>
           </w:tcPr>
           <w:p>
+            <w:pPr>
+              <w:rPr>
+                <w:highlight w:val="yellow"/>
+              </w:rPr>
+            </w:pPr>
             <w:proofErr w:type="spellStart"/>
             <w:r>
               <w:rPr>
                 <w:sz w:val="20"/>
                 <w:szCs w:val="20"/>
+                <w:highlight w:val="yellow"/>
               </w:rPr>
               <w:t>BCrypt</w:t>
             </w:r>
@@ -5966,6 +5875,7 @@
               <w:rPr>
                 <w:sz w:val="20"/>
                 <w:szCs w:val="20"/>
+                <w:highlight w:val="yellow"/>
               </w:rPr>
               <w:t>-encoded password</w:t>
             </w:r>
@@ -5982,21 +5892,29 @@
               <w:bottom w:val="single" w:sz="1" w:space="0" w:color="CCCCCC"/>
               <w:right w:val="single" w:sz="1" w:space="0" w:color="CCCCCC"/>
             </w:tcBorders>
-            <w:shd w:val="clear" w:color="auto" w:fill="FFFFFF"/>
-            <w:tcMar>
-              <w:top w:w="80" w:type="dxa"/>
-              <w:left w:w="150" w:type="dxa"/>
-              <w:bottom w:w="80" w:type="dxa"/>
-              <w:right w:w="150" w:type="dxa"/>
-            </w:tcMar>
-          </w:tcPr>
-          <w:p>
-            <w:r>
-              <w:rPr>
-                <w:sz w:val="20"/>
-                <w:szCs w:val="20"/>
-              </w:rPr>
-              <w:t>role</w:t>
+            <w:shd w:val="clear" w:color="auto" w:fill="F0F4FA"/>
+            <w:tcMar>
+              <w:top w:w="80" w:type="dxa"/>
+              <w:left w:w="150" w:type="dxa"/>
+              <w:bottom w:w="80" w:type="dxa"/>
+              <w:right w:w="150" w:type="dxa"/>
+            </w:tcMar>
+          </w:tcPr>
+          <w:p>
+            <w:pPr>
+              <w:rPr>
+                <w:sz w:val="20"/>
+                <w:szCs w:val="20"/>
+                <w:highlight w:val="yellow"/>
+              </w:rPr>
+            </w:pPr>
+            <w:r>
+              <w:rPr>
+                <w:sz w:val="20"/>
+                <w:szCs w:val="20"/>
+                <w:highlight w:val="yellow"/>
+              </w:rPr>
+              <w:t>department</w:t>
             </w:r>
           </w:p>
         </w:tc>
@@ -6009,21 +5927,205 @@
               <w:bottom w:val="single" w:sz="1" w:space="0" w:color="CCCCCC"/>
               <w:right w:val="single" w:sz="1" w:space="0" w:color="CCCCCC"/>
             </w:tcBorders>
-            <w:shd w:val="clear" w:color="auto" w:fill="FFFFFF"/>
-            <w:tcMar>
-              <w:top w:w="80" w:type="dxa"/>
-              <w:left w:w="150" w:type="dxa"/>
-              <w:bottom w:w="80" w:type="dxa"/>
-              <w:right w:w="150" w:type="dxa"/>
-            </w:tcMar>
-          </w:tcPr>
-          <w:p>
-            <w:r>
-              <w:rPr>
-                <w:sz w:val="20"/>
-                <w:szCs w:val="20"/>
-              </w:rPr>
-              <w:t>SUPER_ADMIN or ADMIN.</w:t>
+            <w:shd w:val="clear" w:color="auto" w:fill="F0F4FA"/>
+            <w:tcMar>
+              <w:top w:w="80" w:type="dxa"/>
+              <w:left w:w="150" w:type="dxa"/>
+              <w:bottom w:w="80" w:type="dxa"/>
+              <w:right w:w="150" w:type="dxa"/>
+            </w:tcMar>
+          </w:tcPr>
+          <w:p>
+            <w:pPr>
+              <w:rPr>
+                <w:sz w:val="20"/>
+                <w:szCs w:val="20"/>
+                <w:highlight w:val="yellow"/>
+              </w:rPr>
+            </w:pPr>
+            <w:r>
+              <w:rPr>
+                <w:sz w:val="20"/>
+                <w:szCs w:val="20"/>
+                <w:highlight w:val="yellow"/>
+              </w:rPr>
+              <w:t xml:space="preserve">ENUM: </w:t>
+            </w:r>
+          </w:p>
+          <w:p>
+            <w:pPr>
+              <w:pStyle w:val="ListParagraph"/>
+              <w:numPr>
+                <w:ilvl w:val="0"/>
+                <w:numId w:val="3"/>
+              </w:numPr>
+              <w:rPr>
+                <w:sz w:val="20"/>
+                <w:szCs w:val="20"/>
+                <w:highlight w:val="yellow"/>
+              </w:rPr>
+            </w:pPr>
+            <w:r>
+              <w:rPr>
+                <w:sz w:val="20"/>
+                <w:szCs w:val="20"/>
+                <w:highlight w:val="yellow"/>
+              </w:rPr>
+              <w:t>Office Admin</w:t>
+            </w:r>
+          </w:p>
+          <w:p>
+            <w:pPr>
+              <w:pStyle w:val="ListParagraph"/>
+              <w:numPr>
+                <w:ilvl w:val="0"/>
+                <w:numId w:val="3"/>
+              </w:numPr>
+              <w:rPr>
+                <w:sz w:val="20"/>
+                <w:szCs w:val="20"/>
+                <w:highlight w:val="yellow"/>
+              </w:rPr>
+            </w:pPr>
+            <w:r>
+              <w:rPr>
+                <w:sz w:val="20"/>
+                <w:szCs w:val="20"/>
+                <w:highlight w:val="yellow"/>
+              </w:rPr>
+              <w:t xml:space="preserve">Tax &amp; Accounting Advisory </w:t>
+            </w:r>
+          </w:p>
+          <w:p>
+            <w:pPr>
+              <w:pStyle w:val="ListParagraph"/>
+              <w:numPr>
+                <w:ilvl w:val="0"/>
+                <w:numId w:val="3"/>
+              </w:numPr>
+              <w:rPr>
+                <w:sz w:val="20"/>
+                <w:szCs w:val="20"/>
+                <w:highlight w:val="yellow"/>
+              </w:rPr>
+            </w:pPr>
+            <w:r>
+              <w:rPr>
+                <w:sz w:val="20"/>
+                <w:szCs w:val="20"/>
+                <w:highlight w:val="yellow"/>
+              </w:rPr>
+              <w:t>Legal &amp; Corporate Advisory</w:t>
+            </w:r>
+          </w:p>
+          <w:p>
+            <w:pPr>
+              <w:pStyle w:val="ListParagraph"/>
+              <w:numPr>
+                <w:ilvl w:val="0"/>
+                <w:numId w:val="3"/>
+              </w:numPr>
+              <w:rPr>
+                <w:sz w:val="20"/>
+                <w:szCs w:val="20"/>
+                <w:highlight w:val="yellow"/>
+              </w:rPr>
+            </w:pPr>
+            <w:r>
+              <w:rPr>
+                <w:sz w:val="20"/>
+                <w:szCs w:val="20"/>
+                <w:highlight w:val="yellow"/>
+              </w:rPr>
+              <w:t>Audit &amp; Assurance</w:t>
+            </w:r>
+          </w:p>
+          <w:p>
+            <w:pPr>
+              <w:pStyle w:val="ListParagraph"/>
+              <w:numPr>
+                <w:ilvl w:val="0"/>
+                <w:numId w:val="3"/>
+              </w:numPr>
+              <w:rPr>
+                <w:sz w:val="20"/>
+                <w:szCs w:val="20"/>
+                <w:highlight w:val="yellow"/>
+              </w:rPr>
+            </w:pPr>
+            <w:r>
+              <w:rPr>
+                <w:sz w:val="20"/>
+                <w:szCs w:val="20"/>
+                <w:highlight w:val="yellow"/>
+              </w:rPr>
+              <w:t>Practice Development &amp; Management</w:t>
+            </w:r>
+          </w:p>
+          <w:p>
+            <w:pPr>
+              <w:pStyle w:val="ListParagraph"/>
+              <w:numPr>
+                <w:ilvl w:val="0"/>
+                <w:numId w:val="3"/>
+              </w:numPr>
+              <w:rPr>
+                <w:sz w:val="20"/>
+                <w:szCs w:val="20"/>
+                <w:highlight w:val="yellow"/>
+              </w:rPr>
+            </w:pPr>
+            <w:r>
+              <w:rPr>
+                <w:sz w:val="20"/>
+                <w:szCs w:val="20"/>
+                <w:highlight w:val="yellow"/>
+              </w:rPr>
+              <w:t>Client &amp; Operation Management</w:t>
+            </w:r>
+          </w:p>
+          <w:p>
+            <w:pPr>
+              <w:pStyle w:val="ListParagraph"/>
+              <w:numPr>
+                <w:ilvl w:val="0"/>
+                <w:numId w:val="3"/>
+              </w:numPr>
+              <w:rPr>
+                <w:sz w:val="20"/>
+                <w:szCs w:val="20"/>
+                <w:highlight w:val="yellow"/>
+              </w:rPr>
+            </w:pPr>
+            <w:r>
+              <w:rPr>
+                <w:sz w:val="20"/>
+                <w:szCs w:val="20"/>
+                <w:highlight w:val="yellow"/>
+              </w:rPr>
+              <w:t>Finance &amp; Human Resource</w:t>
+            </w:r>
+          </w:p>
+          <w:p>
+            <w:pPr>
+              <w:pStyle w:val="ListParagraph"/>
+              <w:numPr>
+                <w:ilvl w:val="0"/>
+                <w:numId w:val="3"/>
+              </w:numPr>
+              <w:rPr>
+                <w:sz w:val="20"/>
+                <w:szCs w:val="20"/>
+                <w:highlight w:val="yellow"/>
+              </w:rPr>
+            </w:pPr>
+            <w:r>
+              <w:rPr>
+                <w:sz w:val="20"/>
+                <w:szCs w:val="20"/>
+                <w:highlight w:val="yellow"/>
+              </w:rPr>
+              <w:t>Technology Innovation and Development</w:t>
             </w:r>
           </w:p>
         </w:tc>
@@ -6038,24 +6140,28 @@
               <w:bottom w:val="single" w:sz="1" w:space="0" w:color="CCCCCC"/>
               <w:right w:val="single" w:sz="1" w:space="0" w:color="CCCCCC"/>
             </w:tcBorders>
-            <w:shd w:val="clear" w:color="auto" w:fill="F0F4FA"/>
-            <w:tcMar>
-              <w:top w:w="80" w:type="dxa"/>
-              <w:left w:w="150" w:type="dxa"/>
-              <w:bottom w:w="80" w:type="dxa"/>
-              <w:right w:w="150" w:type="dxa"/>
-            </w:tcMar>
-          </w:tcPr>
-          <w:p>
-            <w:proofErr w:type="spellStart"/>
-            <w:r>
-              <w:rPr>
-                <w:sz w:val="20"/>
-                <w:szCs w:val="20"/>
-              </w:rPr>
-              <w:t>created_at</w:t>
-            </w:r>
-            <w:proofErr w:type="spellEnd"/>
+            <w:shd w:val="clear" w:color="auto" w:fill="FFFFFF"/>
+            <w:tcMar>
+              <w:top w:w="80" w:type="dxa"/>
+              <w:left w:w="150" w:type="dxa"/>
+              <w:bottom w:w="80" w:type="dxa"/>
+              <w:right w:w="150" w:type="dxa"/>
+            </w:tcMar>
+          </w:tcPr>
+          <w:p>
+            <w:pPr>
+              <w:rPr>
+                <w:highlight w:val="yellow"/>
+              </w:rPr>
+            </w:pPr>
+            <w:r>
+              <w:rPr>
+                <w:sz w:val="20"/>
+                <w:szCs w:val="20"/>
+                <w:highlight w:val="yellow"/>
+              </w:rPr>
+              <w:t>role</w:t>
+            </w:r>
           </w:p>
         </w:tc>
         <w:tc>
@@ -6067,21 +6173,27 @@
               <w:bottom w:val="single" w:sz="1" w:space="0" w:color="CCCCCC"/>
               <w:right w:val="single" w:sz="1" w:space="0" w:color="CCCCCC"/>
             </w:tcBorders>
-            <w:shd w:val="clear" w:color="auto" w:fill="F0F4FA"/>
-            <w:tcMar>
-              <w:top w:w="80" w:type="dxa"/>
-              <w:left w:w="150" w:type="dxa"/>
-              <w:bottom w:w="80" w:type="dxa"/>
-              <w:right w:w="150" w:type="dxa"/>
-            </w:tcMar>
-          </w:tcPr>
-          <w:p>
-            <w:r>
-              <w:rPr>
-                <w:sz w:val="20"/>
-                <w:szCs w:val="20"/>
-              </w:rPr>
-              <w:t>Account creation timestamp</w:t>
+            <w:shd w:val="clear" w:color="auto" w:fill="FFFFFF"/>
+            <w:tcMar>
+              <w:top w:w="80" w:type="dxa"/>
+              <w:left w:w="150" w:type="dxa"/>
+              <w:bottom w:w="80" w:type="dxa"/>
+              <w:right w:w="150" w:type="dxa"/>
+            </w:tcMar>
+          </w:tcPr>
+          <w:p>
+            <w:pPr>
+              <w:rPr>
+                <w:highlight w:val="yellow"/>
+              </w:rPr>
+            </w:pPr>
+            <w:r>
+              <w:rPr>
+                <w:sz w:val="20"/>
+                <w:szCs w:val="20"/>
+                <w:highlight w:val="yellow"/>
+              </w:rPr>
+              <w:t>SUPER_ADMIN or ADMIN.</w:t>
             </w:r>
           </w:p>
         </w:tc>
@@ -6096,22 +6208,28 @@
               <w:bottom w:val="single" w:sz="1" w:space="0" w:color="CCCCCC"/>
               <w:right w:val="single" w:sz="1" w:space="0" w:color="CCCCCC"/>
             </w:tcBorders>
-            <w:shd w:val="clear" w:color="auto" w:fill="FFFFFF"/>
-            <w:tcMar>
-              <w:top w:w="80" w:type="dxa"/>
-              <w:left w:w="150" w:type="dxa"/>
-              <w:bottom w:w="80" w:type="dxa"/>
-              <w:right w:w="150" w:type="dxa"/>
-            </w:tcMar>
-          </w:tcPr>
-          <w:p>
+            <w:shd w:val="clear" w:color="auto" w:fill="F0F4FA"/>
+            <w:tcMar>
+              <w:top w:w="80" w:type="dxa"/>
+              <w:left w:w="150" w:type="dxa"/>
+              <w:bottom w:w="80" w:type="dxa"/>
+              <w:right w:w="150" w:type="dxa"/>
+            </w:tcMar>
+          </w:tcPr>
+          <w:p>
+            <w:pPr>
+              <w:rPr>
+                <w:highlight w:val="yellow"/>
+              </w:rPr>
+            </w:pPr>
             <w:proofErr w:type="spellStart"/>
             <w:r>
               <w:rPr>
                 <w:sz w:val="20"/>
                 <w:szCs w:val="20"/>
-              </w:rPr>
-              <w:t>is_active</w:t>
+                <w:highlight w:val="yellow"/>
+              </w:rPr>
+              <w:t>created_at</w:t>
             </w:r>
             <w:proofErr w:type="spellEnd"/>
           </w:p>
@@ -6125,21 +6243,27 @@
               <w:bottom w:val="single" w:sz="1" w:space="0" w:color="CCCCCC"/>
               <w:right w:val="single" w:sz="1" w:space="0" w:color="CCCCCC"/>
             </w:tcBorders>
-            <w:shd w:val="clear" w:color="auto" w:fill="FFFFFF"/>
-            <w:tcMar>
-              <w:top w:w="80" w:type="dxa"/>
-              <w:left w:w="150" w:type="dxa"/>
-              <w:bottom w:w="80" w:type="dxa"/>
-              <w:right w:w="150" w:type="dxa"/>
-            </w:tcMar>
-          </w:tcPr>
-          <w:p>
-            <w:r>
-              <w:rPr>
-                <w:sz w:val="20"/>
-                <w:szCs w:val="20"/>
-              </w:rPr>
-              <w:t>Soft-disable accounts without deletion</w:t>
+            <w:shd w:val="clear" w:color="auto" w:fill="F0F4FA"/>
+            <w:tcMar>
+              <w:top w:w="80" w:type="dxa"/>
+              <w:left w:w="150" w:type="dxa"/>
+              <w:bottom w:w="80" w:type="dxa"/>
+              <w:right w:w="150" w:type="dxa"/>
+            </w:tcMar>
+          </w:tcPr>
+          <w:p>
+            <w:pPr>
+              <w:rPr>
+                <w:highlight w:val="yellow"/>
+              </w:rPr>
+            </w:pPr>
+            <w:r>
+              <w:rPr>
+                <w:sz w:val="20"/>
+                <w:szCs w:val="20"/>
+                <w:highlight w:val="yellow"/>
+              </w:rPr>
+              <w:t>Account creation timestamp</w:t>
             </w:r>
           </w:p>
         </w:tc>
@@ -6163,11 +6287,87 @@
             </w:tcMar>
           </w:tcPr>
           <w:p>
+            <w:pPr>
+              <w:rPr>
+                <w:highlight w:val="yellow"/>
+              </w:rPr>
+            </w:pPr>
             <w:proofErr w:type="spellStart"/>
             <w:r>
               <w:rPr>
                 <w:sz w:val="20"/>
                 <w:szCs w:val="20"/>
+                <w:highlight w:val="yellow"/>
+              </w:rPr>
+              <w:t>is_active</w:t>
+            </w:r>
+            <w:proofErr w:type="spellEnd"/>
+          </w:p>
+        </w:tc>
+        <w:tc>
+          <w:tcPr>
+            <w:tcW w:w="6560" w:type="dxa"/>
+            <w:tcBorders>
+              <w:top w:val="single" w:sz="1" w:space="0" w:color="CCCCCC"/>
+              <w:left w:val="single" w:sz="1" w:space="0" w:color="CCCCCC"/>
+              <w:bottom w:val="single" w:sz="1" w:space="0" w:color="CCCCCC"/>
+              <w:right w:val="single" w:sz="1" w:space="0" w:color="CCCCCC"/>
+            </w:tcBorders>
+            <w:shd w:val="clear" w:color="auto" w:fill="FFFFFF"/>
+            <w:tcMar>
+              <w:top w:w="80" w:type="dxa"/>
+              <w:left w:w="150" w:type="dxa"/>
+              <w:bottom w:w="80" w:type="dxa"/>
+              <w:right w:w="150" w:type="dxa"/>
+            </w:tcMar>
+          </w:tcPr>
+          <w:p>
+            <w:pPr>
+              <w:rPr>
+                <w:highlight w:val="yellow"/>
+              </w:rPr>
+            </w:pPr>
+            <w:r>
+              <w:rPr>
+                <w:sz w:val="20"/>
+                <w:szCs w:val="20"/>
+                <w:highlight w:val="yellow"/>
+              </w:rPr>
+              <w:t>Soft-disable accounts without deletion</w:t>
+            </w:r>
+          </w:p>
+        </w:tc>
+      </w:tr>
+      <w:tr>
+        <w:tc>
+          <w:tcPr>
+            <w:tcW w:w="2800" w:type="dxa"/>
+            <w:tcBorders>
+              <w:top w:val="single" w:sz="1" w:space="0" w:color="CCCCCC"/>
+              <w:left w:val="single" w:sz="1" w:space="0" w:color="CCCCCC"/>
+              <w:bottom w:val="single" w:sz="1" w:space="0" w:color="CCCCCC"/>
+              <w:right w:val="single" w:sz="1" w:space="0" w:color="CCCCCC"/>
+            </w:tcBorders>
+            <w:shd w:val="clear" w:color="auto" w:fill="FFFFFF"/>
+            <w:tcMar>
+              <w:top w:w="80" w:type="dxa"/>
+              <w:left w:w="150" w:type="dxa"/>
+              <w:bottom w:w="80" w:type="dxa"/>
+              <w:right w:w="150" w:type="dxa"/>
+            </w:tcMar>
+          </w:tcPr>
+          <w:p>
+            <w:pPr>
+              <w:rPr>
+                <w:highlight w:val="yellow"/>
+              </w:rPr>
+            </w:pPr>
+            <w:proofErr w:type="spellStart"/>
+            <w:r>
+              <w:rPr>
+                <w:sz w:val="20"/>
+                <w:szCs w:val="20"/>
+                <w:highlight w:val="yellow"/>
               </w:rPr>
               <w:t>created_at</w:t>
             </w:r>
@@ -6176,6 +6376,7 @@
               <w:rPr>
                 <w:sz w:val="20"/>
                 <w:szCs w:val="20"/>
+                <w:highlight w:val="yellow"/>
               </w:rPr>
               <w:t xml:space="preserve"> / </w:t>
             </w:r>
@@ -6184,6 +6385,7 @@
               <w:rPr>
                 <w:sz w:val="20"/>
                 <w:szCs w:val="20"/>
+                <w:highlight w:val="yellow"/>
               </w:rPr>
               <w:t>updated_at</w:t>
             </w:r>
@@ -6208,10 +6410,16 @@
             </w:tcMar>
           </w:tcPr>
           <w:p>
-            <w:r>
-              <w:rPr>
-                <w:sz w:val="20"/>
-                <w:szCs w:val="20"/>
+            <w:pPr>
+              <w:rPr>
+                <w:highlight w:val="yellow"/>
+              </w:rPr>
+            </w:pPr>
+            <w:r>
+              <w:rPr>
+                <w:sz w:val="20"/>
+                <w:szCs w:val="20"/>
+                <w:highlight w:val="yellow"/>
               </w:rPr>
               <w:t>timestamps</w:t>
             </w:r>
@@ -6221,6 +6429,347 @@
     </w:tbl>
     <w:p>
       <w:pPr>
+        <w:pStyle w:val="Heading2"/>
+        <w:tabs>
+          <w:tab w:val="left" w:pos="2760"/>
+        </w:tabs>
+      </w:pPr>
+      <w:r>
+        <w:lastRenderedPageBreak/>
+        <w:t xml:space="preserve">Table: </w:t>
+      </w:r>
+      <w:proofErr w:type="spellStart"/>
+      <w:r>
+        <w:t>users</w:t>
+      </w:r>
+      <w:r>
+        <w:t>_permission</w:t>
+      </w:r>
+      <w:proofErr w:type="spellEnd"/>
+    </w:p>
+    <w:tbl>
+      <w:tblPr>
+        <w:tblW w:w="9360" w:type="dxa"/>
+        <w:tblBorders>
+          <w:top w:val="single" w:sz="4" w:space="0" w:color="auto"/>
+          <w:left w:val="single" w:sz="4" w:space="0" w:color="auto"/>
+          <w:bottom w:val="single" w:sz="4" w:space="0" w:color="auto"/>
+          <w:right w:val="single" w:sz="4" w:space="0" w:color="auto"/>
+          <w:insideH w:val="single" w:sz="4" w:space="0" w:color="auto"/>
+          <w:insideV w:val="single" w:sz="4" w:space="0" w:color="auto"/>
+        </w:tblBorders>
+        <w:tblCellMar>
+          <w:left w:w="10" w:type="dxa"/>
+          <w:right w:w="10" w:type="dxa"/>
+        </w:tblCellMar>
+        <w:tblLook w:val="0000" w:firstRow="0" w:lastRow="0" w:firstColumn="0" w:lastColumn="0" w:noHBand="0" w:noVBand="0"/>
+      </w:tblPr>
+      <w:tblGrid>
+        <w:gridCol w:w="2800"/>
+        <w:gridCol w:w="6560"/>
+      </w:tblGrid>
+      <w:tr>
+        <w:trPr>
+          <w:tblHeader/>
+        </w:trPr>
+        <w:tc>
+          <w:tcPr>
+            <w:tcW w:w="2800" w:type="dxa"/>
+            <w:tcBorders>
+              <w:top w:val="single" w:sz="1" w:space="0" w:color="2563EB"/>
+              <w:left w:val="single" w:sz="1" w:space="0" w:color="2563EB"/>
+              <w:bottom w:val="single" w:sz="1" w:space="0" w:color="2563EB"/>
+              <w:right w:val="single" w:sz="1" w:space="0" w:color="2563EB"/>
+            </w:tcBorders>
+            <w:shd w:val="clear" w:color="auto" w:fill="1E3A5F"/>
+            <w:tcMar>
+              <w:top w:w="100" w:type="dxa"/>
+              <w:left w:w="150" w:type="dxa"/>
+              <w:bottom w:w="100" w:type="dxa"/>
+              <w:right w:w="150" w:type="dxa"/>
+            </w:tcMar>
+          </w:tcPr>
+          <w:p>
+            <w:r>
+              <w:rPr>
+                <w:b/>
+                <w:bCs/>
+                <w:color w:val="FFFFFF"/>
+                <w:sz w:val="20"/>
+                <w:szCs w:val="20"/>
+              </w:rPr>
+              <w:t>Column</w:t>
+            </w:r>
+          </w:p>
+        </w:tc>
+        <w:tc>
+          <w:tcPr>
+            <w:tcW w:w="6560" w:type="dxa"/>
+            <w:tcBorders>
+              <w:top w:val="single" w:sz="1" w:space="0" w:color="2563EB"/>
+              <w:left w:val="single" w:sz="1" w:space="0" w:color="2563EB"/>
+              <w:bottom w:val="single" w:sz="1" w:space="0" w:color="2563EB"/>
+              <w:right w:val="single" w:sz="1" w:space="0" w:color="2563EB"/>
+            </w:tcBorders>
+            <w:shd w:val="clear" w:color="auto" w:fill="1E3A5F"/>
+            <w:tcMar>
+              <w:top w:w="100" w:type="dxa"/>
+              <w:left w:w="150" w:type="dxa"/>
+              <w:bottom w:w="100" w:type="dxa"/>
+              <w:right w:w="150" w:type="dxa"/>
+            </w:tcMar>
+          </w:tcPr>
+          <w:p>
+            <w:r>
+              <w:rPr>
+                <w:b/>
+                <w:bCs/>
+                <w:color w:val="FFFFFF"/>
+                <w:sz w:val="20"/>
+                <w:szCs w:val="20"/>
+              </w:rPr>
+              <w:t>Notes</w:t>
+            </w:r>
+          </w:p>
+        </w:tc>
+      </w:tr>
+      <w:tr>
+        <w:tc>
+          <w:tcPr>
+            <w:tcW w:w="2800" w:type="dxa"/>
+            <w:tcBorders>
+              <w:top w:val="single" w:sz="1" w:space="0" w:color="CCCCCC"/>
+              <w:left w:val="single" w:sz="1" w:space="0" w:color="CCCCCC"/>
+              <w:bottom w:val="single" w:sz="1" w:space="0" w:color="CCCCCC"/>
+              <w:right w:val="single" w:sz="1" w:space="0" w:color="CCCCCC"/>
+            </w:tcBorders>
+            <w:shd w:val="clear" w:color="auto" w:fill="F0F4FA"/>
+            <w:tcMar>
+              <w:top w:w="80" w:type="dxa"/>
+              <w:left w:w="150" w:type="dxa"/>
+              <w:bottom w:w="80" w:type="dxa"/>
+              <w:right w:w="150" w:type="dxa"/>
+            </w:tcMar>
+          </w:tcPr>
+          <w:p>
+            <w:pPr>
+              <w:rPr>
+                <w:highlight w:val="yellow"/>
+              </w:rPr>
+            </w:pPr>
+            <w:r>
+              <w:rPr>
+                <w:sz w:val="20"/>
+                <w:szCs w:val="20"/>
+                <w:highlight w:val="yellow"/>
+              </w:rPr>
+              <w:t>I</w:t>
+            </w:r>
+            <w:r>
+              <w:rPr>
+                <w:sz w:val="20"/>
+                <w:szCs w:val="20"/>
+                <w:highlight w:val="yellow"/>
+              </w:rPr>
+              <w:t>d</w:t>
+            </w:r>
+            <w:r>
+              <w:rPr>
+                <w:sz w:val="20"/>
+                <w:szCs w:val="20"/>
+                <w:highlight w:val="yellow"/>
+              </w:rPr>
+              <w:t xml:space="preserve">, </w:t>
+            </w:r>
+            <w:proofErr w:type="spellStart"/>
+            <w:r>
+              <w:rPr>
+                <w:sz w:val="20"/>
+                <w:szCs w:val="20"/>
+                <w:highlight w:val="yellow"/>
+              </w:rPr>
+              <w:t>user_id</w:t>
+            </w:r>
+            <w:proofErr w:type="spellEnd"/>
+          </w:p>
+        </w:tc>
+        <w:tc>
+          <w:tcPr>
+            <w:tcW w:w="6560" w:type="dxa"/>
+            <w:tcBorders>
+              <w:top w:val="single" w:sz="1" w:space="0" w:color="CCCCCC"/>
+              <w:left w:val="single" w:sz="1" w:space="0" w:color="CCCCCC"/>
+              <w:bottom w:val="single" w:sz="1" w:space="0" w:color="CCCCCC"/>
+              <w:right w:val="single" w:sz="1" w:space="0" w:color="CCCCCC"/>
+            </w:tcBorders>
+            <w:shd w:val="clear" w:color="auto" w:fill="F0F4FA"/>
+            <w:tcMar>
+              <w:top w:w="80" w:type="dxa"/>
+              <w:left w:w="150" w:type="dxa"/>
+              <w:bottom w:w="80" w:type="dxa"/>
+              <w:right w:w="150" w:type="dxa"/>
+            </w:tcMar>
+          </w:tcPr>
+          <w:p>
+            <w:pPr>
+              <w:rPr>
+                <w:highlight w:val="yellow"/>
+              </w:rPr>
+            </w:pPr>
+            <w:r>
+              <w:rPr>
+                <w:sz w:val="20"/>
+                <w:szCs w:val="20"/>
+                <w:highlight w:val="yellow"/>
+              </w:rPr>
+              <w:t>FK to assets</w:t>
+            </w:r>
+          </w:p>
+        </w:tc>
+      </w:tr>
+      <w:tr>
+        <w:tc>
+          <w:tcPr>
+            <w:tcW w:w="2800" w:type="dxa"/>
+            <w:tcBorders>
+              <w:top w:val="single" w:sz="1" w:space="0" w:color="CCCCCC"/>
+              <w:left w:val="single" w:sz="1" w:space="0" w:color="CCCCCC"/>
+              <w:bottom w:val="single" w:sz="1" w:space="0" w:color="CCCCCC"/>
+              <w:right w:val="single" w:sz="1" w:space="0" w:color="CCCCCC"/>
+            </w:tcBorders>
+            <w:shd w:val="clear" w:color="auto" w:fill="F0F4FA"/>
+            <w:tcMar>
+              <w:top w:w="80" w:type="dxa"/>
+              <w:left w:w="150" w:type="dxa"/>
+              <w:bottom w:w="80" w:type="dxa"/>
+              <w:right w:w="150" w:type="dxa"/>
+            </w:tcMar>
+          </w:tcPr>
+          <w:p>
+            <w:pPr>
+              <w:rPr>
+                <w:sz w:val="20"/>
+                <w:szCs w:val="20"/>
+                <w:highlight w:val="yellow"/>
+              </w:rPr>
+            </w:pPr>
+            <w:r>
+              <w:rPr>
+                <w:sz w:val="20"/>
+                <w:szCs w:val="20"/>
+                <w:highlight w:val="yellow"/>
+              </w:rPr>
+              <w:t>module</w:t>
+            </w:r>
+          </w:p>
+        </w:tc>
+        <w:tc>
+          <w:tcPr>
+            <w:tcW w:w="6560" w:type="dxa"/>
+            <w:tcBorders>
+              <w:top w:val="single" w:sz="1" w:space="0" w:color="CCCCCC"/>
+              <w:left w:val="single" w:sz="1" w:space="0" w:color="CCCCCC"/>
+              <w:bottom w:val="single" w:sz="1" w:space="0" w:color="CCCCCC"/>
+              <w:right w:val="single" w:sz="1" w:space="0" w:color="CCCCCC"/>
+            </w:tcBorders>
+            <w:shd w:val="clear" w:color="auto" w:fill="F0F4FA"/>
+            <w:tcMar>
+              <w:top w:w="80" w:type="dxa"/>
+              <w:left w:w="150" w:type="dxa"/>
+              <w:bottom w:w="80" w:type="dxa"/>
+              <w:right w:w="150" w:type="dxa"/>
+            </w:tcMar>
+          </w:tcPr>
+          <w:p>
+            <w:pPr>
+              <w:rPr>
+                <w:sz w:val="20"/>
+                <w:szCs w:val="20"/>
+                <w:highlight w:val="yellow"/>
+              </w:rPr>
+            </w:pPr>
+            <w:r>
+              <w:rPr>
+                <w:sz w:val="20"/>
+                <w:szCs w:val="20"/>
+                <w:highlight w:val="yellow"/>
+              </w:rPr>
+              <w:t xml:space="preserve">ENUM </w:t>
+            </w:r>
+          </w:p>
+        </w:tc>
+      </w:tr>
+      <w:tr>
+        <w:tc>
+          <w:tcPr>
+            <w:tcW w:w="2800" w:type="dxa"/>
+            <w:tcBorders>
+              <w:top w:val="single" w:sz="1" w:space="0" w:color="CCCCCC"/>
+              <w:left w:val="single" w:sz="1" w:space="0" w:color="CCCCCC"/>
+              <w:bottom w:val="single" w:sz="1" w:space="0" w:color="CCCCCC"/>
+              <w:right w:val="single" w:sz="1" w:space="0" w:color="CCCCCC"/>
+            </w:tcBorders>
+            <w:shd w:val="clear" w:color="auto" w:fill="FFFFFF"/>
+            <w:tcMar>
+              <w:top w:w="80" w:type="dxa"/>
+              <w:left w:w="150" w:type="dxa"/>
+              <w:bottom w:w="80" w:type="dxa"/>
+              <w:right w:w="150" w:type="dxa"/>
+            </w:tcMar>
+          </w:tcPr>
+          <w:p>
+            <w:pPr>
+              <w:rPr>
+                <w:highlight w:val="yellow"/>
+              </w:rPr>
+            </w:pPr>
+            <w:r>
+              <w:rPr>
+                <w:sz w:val="20"/>
+                <w:szCs w:val="20"/>
+                <w:highlight w:val="yellow"/>
+              </w:rPr>
+              <w:t>permission</w:t>
+            </w:r>
+          </w:p>
+        </w:tc>
+        <w:tc>
+          <w:tcPr>
+            <w:tcW w:w="6560" w:type="dxa"/>
+            <w:tcBorders>
+              <w:top w:val="single" w:sz="1" w:space="0" w:color="CCCCCC"/>
+              <w:left w:val="single" w:sz="1" w:space="0" w:color="CCCCCC"/>
+              <w:bottom w:val="single" w:sz="1" w:space="0" w:color="CCCCCC"/>
+              <w:right w:val="single" w:sz="1" w:space="0" w:color="CCCCCC"/>
+            </w:tcBorders>
+            <w:shd w:val="clear" w:color="auto" w:fill="FFFFFF"/>
+            <w:tcMar>
+              <w:top w:w="80" w:type="dxa"/>
+              <w:left w:w="150" w:type="dxa"/>
+              <w:bottom w:w="80" w:type="dxa"/>
+              <w:right w:w="150" w:type="dxa"/>
+            </w:tcMar>
+          </w:tcPr>
+          <w:p>
+            <w:pPr>
+              <w:rPr>
+                <w:highlight w:val="yellow"/>
+              </w:rPr>
+            </w:pPr>
+            <w:r>
+              <w:rPr>
+                <w:sz w:val="20"/>
+                <w:szCs w:val="20"/>
+                <w:highlight w:val="yellow"/>
+              </w:rPr>
+              <w:t>ENUM</w:t>
+            </w:r>
+          </w:p>
+        </w:tc>
+      </w:tr>
+    </w:tbl>
+    <w:p>
+      <w:pPr>
         <w:spacing w:before="60" w:after="60"/>
       </w:pPr>
     </w:p>
@@ -6237,7 +6786,6 @@
         <w:pStyle w:val="Heading2"/>
       </w:pPr>
       <w:r>
-        <w:lastRenderedPageBreak/>
         <w:t>Authentication APIs</w:t>
       </w:r>
     </w:p>
@@ -6249,16 +6797,28 @@
           <w:numId w:val="2"/>
         </w:numPr>
         <w:spacing w:before="40" w:after="40"/>
-      </w:pPr>
-      <w:r>
+        <w:rPr>
+          <w:highlight w:val="yellow"/>
+        </w:rPr>
+      </w:pPr>
+      <w:r>
+        <w:rPr>
+          <w:highlight w:val="yellow"/>
+        </w:rPr>
         <w:t>POST /</w:t>
       </w:r>
       <w:proofErr w:type="spellStart"/>
       <w:r>
+        <w:rPr>
+          <w:highlight w:val="yellow"/>
+        </w:rPr>
         <w:t>api</w:t>
       </w:r>
       <w:proofErr w:type="spellEnd"/>
       <w:r>
+        <w:rPr>
+          <w:highlight w:val="yellow"/>
+        </w:rPr>
         <w:t>/auth/login — public, returns JWT</w:t>
       </w:r>
     </w:p>
@@ -6272,7 +6832,13 @@
         <w:spacing w:before="40" w:after="40"/>
       </w:pPr>
       <w:r>
-        <w:t>POST /</w:t>
+        <w:t>P</w:t>
+      </w:r>
+      <w:r>
+        <w:t>OST</w:t>
+      </w:r>
+      <w:r>
+        <w:t xml:space="preserve"> /</w:t>
       </w:r>
       <w:proofErr w:type="spellStart"/>
       <w:r>
@@ -6280,10 +6846,13 @@
       </w:r>
       <w:proofErr w:type="spellEnd"/>
       <w:r>
-        <w:t xml:space="preserve">/auth/logout — invalidate </w:t>
-      </w:r>
-      <w:r>
-        <w:t>token.</w:t>
+        <w:t>/auth/forgot</w:t>
+      </w:r>
+      <w:r>
+        <w:t>-</w:t>
+      </w:r>
+      <w:r>
+        <w:t xml:space="preserve">password </w:t>
       </w:r>
     </w:p>
     <w:p>
@@ -6294,23 +6863,53 @@
           <w:numId w:val="2"/>
         </w:numPr>
         <w:spacing w:before="40" w:after="40"/>
-      </w:pPr>
-      <w:r>
-        <w:t>POST /</w:t>
+        <w:rPr>
+          <w:highlight w:val="yellow"/>
+        </w:rPr>
+      </w:pPr>
+      <w:r>
+        <w:rPr>
+          <w:highlight w:val="yellow"/>
+        </w:rPr>
+        <w:t>PUT</w:t>
+      </w:r>
+      <w:r>
+        <w:rPr>
+          <w:highlight w:val="yellow"/>
+        </w:rPr>
+        <w:t xml:space="preserve"> /</w:t>
       </w:r>
       <w:proofErr w:type="spellStart"/>
       <w:r>
+        <w:rPr>
+          <w:highlight w:val="yellow"/>
+        </w:rPr>
         <w:t>api</w:t>
       </w:r>
       <w:proofErr w:type="spellEnd"/>
       <w:r>
-        <w:t>/auth/refresh</w:t>
-      </w:r>
-      <w:r>
+        <w:rPr>
+          <w:highlight w:val="yellow"/>
+        </w:rPr>
+        <w:t>/auth/</w:t>
+      </w:r>
+      <w:r>
+        <w:rPr>
+          <w:highlight w:val="yellow"/>
+        </w:rPr>
+        <w:t>change</w:t>
+      </w:r>
+      <w:r>
+        <w:rPr>
+          <w:highlight w:val="yellow"/>
+        </w:rPr>
         <w:t>-</w:t>
       </w:r>
       <w:r>
-        <w:t>token</w:t>
+        <w:rPr>
+          <w:highlight w:val="yellow"/>
+        </w:rPr>
+        <w:t>password (AUTH)</w:t>
       </w:r>
     </w:p>
     <w:p>
@@ -6321,29 +6920,41 @@
           <w:numId w:val="2"/>
         </w:numPr>
         <w:spacing w:before="40" w:after="40"/>
-      </w:pPr>
-      <w:r>
-        <w:t>P</w:t>
-      </w:r>
-      <w:r>
-        <w:t>OST</w:t>
-      </w:r>
-      <w:r>
-        <w:t xml:space="preserve"> /</w:t>
+        <w:rPr>
+          <w:highlight w:val="yellow"/>
+        </w:rPr>
+      </w:pPr>
+      <w:r>
+        <w:rPr>
+          <w:highlight w:val="yellow"/>
+        </w:rPr>
+        <w:t>PUT /</w:t>
       </w:r>
       <w:proofErr w:type="spellStart"/>
       <w:r>
+        <w:rPr>
+          <w:highlight w:val="yellow"/>
+        </w:rPr>
         <w:t>api</w:t>
       </w:r>
       <w:proofErr w:type="spellEnd"/>
       <w:r>
-        <w:t>/auth/forgot</w:t>
-      </w:r>
-      <w:r>
+        <w:rPr>
+          <w:highlight w:val="yellow"/>
+        </w:rPr>
+        <w:t>/auth/update</w:t>
+      </w:r>
+      <w:r>
+        <w:rPr>
+          <w:highlight w:val="yellow"/>
+        </w:rPr>
         <w:t>-</w:t>
       </w:r>
       <w:r>
-        <w:t xml:space="preserve">password </w:t>
+        <w:rPr>
+          <w:highlight w:val="yellow"/>
+        </w:rPr>
+        <w:t>profile (AUTH)</w:t>
       </w:r>
     </w:p>
     <w:p>
@@ -6354,29 +6965,49 @@
           <w:numId w:val="2"/>
         </w:numPr>
         <w:spacing w:before="40" w:after="40"/>
-      </w:pPr>
-      <w:r>
-        <w:t>PUT</w:t>
-      </w:r>
-      <w:r>
-        <w:t xml:space="preserve"> /</w:t>
+        <w:rPr>
+          <w:highlight w:val="yellow"/>
+        </w:rPr>
+      </w:pPr>
+      <w:r>
+        <w:rPr>
+          <w:highlight w:val="yellow"/>
+        </w:rPr>
+        <w:t>GET /</w:t>
       </w:r>
       <w:proofErr w:type="spellStart"/>
       <w:r>
+        <w:rPr>
+          <w:highlight w:val="yellow"/>
+        </w:rPr>
         <w:t>api</w:t>
       </w:r>
       <w:proofErr w:type="spellEnd"/>
       <w:r>
-        <w:t>/auth/</w:t>
-      </w:r>
-      <w:r>
-        <w:t>change</w:t>
-      </w:r>
-      <w:r>
-        <w:t>-</w:t>
-      </w:r>
-      <w:r>
-        <w:t>password (AUTH)</w:t>
+        <w:rPr>
+          <w:highlight w:val="yellow"/>
+        </w:rPr>
+        <w:t>/auth/view</w:t>
+      </w:r>
+      <w:r>
+        <w:rPr>
+          <w:highlight w:val="yellow"/>
+        </w:rPr>
+        <w:t>-profile (</w:t>
+      </w:r>
+      <w:r>
+        <w:rPr>
+          <w:highlight w:val="yellow"/>
+        </w:rPr>
+        <w:t>AUTH)</w:t>
+      </w:r>
+    </w:p>
+    <w:p>
+      <w:pPr>
+        <w:pStyle w:val="Heading2"/>
+      </w:pPr>
+      <w:r>
+        <w:t>Asset APIs</w:t>
       </w:r>
     </w:p>
     <w:p>
@@ -6387,23 +7018,41 @@
           <w:numId w:val="2"/>
         </w:numPr>
         <w:spacing w:before="40" w:after="40"/>
-      </w:pPr>
-      <w:r>
-        <w:t>PUT /</w:t>
+        <w:rPr>
+          <w:highlight w:val="yellow"/>
+        </w:rPr>
+      </w:pPr>
+      <w:r>
+        <w:rPr>
+          <w:highlight w:val="yellow"/>
+        </w:rPr>
+        <w:t>POST /</w:t>
       </w:r>
       <w:proofErr w:type="spellStart"/>
       <w:r>
+        <w:rPr>
+          <w:highlight w:val="yellow"/>
+        </w:rPr>
         <w:t>api</w:t>
       </w:r>
       <w:proofErr w:type="spellEnd"/>
       <w:r>
-        <w:t>/auth/update</w:t>
-      </w:r>
-      <w:r>
-        <w:t>-</w:t>
-      </w:r>
-      <w:r>
-        <w:t>profile (AUTH)</w:t>
+        <w:rPr>
+          <w:highlight w:val="yellow"/>
+        </w:rPr>
+        <w:t>/</w:t>
+      </w:r>
+      <w:r>
+        <w:rPr>
+          <w:highlight w:val="yellow"/>
+        </w:rPr>
+        <w:t>assets (</w:t>
+      </w:r>
+      <w:r>
+        <w:rPr>
+          <w:highlight w:val="yellow"/>
+        </w:rPr>
+        <w:t>AUTH)</w:t>
       </w:r>
     </w:p>
     <w:p>
@@ -6414,31 +7063,29 @@
           <w:numId w:val="2"/>
         </w:numPr>
         <w:spacing w:before="40" w:after="40"/>
-      </w:pPr>
-      <w:r>
+        <w:rPr>
+          <w:highlight w:val="yellow"/>
+        </w:rPr>
+      </w:pPr>
+      <w:r>
+        <w:rPr>
+          <w:highlight w:val="yellow"/>
+        </w:rPr>
         <w:t>GET /</w:t>
       </w:r>
       <w:proofErr w:type="spellStart"/>
       <w:r>
+        <w:rPr>
+          <w:highlight w:val="yellow"/>
+        </w:rPr>
         <w:t>api</w:t>
       </w:r>
       <w:proofErr w:type="spellEnd"/>
       <w:r>
-        <w:t>/auth/view</w:t>
-      </w:r>
-      <w:r>
-        <w:t>-profile (</w:t>
-      </w:r>
-      <w:r>
-        <w:t>AUTH)</w:t>
-      </w:r>
-    </w:p>
-    <w:p>
-      <w:pPr>
-        <w:pStyle w:val="Heading2"/>
-      </w:pPr>
-      <w:r>
-        <w:t>Asset APIs</w:t>
+        <w:rPr>
+          <w:highlight w:val="yellow"/>
+        </w:rPr>
+        <w:t>/assets (AUTH)</w:t>
       </w:r>
     </w:p>
     <w:p>
@@ -6449,12 +7096,15 @@
           <w:numId w:val="2"/>
         </w:numPr>
         <w:spacing w:before="40" w:after="40"/>
-      </w:pPr>
-      <w:r>
-        <w:rPr>
-          <w:highlight w:val="yellow"/>
-        </w:rPr>
-        <w:t>POST /</w:t>
+        <w:rPr>
+          <w:highlight w:val="yellow"/>
+        </w:rPr>
+      </w:pPr>
+      <w:r>
+        <w:rPr>
+          <w:highlight w:val="yellow"/>
+        </w:rPr>
+        <w:t>GET /</w:t>
       </w:r>
       <w:proofErr w:type="spellStart"/>
       <w:r>
@@ -6468,10 +7118,7 @@
         <w:rPr>
           <w:highlight w:val="yellow"/>
         </w:rPr>
-        <w:t>/assets — create</w:t>
-      </w:r>
-      <w:r>
-        <w:t xml:space="preserve"> (AUTH)</w:t>
+        <w:t>/assets/{id} (AUTH)</w:t>
       </w:r>
     </w:p>
     <w:p>
@@ -6482,12 +7129,21 @@
           <w:numId w:val="2"/>
         </w:numPr>
         <w:spacing w:before="40" w:after="40"/>
-      </w:pPr>
-      <w:r>
-        <w:rPr>
-          <w:highlight w:val="yellow"/>
-        </w:rPr>
-        <w:t>GET /</w:t>
+        <w:rPr>
+          <w:highlight w:val="yellow"/>
+        </w:rPr>
+      </w:pPr>
+      <w:r>
+        <w:rPr>
+          <w:highlight w:val="yellow"/>
+        </w:rPr>
+        <w:t>PATCH</w:t>
+      </w:r>
+      <w:r>
+        <w:rPr>
+          <w:highlight w:val="yellow"/>
+        </w:rPr>
+        <w:t xml:space="preserve"> /</w:t>
       </w:r>
       <w:proofErr w:type="spellStart"/>
       <w:r>
@@ -6501,10 +7157,7 @@
         <w:rPr>
           <w:highlight w:val="yellow"/>
         </w:rPr>
-        <w:t>/assets — list all</w:t>
-      </w:r>
-      <w:r>
-        <w:t xml:space="preserve"> (AUTH)</w:t>
+        <w:t>/assets/{id} (AUTH)</w:t>
       </w:r>
     </w:p>
     <w:p>
@@ -6515,12 +7168,21 @@
           <w:numId w:val="2"/>
         </w:numPr>
         <w:spacing w:before="40" w:after="40"/>
-      </w:pPr>
-      <w:r>
-        <w:rPr>
-          <w:highlight w:val="yellow"/>
-        </w:rPr>
-        <w:t>GET /</w:t>
+        <w:rPr>
+          <w:highlight w:val="yellow"/>
+        </w:rPr>
+      </w:pPr>
+      <w:r>
+        <w:rPr>
+          <w:highlight w:val="yellow"/>
+        </w:rPr>
+        <w:t>DELETE</w:t>
+      </w:r>
+      <w:r>
+        <w:rPr>
+          <w:highlight w:val="yellow"/>
+        </w:rPr>
+        <w:t xml:space="preserve"> /</w:t>
       </w:r>
       <w:proofErr w:type="spellStart"/>
       <w:r>
@@ -6534,10 +7196,27 @@
         <w:rPr>
           <w:highlight w:val="yellow"/>
         </w:rPr>
-        <w:t>/assets/{id} — view detail</w:t>
-      </w:r>
-      <w:r>
+        <w:t>/assets/</w:t>
+      </w:r>
+      <w:r>
+        <w:rPr>
+          <w:highlight w:val="yellow"/>
+        </w:rPr>
+        <w:t>{id}</w:t>
+      </w:r>
+      <w:r>
+        <w:rPr>
+          <w:highlight w:val="yellow"/>
+        </w:rPr>
         <w:t xml:space="preserve"> (AUTH)</w:t>
+      </w:r>
+    </w:p>
+    <w:p>
+      <w:pPr>
+        <w:pStyle w:val="Heading2"/>
+      </w:pPr>
+      <w:r>
+        <w:t>Assignment APIs</w:t>
       </w:r>
     </w:p>
     <w:p>
@@ -6548,12 +7227,15 @@
           <w:numId w:val="2"/>
         </w:numPr>
         <w:spacing w:before="40" w:after="40"/>
-      </w:pPr>
-      <w:r>
-        <w:rPr>
-          <w:highlight w:val="yellow"/>
-        </w:rPr>
-        <w:t>PUT /</w:t>
+        <w:rPr>
+          <w:highlight w:val="yellow"/>
+        </w:rPr>
+      </w:pPr>
+      <w:r>
+        <w:rPr>
+          <w:highlight w:val="yellow"/>
+        </w:rPr>
+        <w:t>POST /</w:t>
       </w:r>
       <w:proofErr w:type="spellStart"/>
       <w:r>
@@ -6567,10 +7249,19 @@
         <w:rPr>
           <w:highlight w:val="yellow"/>
         </w:rPr>
-        <w:t>/assets/{id} — update</w:t>
-      </w:r>
-      <w:r>
-        <w:t xml:space="preserve"> (AUTH)</w:t>
+        <w:t>/</w:t>
+      </w:r>
+      <w:r>
+        <w:rPr>
+          <w:highlight w:val="yellow"/>
+        </w:rPr>
+        <w:t>assets/{id}/</w:t>
+      </w:r>
+      <w:r>
+        <w:rPr>
+          <w:highlight w:val="yellow"/>
+        </w:rPr>
+        <w:t>assignments (AUTH)</w:t>
       </w:r>
     </w:p>
     <w:p>
@@ -6581,18 +7272,15 @@
           <w:numId w:val="2"/>
         </w:numPr>
         <w:spacing w:before="40" w:after="40"/>
-      </w:pPr>
-      <w:r>
-        <w:rPr>
-          <w:highlight w:val="yellow"/>
-        </w:rPr>
-        <w:t>DELETE</w:t>
-      </w:r>
-      <w:r>
-        <w:rPr>
-          <w:highlight w:val="yellow"/>
-        </w:rPr>
-        <w:t xml:space="preserve"> /</w:t>
+        <w:rPr>
+          <w:highlight w:val="yellow"/>
+        </w:rPr>
+      </w:pPr>
+      <w:r>
+        <w:rPr>
+          <w:highlight w:val="yellow"/>
+        </w:rPr>
+        <w:t>POST /</w:t>
       </w:r>
       <w:proofErr w:type="spellStart"/>
       <w:r>
@@ -6606,30 +7294,19 @@
         <w:rPr>
           <w:highlight w:val="yellow"/>
         </w:rPr>
-        <w:t>/assets/</w:t>
-      </w:r>
-      <w:r>
-        <w:rPr>
-          <w:highlight w:val="yellow"/>
-        </w:rPr>
-        <w:t>{id}</w:t>
-      </w:r>
-      <w:r>
-        <w:rPr>
-          <w:highlight w:val="yellow"/>
-        </w:rPr>
-        <w:t xml:space="preserve"> — search and filter</w:t>
-      </w:r>
-      <w:r>
-        <w:t xml:space="preserve"> (AUTH)</w:t>
-      </w:r>
-    </w:p>
-    <w:p>
-      <w:pPr>
-        <w:pStyle w:val="Heading2"/>
-      </w:pPr>
-      <w:r>
-        <w:t>Assignment APIs</w:t>
+        <w:t xml:space="preserve">/assignments/{id}/return </w:t>
+      </w:r>
+      <w:r>
+        <w:rPr>
+          <w:highlight w:val="yellow"/>
+        </w:rPr>
+        <w:t>(</w:t>
+      </w:r>
+      <w:r>
+        <w:rPr>
+          <w:highlight w:val="yellow"/>
+        </w:rPr>
+        <w:t>AUTH)</w:t>
       </w:r>
     </w:p>
     <w:p>
@@ -6640,12 +7317,15 @@
           <w:numId w:val="2"/>
         </w:numPr>
         <w:spacing w:before="40" w:after="40"/>
-      </w:pPr>
-      <w:r>
-        <w:rPr>
-          <w:highlight w:val="yellow"/>
-        </w:rPr>
-        <w:t>POST /</w:t>
+        <w:rPr>
+          <w:highlight w:val="yellow"/>
+        </w:rPr>
+      </w:pPr>
+      <w:r>
+        <w:rPr>
+          <w:highlight w:val="yellow"/>
+        </w:rPr>
+        <w:t>GET /</w:t>
       </w:r>
       <w:proofErr w:type="spellStart"/>
       <w:r>
@@ -6659,22 +7339,7 @@
         <w:rPr>
           <w:highlight w:val="yellow"/>
         </w:rPr>
-        <w:t>/</w:t>
-      </w:r>
-      <w:r>
-        <w:rPr>
-          <w:highlight w:val="yellow"/>
-        </w:rPr>
-        <w:t>assets/{id}/</w:t>
-      </w:r>
-      <w:r>
-        <w:rPr>
-          <w:highlight w:val="yellow"/>
-        </w:rPr>
-        <w:t>assignments — assign asset</w:t>
-      </w:r>
-      <w:r>
-        <w:t xml:space="preserve"> (AUTH)</w:t>
+        <w:t>/assets/{id}/assignments (AUTH)</w:t>
       </w:r>
     </w:p>
     <w:p>
@@ -6685,12 +7350,21 @@
           <w:numId w:val="2"/>
         </w:numPr>
         <w:spacing w:before="40" w:after="40"/>
-      </w:pPr>
-      <w:r>
-        <w:rPr>
-          <w:highlight w:val="yellow"/>
-        </w:rPr>
-        <w:t>POST /</w:t>
+        <w:rPr>
+          <w:highlight w:val="yellow"/>
+        </w:rPr>
+      </w:pPr>
+      <w:r>
+        <w:rPr>
+          <w:highlight w:val="yellow"/>
+        </w:rPr>
+        <w:t>PUT</w:t>
+      </w:r>
+      <w:r>
+        <w:rPr>
+          <w:highlight w:val="yellow"/>
+        </w:rPr>
+        <w:t xml:space="preserve"> /</w:t>
       </w:r>
       <w:proofErr w:type="spellStart"/>
       <w:r>
@@ -6704,19 +7378,13 @@
         <w:rPr>
           <w:highlight w:val="yellow"/>
         </w:rPr>
-        <w:t xml:space="preserve">/assignments/{id}/return — return asset </w:t>
-      </w:r>
-      <w:r>
-        <w:rPr>
-          <w:highlight w:val="yellow"/>
-        </w:rPr>
-        <w:t>change the statue</w:t>
-      </w:r>
-      <w:r>
-        <w:t xml:space="preserve"> (</w:t>
-      </w:r>
-      <w:r>
-        <w:t>AUTH)</w:t>
+        <w:t xml:space="preserve">/assignment/{id} </w:t>
+      </w:r>
+      <w:r>
+        <w:rPr>
+          <w:highlight w:val="yellow"/>
+        </w:rPr>
+        <w:t>(AUTH)</w:t>
       </w:r>
     </w:p>
     <w:p>
@@ -6727,12 +7395,15 @@
           <w:numId w:val="2"/>
         </w:numPr>
         <w:spacing w:before="40" w:after="40"/>
-      </w:pPr>
-      <w:r>
-        <w:rPr>
-          <w:highlight w:val="yellow"/>
-        </w:rPr>
-        <w:t>GET /</w:t>
+        <w:rPr>
+          <w:highlight w:val="yellow"/>
+        </w:rPr>
+      </w:pPr>
+      <w:r>
+        <w:rPr>
+          <w:highlight w:val="yellow"/>
+        </w:rPr>
+        <w:t>DELETE /</w:t>
       </w:r>
       <w:proofErr w:type="spellStart"/>
       <w:r>
@@ -6746,10 +7417,15 @@
         <w:rPr>
           <w:highlight w:val="yellow"/>
         </w:rPr>
-        <w:t>/assets/{id}/assignments — view history</w:t>
-      </w:r>
-      <w:r>
-        <w:t xml:space="preserve"> (AUTH)</w:t>
+        <w:t>/assignment/{id} (AUTH)</w:t>
+      </w:r>
+    </w:p>
+    <w:p>
+      <w:pPr>
+        <w:pStyle w:val="Heading2"/>
+      </w:pPr>
+      <w:r>
+        <w:t>Procurement APIs</w:t>
       </w:r>
     </w:p>
     <w:p>
@@ -6760,18 +7436,15 @@
           <w:numId w:val="2"/>
         </w:numPr>
         <w:spacing w:before="40" w:after="40"/>
-      </w:pPr>
-      <w:r>
-        <w:rPr>
-          <w:highlight w:val="yellow"/>
-        </w:rPr>
-        <w:t>PUT</w:t>
-      </w:r>
-      <w:r>
-        <w:rPr>
-          <w:highlight w:val="yellow"/>
-        </w:rPr>
-        <w:t xml:space="preserve"> /</w:t>
+        <w:rPr>
+          <w:highlight w:val="yellow"/>
+        </w:rPr>
+      </w:pPr>
+      <w:r>
+        <w:rPr>
+          <w:highlight w:val="yellow"/>
+        </w:rPr>
+        <w:t>POST /</w:t>
       </w:r>
       <w:proofErr w:type="spellStart"/>
       <w:r>
@@ -6785,10 +7458,7 @@
         <w:rPr>
           <w:highlight w:val="yellow"/>
         </w:rPr>
-        <w:t>/assignment/{id} — update the assignments</w:t>
-      </w:r>
-      <w:r>
-        <w:t xml:space="preserve"> (AUTH)</w:t>
+        <w:t>/assets/{id}/procurement (AUTH)</w:t>
       </w:r>
     </w:p>
     <w:p>
@@ -6799,12 +7469,39 @@
           <w:numId w:val="2"/>
         </w:numPr>
         <w:spacing w:before="40" w:after="40"/>
-      </w:pPr>
-      <w:r>
-        <w:rPr>
-          <w:highlight w:val="yellow"/>
-        </w:rPr>
-        <w:t>DELETE /</w:t>
+        <w:rPr>
+          <w:highlight w:val="yellow"/>
+        </w:rPr>
+      </w:pPr>
+      <w:r>
+        <w:rPr>
+          <w:highlight w:val="yellow"/>
+        </w:rPr>
+        <w:t>P</w:t>
+      </w:r>
+      <w:r>
+        <w:rPr>
+          <w:highlight w:val="yellow"/>
+        </w:rPr>
+        <w:t>A</w:t>
+      </w:r>
+      <w:r>
+        <w:rPr>
+          <w:highlight w:val="yellow"/>
+        </w:rPr>
+        <w:t>T</w:t>
+      </w:r>
+      <w:r>
+        <w:rPr>
+          <w:highlight w:val="yellow"/>
+        </w:rPr>
+        <w:t>CH</w:t>
+      </w:r>
+      <w:r>
+        <w:rPr>
+          <w:highlight w:val="yellow"/>
+        </w:rPr>
+        <w:t xml:space="preserve"> /</w:t>
       </w:r>
       <w:proofErr w:type="spellStart"/>
       <w:r>
@@ -6818,18 +7515,7 @@
         <w:rPr>
           <w:highlight w:val="yellow"/>
         </w:rPr>
-        <w:t>/assignment/{id} – delete the assignments</w:t>
-      </w:r>
-      <w:r>
-        <w:t xml:space="preserve"> (AUTH)</w:t>
-      </w:r>
-    </w:p>
-    <w:p>
-      <w:pPr>
-        <w:pStyle w:val="Heading2"/>
-      </w:pPr>
-      <w:r>
-        <w:t>Procurement APIs</w:t>
+        <w:t>/assets/{id}/procurement (AUTH)</w:t>
       </w:r>
     </w:p>
     <w:p>
@@ -6840,12 +7526,15 @@
           <w:numId w:val="2"/>
         </w:numPr>
         <w:spacing w:before="40" w:after="40"/>
-      </w:pPr>
-      <w:r>
-        <w:rPr>
-          <w:highlight w:val="yellow"/>
-        </w:rPr>
-        <w:t>POST /</w:t>
+        <w:rPr>
+          <w:highlight w:val="yellow"/>
+        </w:rPr>
+      </w:pPr>
+      <w:r>
+        <w:rPr>
+          <w:highlight w:val="yellow"/>
+        </w:rPr>
+        <w:t>GET /</w:t>
       </w:r>
       <w:proofErr w:type="spellStart"/>
       <w:r>
@@ -6859,10 +7548,7 @@
         <w:rPr>
           <w:highlight w:val="yellow"/>
         </w:rPr>
-        <w:t>/assets/{id}/procurement — create (</w:t>
-      </w:r>
-      <w:r>
-        <w:t>AUTH)</w:t>
+        <w:t>/assets/{id}/procurement (AUTH)</w:t>
       </w:r>
     </w:p>
     <w:p>
@@ -6873,36 +7559,15 @@
           <w:numId w:val="2"/>
         </w:numPr>
         <w:spacing w:before="40" w:after="40"/>
-      </w:pPr>
-      <w:r>
-        <w:rPr>
-          <w:highlight w:val="yellow"/>
-        </w:rPr>
-        <w:t>P</w:t>
-      </w:r>
-      <w:r>
-        <w:rPr>
-          <w:highlight w:val="yellow"/>
-        </w:rPr>
-        <w:t>A</w:t>
-      </w:r>
-      <w:r>
-        <w:rPr>
-          <w:highlight w:val="yellow"/>
-        </w:rPr>
-        <w:t>T</w:t>
-      </w:r>
-      <w:r>
-        <w:rPr>
-          <w:highlight w:val="yellow"/>
-        </w:rPr>
-        <w:t>CH</w:t>
-      </w:r>
-      <w:r>
-        <w:rPr>
-          <w:highlight w:val="yellow"/>
-        </w:rPr>
-        <w:t xml:space="preserve"> /</w:t>
+        <w:rPr>
+          <w:highlight w:val="yellow"/>
+        </w:rPr>
+      </w:pPr>
+      <w:r>
+        <w:rPr>
+          <w:highlight w:val="yellow"/>
+        </w:rPr>
+        <w:t>DELETE /</w:t>
       </w:r>
       <w:proofErr w:type="spellStart"/>
       <w:r>
@@ -6916,10 +7581,321 @@
         <w:rPr>
           <w:highlight w:val="yellow"/>
         </w:rPr>
-        <w:t>/assets/{id}/procurement — update (</w:t>
-      </w:r>
-      <w:r>
-        <w:t>AUTH)</w:t>
+        <w:t>/assets/</w:t>
+      </w:r>
+      <w:r>
+        <w:rPr>
+          <w:highlight w:val="yellow"/>
+        </w:rPr>
+        <w:t>{id}/</w:t>
+      </w:r>
+      <w:r>
+        <w:rPr>
+          <w:highlight w:val="yellow"/>
+        </w:rPr>
+        <w:t>procurement (AUTH)</w:t>
+      </w:r>
+    </w:p>
+    <w:p>
+      <w:pPr>
+        <w:pStyle w:val="Heading2"/>
+      </w:pPr>
+      <w:r>
+        <w:t>User Management API</w:t>
+      </w:r>
+    </w:p>
+    <w:p>
+      <w:pPr>
+        <w:pStyle w:val="ListParagraph"/>
+        <w:numPr>
+          <w:ilvl w:val="0"/>
+          <w:numId w:val="6"/>
+        </w:numPr>
+        <w:spacing w:before="40" w:after="40"/>
+        <w:rPr>
+          <w:b/>
+          <w:bCs/>
+          <w:highlight w:val="yellow"/>
+        </w:rPr>
+      </w:pPr>
+      <w:r>
+        <w:rPr>
+          <w:highlight w:val="yellow"/>
+        </w:rPr>
+        <w:t>GET /</w:t>
+      </w:r>
+      <w:proofErr w:type="spellStart"/>
+      <w:r>
+        <w:rPr>
+          <w:highlight w:val="yellow"/>
+        </w:rPr>
+        <w:t>api</w:t>
+      </w:r>
+      <w:proofErr w:type="spellEnd"/>
+      <w:r>
+        <w:rPr>
+          <w:highlight w:val="yellow"/>
+        </w:rPr>
+        <w:t>/users</w:t>
+      </w:r>
+      <w:r>
+        <w:rPr>
+          <w:highlight w:val="yellow"/>
+        </w:rPr>
+        <w:t xml:space="preserve"> (AUTH)</w:t>
+      </w:r>
+    </w:p>
+    <w:p>
+      <w:pPr>
+        <w:pStyle w:val="ListParagraph"/>
+        <w:numPr>
+          <w:ilvl w:val="0"/>
+          <w:numId w:val="6"/>
+        </w:numPr>
+        <w:spacing w:before="40" w:after="40"/>
+        <w:rPr>
+          <w:b/>
+          <w:bCs/>
+          <w:highlight w:val="yellow"/>
+        </w:rPr>
+      </w:pPr>
+      <w:r>
+        <w:rPr>
+          <w:highlight w:val="yellow"/>
+        </w:rPr>
+        <w:t>GET /</w:t>
+      </w:r>
+      <w:proofErr w:type="spellStart"/>
+      <w:r>
+        <w:rPr>
+          <w:highlight w:val="yellow"/>
+        </w:rPr>
+        <w:t>api</w:t>
+      </w:r>
+      <w:proofErr w:type="spellEnd"/>
+      <w:r>
+        <w:rPr>
+          <w:highlight w:val="yellow"/>
+        </w:rPr>
+        <w:t>/users/{id}</w:t>
+      </w:r>
+      <w:r>
+        <w:rPr>
+          <w:highlight w:val="yellow"/>
+        </w:rPr>
+        <w:t xml:space="preserve"> (AUTH)</w:t>
+      </w:r>
+    </w:p>
+    <w:p>
+      <w:pPr>
+        <w:pStyle w:val="ListParagraph"/>
+        <w:numPr>
+          <w:ilvl w:val="0"/>
+          <w:numId w:val="6"/>
+        </w:numPr>
+        <w:spacing w:before="40" w:after="40"/>
+        <w:rPr>
+          <w:b/>
+          <w:bCs/>
+          <w:highlight w:val="yellow"/>
+        </w:rPr>
+      </w:pPr>
+      <w:r>
+        <w:rPr>
+          <w:highlight w:val="yellow"/>
+        </w:rPr>
+        <w:t>POST /</w:t>
+      </w:r>
+      <w:proofErr w:type="spellStart"/>
+      <w:r>
+        <w:rPr>
+          <w:highlight w:val="yellow"/>
+        </w:rPr>
+        <w:t>api</w:t>
+      </w:r>
+      <w:proofErr w:type="spellEnd"/>
+      <w:r>
+        <w:rPr>
+          <w:highlight w:val="yellow"/>
+        </w:rPr>
+        <w:t>/</w:t>
+      </w:r>
+      <w:r>
+        <w:rPr>
+          <w:highlight w:val="yellow"/>
+        </w:rPr>
+        <w:t>users</w:t>
+      </w:r>
+      <w:r>
+        <w:rPr>
+          <w:highlight w:val="yellow"/>
+        </w:rPr>
+        <w:t xml:space="preserve"> (AUTH)</w:t>
+      </w:r>
+    </w:p>
+    <w:p>
+      <w:pPr>
+        <w:pStyle w:val="ListParagraph"/>
+        <w:numPr>
+          <w:ilvl w:val="0"/>
+          <w:numId w:val="6"/>
+        </w:numPr>
+        <w:spacing w:before="40" w:after="40"/>
+        <w:rPr>
+          <w:highlight w:val="yellow"/>
+        </w:rPr>
+      </w:pPr>
+      <w:r>
+        <w:rPr>
+          <w:highlight w:val="yellow"/>
+        </w:rPr>
+        <w:t>PATCH /</w:t>
+      </w:r>
+      <w:proofErr w:type="spellStart"/>
+      <w:r>
+        <w:rPr>
+          <w:highlight w:val="yellow"/>
+        </w:rPr>
+        <w:t>api</w:t>
+      </w:r>
+      <w:proofErr w:type="spellEnd"/>
+      <w:r>
+        <w:rPr>
+          <w:highlight w:val="yellow"/>
+        </w:rPr>
+        <w:t>/users/{id}permission (AUTH)</w:t>
+      </w:r>
+    </w:p>
+    <w:p>
+      <w:pPr>
+        <w:pStyle w:val="ListParagraph"/>
+        <w:numPr>
+          <w:ilvl w:val="0"/>
+          <w:numId w:val="6"/>
+        </w:numPr>
+        <w:spacing w:before="40" w:after="40"/>
+        <w:rPr>
+          <w:b/>
+          <w:bCs/>
+          <w:highlight w:val="yellow"/>
+        </w:rPr>
+      </w:pPr>
+      <w:r>
+        <w:rPr>
+          <w:highlight w:val="yellow"/>
+        </w:rPr>
+        <w:lastRenderedPageBreak/>
+        <w:t>PATCH /</w:t>
+      </w:r>
+      <w:proofErr w:type="spellStart"/>
+      <w:r>
+        <w:rPr>
+          <w:highlight w:val="yellow"/>
+        </w:rPr>
+        <w:t>api</w:t>
+      </w:r>
+      <w:proofErr w:type="spellEnd"/>
+      <w:r>
+        <w:rPr>
+          <w:highlight w:val="yellow"/>
+        </w:rPr>
+        <w:t>/users/{id}/role</w:t>
+      </w:r>
+      <w:r>
+        <w:rPr>
+          <w:highlight w:val="yellow"/>
+        </w:rPr>
+        <w:t xml:space="preserve"> (AUTH)</w:t>
+      </w:r>
+    </w:p>
+    <w:p>
+      <w:pPr>
+        <w:pStyle w:val="ListParagraph"/>
+        <w:numPr>
+          <w:ilvl w:val="0"/>
+          <w:numId w:val="6"/>
+        </w:numPr>
+        <w:spacing w:before="40" w:after="40"/>
+        <w:rPr>
+          <w:b/>
+          <w:bCs/>
+          <w:highlight w:val="yellow"/>
+        </w:rPr>
+      </w:pPr>
+      <w:r>
+        <w:rPr>
+          <w:highlight w:val="yellow"/>
+        </w:rPr>
+        <w:t>PATCH /</w:t>
+      </w:r>
+      <w:proofErr w:type="spellStart"/>
+      <w:r>
+        <w:rPr>
+          <w:highlight w:val="yellow"/>
+        </w:rPr>
+        <w:t>api</w:t>
+      </w:r>
+      <w:proofErr w:type="spellEnd"/>
+      <w:r>
+        <w:rPr>
+          <w:highlight w:val="yellow"/>
+        </w:rPr>
+        <w:t>/users/{id}/status</w:t>
+      </w:r>
+      <w:r>
+        <w:rPr>
+          <w:highlight w:val="yellow"/>
+        </w:rPr>
+        <w:t xml:space="preserve"> (AUTH)</w:t>
+      </w:r>
+    </w:p>
+    <w:p>
+      <w:pPr>
+        <w:pStyle w:val="ListParagraph"/>
+        <w:numPr>
+          <w:ilvl w:val="0"/>
+          <w:numId w:val="6"/>
+        </w:numPr>
+        <w:spacing w:before="40" w:after="40"/>
+        <w:rPr>
+          <w:b/>
+          <w:bCs/>
+          <w:highlight w:val="yellow"/>
+        </w:rPr>
+      </w:pPr>
+      <w:r>
+        <w:rPr>
+          <w:highlight w:val="yellow"/>
+        </w:rPr>
+        <w:t>DELETE /</w:t>
+      </w:r>
+      <w:proofErr w:type="spellStart"/>
+      <w:r>
+        <w:rPr>
+          <w:highlight w:val="yellow"/>
+        </w:rPr>
+        <w:t>api</w:t>
+      </w:r>
+      <w:proofErr w:type="spellEnd"/>
+      <w:r>
+        <w:rPr>
+          <w:highlight w:val="yellow"/>
+        </w:rPr>
+        <w:t>/users/{id}</w:t>
+      </w:r>
+      <w:r>
+        <w:rPr>
+          <w:highlight w:val="yellow"/>
+        </w:rPr>
+        <w:t xml:space="preserve"> (AUTH)</w:t>
+      </w:r>
+    </w:p>
+    <w:p>
+      <w:pPr>
+        <w:pStyle w:val="Heading2"/>
+      </w:pPr>
+      <w:r>
+        <w:t>Issue APIs</w:t>
       </w:r>
     </w:p>
     <w:p>
@@ -6930,12 +7906,15 @@
           <w:numId w:val="2"/>
         </w:numPr>
         <w:spacing w:before="40" w:after="40"/>
-      </w:pPr>
-      <w:r>
-        <w:rPr>
-          <w:highlight w:val="yellow"/>
-        </w:rPr>
-        <w:t>GET /</w:t>
+        <w:rPr>
+          <w:highlight w:val="yellow"/>
+        </w:rPr>
+      </w:pPr>
+      <w:r>
+        <w:rPr>
+          <w:highlight w:val="yellow"/>
+        </w:rPr>
+        <w:t>POST /</w:t>
       </w:r>
       <w:proofErr w:type="spellStart"/>
       <w:r>
@@ -6949,10 +7928,7 @@
         <w:rPr>
           <w:highlight w:val="yellow"/>
         </w:rPr>
-        <w:t>/assets/{id}/procurement — view</w:t>
-      </w:r>
-      <w:r>
-        <w:t xml:space="preserve"> (AUTH)</w:t>
+        <w:t>/assets/{id}/issues (AUTH)</w:t>
       </w:r>
     </w:p>
     <w:p>
@@ -6963,12 +7939,15 @@
           <w:numId w:val="2"/>
         </w:numPr>
         <w:spacing w:before="40" w:after="40"/>
-      </w:pPr>
-      <w:r>
-        <w:rPr>
-          <w:highlight w:val="yellow"/>
-        </w:rPr>
-        <w:t>DELETE /</w:t>
+        <w:rPr>
+          <w:highlight w:val="yellow"/>
+        </w:rPr>
+      </w:pPr>
+      <w:r>
+        <w:rPr>
+          <w:highlight w:val="yellow"/>
+        </w:rPr>
+        <w:t>PUT /</w:t>
       </w:r>
       <w:proofErr w:type="spellStart"/>
       <w:r>
@@ -6982,227 +7961,7 @@
         <w:rPr>
           <w:highlight w:val="yellow"/>
         </w:rPr>
-        <w:t>/assets/</w:t>
-      </w:r>
-      <w:r>
-        <w:rPr>
-          <w:highlight w:val="yellow"/>
-        </w:rPr>
-        <w:t>{id}/</w:t>
-      </w:r>
-      <w:r>
-        <w:rPr>
-          <w:highlight w:val="yellow"/>
-        </w:rPr>
-        <w:t>procurement— delete</w:t>
-      </w:r>
-      <w:r>
-        <w:t xml:space="preserve"> (AUTH)</w:t>
-      </w:r>
-    </w:p>
-    <w:p>
-      <w:pPr>
-        <w:pStyle w:val="Heading2"/>
-      </w:pPr>
-      <w:r>
-        <w:t>User Management API</w:t>
-      </w:r>
-    </w:p>
-    <w:p>
-      <w:pPr>
-        <w:pStyle w:val="ListParagraph"/>
-        <w:numPr>
-          <w:ilvl w:val="0"/>
-          <w:numId w:val="6"/>
-        </w:numPr>
-        <w:spacing w:before="40" w:after="40"/>
-        <w:rPr>
-          <w:b/>
-          <w:bCs/>
-        </w:rPr>
-      </w:pPr>
-      <w:r>
-        <w:t>GET /</w:t>
-      </w:r>
-      <w:proofErr w:type="spellStart"/>
-      <w:r>
-        <w:t>api</w:t>
-      </w:r>
-      <w:proofErr w:type="spellEnd"/>
-      <w:r>
-        <w:t>/users</w:t>
-      </w:r>
-      <w:r>
-        <w:t xml:space="preserve"> </w:t>
-      </w:r>
-      <w:r>
-        <w:t>(AUTH)</w:t>
-      </w:r>
-    </w:p>
-    <w:p>
-      <w:pPr>
-        <w:pStyle w:val="ListParagraph"/>
-        <w:numPr>
-          <w:ilvl w:val="0"/>
-          <w:numId w:val="6"/>
-        </w:numPr>
-        <w:spacing w:before="40" w:after="40"/>
-        <w:rPr>
-          <w:b/>
-          <w:bCs/>
-        </w:rPr>
-      </w:pPr>
-      <w:r>
-        <w:t>GET /</w:t>
-      </w:r>
-      <w:proofErr w:type="spellStart"/>
-      <w:r>
-        <w:t>api</w:t>
-      </w:r>
-      <w:proofErr w:type="spellEnd"/>
-      <w:r>
-        <w:t>/users/{id}</w:t>
-      </w:r>
-      <w:r>
-        <w:t xml:space="preserve"> </w:t>
-      </w:r>
-      <w:r>
-        <w:t>(AUTH)</w:t>
-      </w:r>
-    </w:p>
-    <w:p>
-      <w:pPr>
-        <w:pStyle w:val="ListParagraph"/>
-        <w:numPr>
-          <w:ilvl w:val="0"/>
-          <w:numId w:val="6"/>
-        </w:numPr>
-        <w:spacing w:before="40" w:after="40"/>
-        <w:rPr>
-          <w:b/>
-          <w:bCs/>
-        </w:rPr>
-      </w:pPr>
-      <w:r>
-        <w:t>POST /</w:t>
-      </w:r>
-      <w:proofErr w:type="spellStart"/>
-      <w:r>
-        <w:t>api</w:t>
-      </w:r>
-      <w:proofErr w:type="spellEnd"/>
-      <w:r>
-        <w:t>/auth/register</w:t>
-      </w:r>
-      <w:r>
-        <w:t xml:space="preserve"> </w:t>
-      </w:r>
-      <w:r>
-        <w:t>(AUTH)</w:t>
-      </w:r>
-    </w:p>
-    <w:p>
-      <w:pPr>
-        <w:pStyle w:val="ListParagraph"/>
-        <w:numPr>
-          <w:ilvl w:val="0"/>
-          <w:numId w:val="6"/>
-        </w:numPr>
-        <w:spacing w:before="40" w:after="40"/>
-        <w:rPr>
-          <w:b/>
-          <w:bCs/>
-        </w:rPr>
-      </w:pPr>
-      <w:r>
-        <w:t>PATCH /</w:t>
-      </w:r>
-      <w:proofErr w:type="spellStart"/>
-      <w:r>
-        <w:t>api</w:t>
-      </w:r>
-      <w:proofErr w:type="spellEnd"/>
-      <w:r>
-        <w:t>/users/{id}/role</w:t>
-      </w:r>
-      <w:r>
-        <w:t xml:space="preserve"> </w:t>
-      </w:r>
-      <w:r>
-        <w:t>(AUTH)</w:t>
-      </w:r>
-    </w:p>
-    <w:p>
-      <w:pPr>
-        <w:pStyle w:val="ListParagraph"/>
-        <w:numPr>
-          <w:ilvl w:val="0"/>
-          <w:numId w:val="6"/>
-        </w:numPr>
-        <w:spacing w:before="40" w:after="40"/>
-        <w:rPr>
-          <w:b/>
-          <w:bCs/>
-        </w:rPr>
-      </w:pPr>
-      <w:r>
-        <w:t>PATCH /</w:t>
-      </w:r>
-      <w:proofErr w:type="spellStart"/>
-      <w:r>
-        <w:t>api</w:t>
-      </w:r>
-      <w:proofErr w:type="spellEnd"/>
-      <w:r>
-        <w:t>/users/{id}/status</w:t>
-      </w:r>
-      <w:r>
-        <w:t xml:space="preserve"> </w:t>
-      </w:r>
-      <w:r>
-        <w:t>(AUTH)</w:t>
-      </w:r>
-    </w:p>
-    <w:p>
-      <w:pPr>
-        <w:pStyle w:val="ListParagraph"/>
-        <w:numPr>
-          <w:ilvl w:val="0"/>
-          <w:numId w:val="6"/>
-        </w:numPr>
-        <w:spacing w:before="40" w:after="40"/>
-        <w:rPr>
-          <w:b/>
-          <w:bCs/>
-        </w:rPr>
-      </w:pPr>
-      <w:r>
-        <w:t xml:space="preserve">DELETE </w:t>
-      </w:r>
-      <w:r>
-        <w:t>/</w:t>
-      </w:r>
-      <w:proofErr w:type="spellStart"/>
-      <w:r>
-        <w:t>api</w:t>
-      </w:r>
-      <w:proofErr w:type="spellEnd"/>
-      <w:r>
-        <w:t>/users/{id}</w:t>
-      </w:r>
-      <w:r>
-        <w:t xml:space="preserve"> </w:t>
-      </w:r>
-      <w:r>
-        <w:t>(AUTH)</w:t>
-      </w:r>
-    </w:p>
-    <w:p>
-      <w:pPr>
-        <w:pStyle w:val="Heading2"/>
-      </w:pPr>
-      <w:r>
-        <w:t>Issue APIs</w:t>
+        <w:t>/issues/{id} (AUTH)</w:t>
       </w:r>
     </w:p>
     <w:p>
@@ -7213,17 +7972,29 @@
           <w:numId w:val="2"/>
         </w:numPr>
         <w:spacing w:before="40" w:after="40"/>
-      </w:pPr>
-      <w:r>
-        <w:t>POST /</w:t>
+        <w:rPr>
+          <w:highlight w:val="yellow"/>
+        </w:rPr>
+      </w:pPr>
+      <w:r>
+        <w:rPr>
+          <w:highlight w:val="yellow"/>
+        </w:rPr>
+        <w:t>GET /</w:t>
       </w:r>
       <w:proofErr w:type="spellStart"/>
       <w:r>
+        <w:rPr>
+          <w:highlight w:val="yellow"/>
+        </w:rPr>
         <w:t>api</w:t>
       </w:r>
       <w:proofErr w:type="spellEnd"/>
       <w:r>
-        <w:t>/assets/{id}/issues — report issue (AUTH)</w:t>
+        <w:rPr>
+          <w:highlight w:val="yellow"/>
+        </w:rPr>
+        <w:t>/assets/{id}/issues (AUTH)</w:t>
       </w:r>
     </w:p>
     <w:p>
@@ -7234,59 +8005,29 @@
           <w:numId w:val="2"/>
         </w:numPr>
         <w:spacing w:before="40" w:after="40"/>
-      </w:pPr>
-      <w:r>
-        <w:t>PUT /</w:t>
+        <w:rPr>
+          <w:highlight w:val="yellow"/>
+        </w:rPr>
+      </w:pPr>
+      <w:r>
+        <w:rPr>
+          <w:highlight w:val="yellow"/>
+        </w:rPr>
+        <w:t>DELETE /</w:t>
       </w:r>
       <w:proofErr w:type="spellStart"/>
       <w:r>
+        <w:rPr>
+          <w:highlight w:val="yellow"/>
+        </w:rPr>
         <w:t>api</w:t>
       </w:r>
       <w:proofErr w:type="spellEnd"/>
       <w:r>
-        <w:t>/issues/{id} — update issue (AUTH)</w:t>
-      </w:r>
-    </w:p>
-    <w:p>
-      <w:pPr>
-        <w:pStyle w:val="ListParagraph"/>
-        <w:numPr>
-          <w:ilvl w:val="0"/>
-          <w:numId w:val="2"/>
-        </w:numPr>
-        <w:spacing w:before="40" w:after="40"/>
-      </w:pPr>
-      <w:r>
-        <w:t>GET /</w:t>
-      </w:r>
-      <w:proofErr w:type="spellStart"/>
-      <w:r>
-        <w:t>api</w:t>
-      </w:r>
-      <w:proofErr w:type="spellEnd"/>
-      <w:r>
-        <w:t>/assets/{id}/issues — view issues (AUTH)</w:t>
-      </w:r>
-    </w:p>
-    <w:p>
-      <w:pPr>
-        <w:pStyle w:val="ListParagraph"/>
-        <w:numPr>
-          <w:ilvl w:val="0"/>
-          <w:numId w:val="2"/>
-        </w:numPr>
-        <w:spacing w:before="40" w:after="40"/>
-      </w:pPr>
-      <w:r>
-        <w:t>DELETE /</w:t>
-      </w:r>
-      <w:proofErr w:type="spellStart"/>
-      <w:r>
-        <w:t>api</w:t>
-      </w:r>
-      <w:proofErr w:type="spellEnd"/>
-      <w:r>
-        <w:t>/issues/{id} – Deleted (AUTH)</w:t>
+        <w:rPr>
+          <w:highlight w:val="yellow"/>
+        </w:rPr>
+        <w:t>/issues/{id} (AUTH)</w:t>
       </w:r>
     </w:p>
     <w:p>
@@ -7294,7 +8035,6 @@
         <w:pStyle w:val="Heading2"/>
       </w:pPr>
       <w:r>
-        <w:lastRenderedPageBreak/>
         <w:t>Report APIs (Public)</w:t>
       </w:r>
     </w:p>
@@ -8056,6 +8796,7 @@
         <w:spacing w:before="40" w:after="40"/>
       </w:pPr>
       <w:r>
+        <w:lastRenderedPageBreak/>
         <w:t>Only AVAILABLE assets can be assigned.</w:t>
       </w:r>
     </w:p>
@@ -8150,7 +8891,6 @@
         <w:spacing w:before="40" w:after="40"/>
       </w:pPr>
       <w:r>
-        <w:lastRenderedPageBreak/>
         <w:t>Failed login attempts should return 401 Unauthorized — never expose user existence.</w:t>
       </w:r>
     </w:p>
@@ -8185,114 +8925,13 @@
         <w:pStyle w:val="Heading1"/>
       </w:pPr>
       <w:r>
-        <w:t>10. MVP Scope</w:t>
-      </w:r>
-    </w:p>
-    <w:p>
-      <w:pPr>
-        <w:spacing w:before="80" w:after="80"/>
-      </w:pPr>
-      <w:r>
-        <w:t>For version 1, focus on the smallest useful backend:</w:t>
-      </w:r>
-    </w:p>
-    <w:p>
-      <w:pPr>
-        <w:pStyle w:val="ListParagraph"/>
-        <w:numPr>
-          <w:ilvl w:val="0"/>
-          <w:numId w:val="2"/>
-        </w:numPr>
-        <w:spacing w:before="40" w:after="40"/>
-      </w:pPr>
-      <w:r>
-        <w:t>Asset CRUD</w:t>
-      </w:r>
-    </w:p>
-    <w:p>
-      <w:pPr>
-        <w:pStyle w:val="ListParagraph"/>
-        <w:numPr>
-          <w:ilvl w:val="0"/>
-          <w:numId w:val="2"/>
-        </w:numPr>
-        <w:spacing w:before="40" w:after="40"/>
-      </w:pPr>
-      <w:r>
-        <w:t>Asset assignment and return</w:t>
-      </w:r>
-    </w:p>
-    <w:p>
-      <w:pPr>
-        <w:pStyle w:val="ListParagraph"/>
-        <w:numPr>
-          <w:ilvl w:val="0"/>
-          <w:numId w:val="2"/>
-        </w:numPr>
-        <w:spacing w:before="40" w:after="40"/>
-      </w:pPr>
-      <w:r>
-        <w:t>Search and filter</w:t>
-      </w:r>
-    </w:p>
-    <w:p>
-      <w:pPr>
-        <w:pStyle w:val="ListParagraph"/>
-        <w:numPr>
-          <w:ilvl w:val="0"/>
-          <w:numId w:val="2"/>
-        </w:numPr>
-        <w:spacing w:before="40" w:after="40"/>
-      </w:pPr>
-      <w:r>
-        <w:t xml:space="preserve">Simple dashboard </w:t>
-      </w:r>
-    </w:p>
-    <w:p>
-      <w:pPr>
-        <w:pStyle w:val="ListParagraph"/>
-        <w:numPr>
-          <w:ilvl w:val="0"/>
-          <w:numId w:val="2"/>
-        </w:numPr>
-        <w:spacing w:before="40" w:after="40"/>
-      </w:pPr>
-      <w:r>
-        <w:t>Warranty reporting</w:t>
-      </w:r>
-    </w:p>
-    <w:p>
-      <w:pPr>
-        <w:pStyle w:val="ListParagraph"/>
-        <w:numPr>
-          <w:ilvl w:val="0"/>
-          <w:numId w:val="2"/>
-        </w:numPr>
-        <w:spacing w:before="40" w:after="40"/>
-      </w:pPr>
-      <w:r>
-        <w:t xml:space="preserve">Issue tracking </w:t>
-      </w:r>
-    </w:p>
-    <w:p>
-      <w:pPr>
-        <w:pStyle w:val="ListParagraph"/>
-        <w:numPr>
-          <w:ilvl w:val="0"/>
-          <w:numId w:val="2"/>
-        </w:numPr>
-        <w:spacing w:before="40" w:after="40"/>
-      </w:pPr>
-      <w:r>
-        <w:t xml:space="preserve">User Management </w:t>
-      </w:r>
-    </w:p>
-    <w:p>
-      <w:pPr>
-        <w:pStyle w:val="Heading1"/>
-      </w:pPr>
-      <w:r>
-        <w:t>11. Recommended Tools and Stack</w:t>
+        <w:t>1</w:t>
+      </w:r>
+      <w:r>
+        <w:t>0</w:t>
+      </w:r>
+      <w:r>
+        <w:t>. Recommended Tools and Stack</w:t>
       </w:r>
     </w:p>
     <w:tbl>
@@ -8792,7 +9431,6 @@
             </w:tcMar>
           </w:tcPr>
           <w:p>
-            <w:bookmarkStart w:id="0" w:name="_GoBack"/>
             <w:r>
               <w:rPr>
                 <w:sz w:val="20"/>
@@ -8800,7 +9438,6 @@
               </w:rPr>
               <w:t>Spring Security + JWT</w:t>
             </w:r>
-            <w:bookmarkEnd w:id="0"/>
           </w:p>
         </w:tc>
         <w:tc>
@@ -9093,29 +9730,11 @@
         <w:spacing w:before="80" w:after="80"/>
       </w:pPr>
       <w:r>
+        <w:t xml:space="preserve">Authentication is handled via JWT-based Spring Security, with role-based access control separating public read-only views (dashboard, asset status) from protected management </w:t>
+      </w:r>
+      <w:r>
         <w:lastRenderedPageBreak/>
-        <w:t>Authentication is handled via JWT-based Spring Security, with role-based access control separating public read-only views (dashboard, asset status) from protected management operations. The first release focuses on core asset lifecycle functions — asset registration, assignment, return, issue tracking, and reporting — while leaving room for future extensions as the process matures.</w:t>
-      </w:r>
-    </w:p>
-    <w:p>
-      <w:pPr>
-        <w:spacing w:before="60" w:after="60"/>
-      </w:pPr>
-    </w:p>
-    <w:p>
-      <w:pPr>
-        <w:pStyle w:val="Heading1"/>
-      </w:pPr>
-      <w:r>
-        <w:t>13. Final Recommendation</w:t>
-      </w:r>
-    </w:p>
-    <w:p>
-      <w:pPr>
-        <w:spacing w:before="80" w:after="80"/>
-      </w:pPr>
-      <w:r>
-        <w:t>Keep asset as the central entity, normalize assignment and procurement into separate tables, implement the MVP first, and keep the architecture simple. Add authentication from the start to enforce management security, but expose the dashboard and status checks publicly so stakeholders can check asset availability without login. This will give you a backend that is easy to understand now and easier to scale later.</w:t>
+        <w:t>operations. The first release focuses on core asset lifecycle functions — asset registration, assignment, return, issue tracking, and reporting — while leaving room for future extensions as the process matures.</w:t>
       </w:r>
     </w:p>
     <w:p>
@@ -10460,7 +11079,7 @@
     <w:lsdException w:name="Medium Shading 2 Accent 1" w:uiPriority="64"/>
     <w:lsdException w:name="Medium List 1 Accent 1" w:uiPriority="65"/>
     <w:lsdException w:name="Revision" w:semiHidden="1"/>
-    <w:lsdException w:name="List Paragraph" w:uiPriority="34" w:qFormat="1"/>
+    <w:lsdException w:name="List Paragraph" w:uiPriority="0" w:qFormat="1"/>
     <w:lsdException w:name="Quote" w:uiPriority="29" w:qFormat="1"/>
     <w:lsdException w:name="Intense Quote" w:uiPriority="30" w:qFormat="1"/>
     <w:lsdException w:name="Medium List 2 Accent 1" w:uiPriority="66"/>
@@ -10660,6 +11279,7 @@
   <w:style w:type="paragraph" w:default="1" w:styleId="Normal">
     <w:name w:val="Normal"/>
     <w:qFormat/>
+    <w:rsid w:val="0040502B"/>
   </w:style>
   <w:style w:type="paragraph" w:styleId="Heading1">
     <w:name w:val="heading 1"/>

</xml_diff>

<commit_message>
docs: update the new convention guide document
</commit_message>
<xml_diff>
--- a/document/TID_Asset_Management_Project_Perspective.docx
+++ b/document/TID_Asset_Management_Project_Perspective.docx
@@ -4035,8 +4035,6 @@
                 <w:szCs w:val="20"/>
               </w:rPr>
             </w:pPr>
-            <w:bookmarkStart w:id="0" w:name="_GoBack"/>
-            <w:bookmarkEnd w:id="0"/>
           </w:p>
         </w:tc>
       </w:tr>
@@ -6440,10 +6438,7 @@
       </w:r>
       <w:proofErr w:type="spellStart"/>
       <w:r>
-        <w:t>users</w:t>
-      </w:r>
-      <w:r>
-        <w:t>_permission</w:t>
+        <w:t>users_permission</w:t>
       </w:r>
       <w:proofErr w:type="spellEnd"/>
     </w:p>
@@ -6563,15 +6558,7 @@
                 <w:szCs w:val="20"/>
                 <w:highlight w:val="yellow"/>
               </w:rPr>
-              <w:t>I</w:t>
-            </w:r>
-            <w:r>
-              <w:rPr>
-                <w:sz w:val="20"/>
-                <w:szCs w:val="20"/>
-                <w:highlight w:val="yellow"/>
-              </w:rPr>
-              <w:t>d</w:t>
+              <w:t>Id</w:t>
             </w:r>
             <w:r>
               <w:rPr>
@@ -6763,6 +6750,333 @@
                 <w:highlight w:val="yellow"/>
               </w:rPr>
               <w:t>ENUM</w:t>
+            </w:r>
+          </w:p>
+        </w:tc>
+      </w:tr>
+    </w:tbl>
+    <w:p>
+      <w:pPr>
+        <w:pStyle w:val="Heading2"/>
+        <w:tabs>
+          <w:tab w:val="left" w:pos="2760"/>
+        </w:tabs>
+      </w:pPr>
+      <w:r>
+        <w:t xml:space="preserve">Table: </w:t>
+      </w:r>
+      <w:proofErr w:type="spellStart"/>
+      <w:r>
+        <w:t>password_reset_tokens</w:t>
+      </w:r>
+      <w:proofErr w:type="spellEnd"/>
+    </w:p>
+    <w:tbl>
+      <w:tblPr>
+        <w:tblW w:w="9360" w:type="dxa"/>
+        <w:tblBorders>
+          <w:top w:val="single" w:sz="4" w:space="0" w:color="auto"/>
+          <w:left w:val="single" w:sz="4" w:space="0" w:color="auto"/>
+          <w:bottom w:val="single" w:sz="4" w:space="0" w:color="auto"/>
+          <w:right w:val="single" w:sz="4" w:space="0" w:color="auto"/>
+          <w:insideH w:val="single" w:sz="4" w:space="0" w:color="auto"/>
+          <w:insideV w:val="single" w:sz="4" w:space="0" w:color="auto"/>
+        </w:tblBorders>
+        <w:tblCellMar>
+          <w:left w:w="10" w:type="dxa"/>
+          <w:right w:w="10" w:type="dxa"/>
+        </w:tblCellMar>
+        <w:tblLook w:val="0000" w:firstRow="0" w:lastRow="0" w:firstColumn="0" w:lastColumn="0" w:noHBand="0" w:noVBand="0"/>
+      </w:tblPr>
+      <w:tblGrid>
+        <w:gridCol w:w="2800"/>
+        <w:gridCol w:w="6560"/>
+      </w:tblGrid>
+      <w:tr>
+        <w:trPr>
+          <w:tblHeader/>
+        </w:trPr>
+        <w:tc>
+          <w:tcPr>
+            <w:tcW w:w="2800" w:type="dxa"/>
+            <w:tcBorders>
+              <w:top w:val="single" w:sz="1" w:space="0" w:color="2563EB"/>
+              <w:left w:val="single" w:sz="1" w:space="0" w:color="2563EB"/>
+              <w:bottom w:val="single" w:sz="1" w:space="0" w:color="2563EB"/>
+              <w:right w:val="single" w:sz="1" w:space="0" w:color="2563EB"/>
+            </w:tcBorders>
+            <w:shd w:val="clear" w:color="auto" w:fill="1E3A5F"/>
+            <w:tcMar>
+              <w:top w:w="100" w:type="dxa"/>
+              <w:left w:w="150" w:type="dxa"/>
+              <w:bottom w:w="100" w:type="dxa"/>
+              <w:right w:w="150" w:type="dxa"/>
+            </w:tcMar>
+          </w:tcPr>
+          <w:p>
+            <w:r>
+              <w:rPr>
+                <w:b/>
+                <w:bCs/>
+                <w:color w:val="FFFFFF"/>
+                <w:sz w:val="20"/>
+                <w:szCs w:val="20"/>
+              </w:rPr>
+              <w:t>Column</w:t>
+            </w:r>
+          </w:p>
+        </w:tc>
+        <w:tc>
+          <w:tcPr>
+            <w:tcW w:w="6560" w:type="dxa"/>
+            <w:tcBorders>
+              <w:top w:val="single" w:sz="1" w:space="0" w:color="2563EB"/>
+              <w:left w:val="single" w:sz="1" w:space="0" w:color="2563EB"/>
+              <w:bottom w:val="single" w:sz="1" w:space="0" w:color="2563EB"/>
+              <w:right w:val="single" w:sz="1" w:space="0" w:color="2563EB"/>
+            </w:tcBorders>
+            <w:shd w:val="clear" w:color="auto" w:fill="1E3A5F"/>
+            <w:tcMar>
+              <w:top w:w="100" w:type="dxa"/>
+              <w:left w:w="150" w:type="dxa"/>
+              <w:bottom w:w="100" w:type="dxa"/>
+              <w:right w:w="150" w:type="dxa"/>
+            </w:tcMar>
+          </w:tcPr>
+          <w:p>
+            <w:r>
+              <w:rPr>
+                <w:b/>
+                <w:bCs/>
+                <w:color w:val="FFFFFF"/>
+                <w:sz w:val="20"/>
+                <w:szCs w:val="20"/>
+              </w:rPr>
+              <w:t>Notes</w:t>
+            </w:r>
+          </w:p>
+        </w:tc>
+      </w:tr>
+      <w:tr>
+        <w:tc>
+          <w:tcPr>
+            <w:tcW w:w="2800" w:type="dxa"/>
+            <w:tcBorders>
+              <w:top w:val="single" w:sz="1" w:space="0" w:color="CCCCCC"/>
+              <w:left w:val="single" w:sz="1" w:space="0" w:color="CCCCCC"/>
+              <w:bottom w:val="single" w:sz="1" w:space="0" w:color="CCCCCC"/>
+              <w:right w:val="single" w:sz="1" w:space="0" w:color="CCCCCC"/>
+            </w:tcBorders>
+            <w:shd w:val="clear" w:color="auto" w:fill="F0F4FA"/>
+            <w:tcMar>
+              <w:top w:w="80" w:type="dxa"/>
+              <w:left w:w="150" w:type="dxa"/>
+              <w:bottom w:w="80" w:type="dxa"/>
+              <w:right w:w="150" w:type="dxa"/>
+            </w:tcMar>
+          </w:tcPr>
+          <w:p>
+            <w:pPr>
+              <w:rPr>
+                <w:highlight w:val="yellow"/>
+              </w:rPr>
+            </w:pPr>
+            <w:r>
+              <w:rPr>
+                <w:sz w:val="20"/>
+                <w:szCs w:val="20"/>
+                <w:highlight w:val="yellow"/>
+              </w:rPr>
+              <w:t>Id</w:t>
+            </w:r>
+            <w:r>
+              <w:rPr>
+                <w:sz w:val="20"/>
+                <w:szCs w:val="20"/>
+                <w:highlight w:val="yellow"/>
+              </w:rPr>
+              <w:t xml:space="preserve">, </w:t>
+            </w:r>
+            <w:proofErr w:type="spellStart"/>
+            <w:r>
+              <w:rPr>
+                <w:sz w:val="20"/>
+                <w:szCs w:val="20"/>
+                <w:highlight w:val="yellow"/>
+              </w:rPr>
+              <w:t>user_id</w:t>
+            </w:r>
+            <w:proofErr w:type="spellEnd"/>
+          </w:p>
+        </w:tc>
+        <w:tc>
+          <w:tcPr>
+            <w:tcW w:w="6560" w:type="dxa"/>
+            <w:tcBorders>
+              <w:top w:val="single" w:sz="1" w:space="0" w:color="CCCCCC"/>
+              <w:left w:val="single" w:sz="1" w:space="0" w:color="CCCCCC"/>
+              <w:bottom w:val="single" w:sz="1" w:space="0" w:color="CCCCCC"/>
+              <w:right w:val="single" w:sz="1" w:space="0" w:color="CCCCCC"/>
+            </w:tcBorders>
+            <w:shd w:val="clear" w:color="auto" w:fill="F0F4FA"/>
+            <w:tcMar>
+              <w:top w:w="80" w:type="dxa"/>
+              <w:left w:w="150" w:type="dxa"/>
+              <w:bottom w:w="80" w:type="dxa"/>
+              <w:right w:w="150" w:type="dxa"/>
+            </w:tcMar>
+          </w:tcPr>
+          <w:p>
+            <w:pPr>
+              <w:rPr>
+                <w:highlight w:val="yellow"/>
+              </w:rPr>
+            </w:pPr>
+            <w:r>
+              <w:rPr>
+                <w:sz w:val="20"/>
+                <w:szCs w:val="20"/>
+                <w:highlight w:val="yellow"/>
+              </w:rPr>
+              <w:t>FK to assets</w:t>
+            </w:r>
+          </w:p>
+        </w:tc>
+      </w:tr>
+      <w:tr>
+        <w:tc>
+          <w:tcPr>
+            <w:tcW w:w="2800" w:type="dxa"/>
+            <w:tcBorders>
+              <w:top w:val="single" w:sz="1" w:space="0" w:color="CCCCCC"/>
+              <w:left w:val="single" w:sz="1" w:space="0" w:color="CCCCCC"/>
+              <w:bottom w:val="single" w:sz="1" w:space="0" w:color="CCCCCC"/>
+              <w:right w:val="single" w:sz="1" w:space="0" w:color="CCCCCC"/>
+            </w:tcBorders>
+            <w:shd w:val="clear" w:color="auto" w:fill="F0F4FA"/>
+            <w:tcMar>
+              <w:top w:w="80" w:type="dxa"/>
+              <w:left w:w="150" w:type="dxa"/>
+              <w:bottom w:w="80" w:type="dxa"/>
+              <w:right w:w="150" w:type="dxa"/>
+            </w:tcMar>
+          </w:tcPr>
+          <w:p>
+            <w:pPr>
+              <w:rPr>
+                <w:sz w:val="20"/>
+                <w:szCs w:val="20"/>
+                <w:highlight w:val="yellow"/>
+              </w:rPr>
+            </w:pPr>
+            <w:r>
+              <w:rPr>
+                <w:sz w:val="20"/>
+                <w:szCs w:val="20"/>
+                <w:highlight w:val="yellow"/>
+              </w:rPr>
+              <w:t>token</w:t>
+            </w:r>
+          </w:p>
+        </w:tc>
+        <w:tc>
+          <w:tcPr>
+            <w:tcW w:w="6560" w:type="dxa"/>
+            <w:tcBorders>
+              <w:top w:val="single" w:sz="1" w:space="0" w:color="CCCCCC"/>
+              <w:left w:val="single" w:sz="1" w:space="0" w:color="CCCCCC"/>
+              <w:bottom w:val="single" w:sz="1" w:space="0" w:color="CCCCCC"/>
+              <w:right w:val="single" w:sz="1" w:space="0" w:color="CCCCCC"/>
+            </w:tcBorders>
+            <w:shd w:val="clear" w:color="auto" w:fill="F0F4FA"/>
+            <w:tcMar>
+              <w:top w:w="80" w:type="dxa"/>
+              <w:left w:w="150" w:type="dxa"/>
+              <w:bottom w:w="80" w:type="dxa"/>
+              <w:right w:w="150" w:type="dxa"/>
+            </w:tcMar>
+          </w:tcPr>
+          <w:p>
+            <w:pPr>
+              <w:rPr>
+                <w:sz w:val="20"/>
+                <w:szCs w:val="20"/>
+                <w:highlight w:val="yellow"/>
+              </w:rPr>
+            </w:pPr>
+            <w:r>
+              <w:rPr>
+                <w:sz w:val="20"/>
+                <w:szCs w:val="20"/>
+                <w:highlight w:val="yellow"/>
+              </w:rPr>
+              <w:t>token</w:t>
+            </w:r>
+          </w:p>
+        </w:tc>
+      </w:tr>
+      <w:tr>
+        <w:tc>
+          <w:tcPr>
+            <w:tcW w:w="2800" w:type="dxa"/>
+            <w:tcBorders>
+              <w:top w:val="single" w:sz="1" w:space="0" w:color="CCCCCC"/>
+              <w:left w:val="single" w:sz="1" w:space="0" w:color="CCCCCC"/>
+              <w:bottom w:val="single" w:sz="1" w:space="0" w:color="CCCCCC"/>
+              <w:right w:val="single" w:sz="1" w:space="0" w:color="CCCCCC"/>
+            </w:tcBorders>
+            <w:shd w:val="clear" w:color="auto" w:fill="FFFFFF"/>
+            <w:tcMar>
+              <w:top w:w="80" w:type="dxa"/>
+              <w:left w:w="150" w:type="dxa"/>
+              <w:bottom w:w="80" w:type="dxa"/>
+              <w:right w:w="150" w:type="dxa"/>
+            </w:tcMar>
+          </w:tcPr>
+          <w:p>
+            <w:pPr>
+              <w:rPr>
+                <w:highlight w:val="yellow"/>
+              </w:rPr>
+            </w:pPr>
+            <w:proofErr w:type="spellStart"/>
+            <w:r>
+              <w:rPr>
+                <w:highlight w:val="yellow"/>
+              </w:rPr>
+              <w:t>expiry_date</w:t>
+            </w:r>
+            <w:proofErr w:type="spellEnd"/>
+          </w:p>
+        </w:tc>
+        <w:tc>
+          <w:tcPr>
+            <w:tcW w:w="6560" w:type="dxa"/>
+            <w:tcBorders>
+              <w:top w:val="single" w:sz="1" w:space="0" w:color="CCCCCC"/>
+              <w:left w:val="single" w:sz="1" w:space="0" w:color="CCCCCC"/>
+              <w:bottom w:val="single" w:sz="1" w:space="0" w:color="CCCCCC"/>
+              <w:right w:val="single" w:sz="1" w:space="0" w:color="CCCCCC"/>
+            </w:tcBorders>
+            <w:shd w:val="clear" w:color="auto" w:fill="FFFFFF"/>
+            <w:tcMar>
+              <w:top w:w="80" w:type="dxa"/>
+              <w:left w:w="150" w:type="dxa"/>
+              <w:bottom w:w="80" w:type="dxa"/>
+              <w:right w:w="150" w:type="dxa"/>
+            </w:tcMar>
+          </w:tcPr>
+          <w:p>
+            <w:pPr>
+              <w:rPr>
+                <w:highlight w:val="yellow"/>
+              </w:rPr>
+            </w:pPr>
+            <w:r>
+              <w:rPr>
+                <w:highlight w:val="yellow"/>
+              </w:rPr>
+              <w:t>Expiry date</w:t>
             </w:r>
           </w:p>
         </w:tc>
@@ -7534,6 +7848,7 @@
         <w:rPr>
           <w:highlight w:val="yellow"/>
         </w:rPr>
+        <w:lastRenderedPageBreak/>
         <w:t>GET /</w:t>
       </w:r>
       <w:proofErr w:type="spellStart"/>
@@ -7784,7 +8099,6 @@
         <w:rPr>
           <w:highlight w:val="yellow"/>
         </w:rPr>
-        <w:lastRenderedPageBreak/>
         <w:t>PATCH /</w:t>
       </w:r>
       <w:proofErr w:type="spellStart"/>
@@ -8148,7 +8462,12 @@
         <w:t xml:space="preserve">earch/device-detail </w:t>
       </w:r>
       <w:r>
-        <w:t>— issue overview (PUBLIC)</w:t>
+        <w:t xml:space="preserve">— </w:t>
+      </w:r>
+      <w:bookmarkStart w:id="0" w:name="_GoBack"/>
+      <w:bookmarkEnd w:id="0"/>
+      <w:r>
+        <w:t>issue overview (PUBLIC)</w:t>
       </w:r>
     </w:p>
     <w:p>
@@ -8673,6 +8992,7 @@
         <w:pStyle w:val="Heading2"/>
       </w:pPr>
       <w:r>
+        <w:lastRenderedPageBreak/>
         <w:t>Asset Rules</w:t>
       </w:r>
     </w:p>
@@ -8796,7 +9116,6 @@
         <w:spacing w:before="40" w:after="40"/>
       </w:pPr>
       <w:r>
-        <w:lastRenderedPageBreak/>
         <w:t>Only AVAILABLE assets can be assigned.</w:t>
       </w:r>
     </w:p>
@@ -9709,6 +10028,7 @@
         <w:pStyle w:val="Heading1"/>
       </w:pPr>
       <w:r>
+        <w:lastRenderedPageBreak/>
         <w:t>12. Project Perspective Statement</w:t>
       </w:r>
     </w:p>
@@ -9730,11 +10050,7 @@
         <w:spacing w:before="80" w:after="80"/>
       </w:pPr>
       <w:r>
-        <w:t xml:space="preserve">Authentication is handled via JWT-based Spring Security, with role-based access control separating public read-only views (dashboard, asset status) from protected management </w:t>
-      </w:r>
-      <w:r>
-        <w:lastRenderedPageBreak/>
-        <w:t>operations. The first release focuses on core asset lifecycle functions — asset registration, assignment, return, issue tracking, and reporting — while leaving room for future extensions as the process matures.</w:t>
+        <w:t>Authentication is handled via JWT-based Spring Security, with role-based access control separating public read-only views (dashboard, asset status) from protected management operations. The first release focuses on core asset lifecycle functions — asset registration, assignment, return, issue tracking, and reporting — while leaving room for future extensions as the process matures.</w:t>
       </w:r>
     </w:p>
     <w:p>

</xml_diff>